<commit_message>
Update itinerary item description
</commit_message>
<xml_diff>
--- a/downloads/itinerary-en.docx
+++ b/downloads/itinerary-en.docx
@@ -51,7 +51,7 @@
           <w:sz w:val="24"/>
           <w:szCs w:val="24"/>
         </w:rPr>
-        <w:t xml:space="preserve">Fixed total 9177 CNY / $1355.43</w:t>
+        <w:t xml:space="preserve">Fixed total 9186 CNY / $1356.76</w:t>
       </w:r>
     </w:p>
     <w:p>
@@ -1000,7 +1000,7 @@
           <w:sz w:val="20"/>
           <w:szCs w:val="20"/>
         </w:rPr>
-        <w:t xml:space="preserve">iPanda shuttle from IFS Square (IMAX Plaza). One-way fare per person: 10CNY/1.48USD, 40 min ride.</w:t>
+        <w:t xml:space="preserve">iPanda shuttle from IFS Square (IMAX Plaza), 40 min ride.</w:t>
       </w:r>
     </w:p>
     <w:p>
@@ -1044,6 +1044,23 @@
           <w:szCs w:val="20"/>
         </w:rPr>
         <w:t xml:space="preserve"> — 75 CNY / $11.07 (55 ticket + shuttle / person)</w:t>
+      </w:r>
+    </w:p>
+    <w:p>
+      <w:pPr>
+        <w:spacing w:after="80"/>
+        <w:ind w:left="360"/>
+      </w:pPr>
+      <w:r>
+        <w:rPr>
+          <w:rFonts w:ascii="Calibri" w:cs="Calibri" w:eastAsia="Calibri" w:hAnsi="Calibri"/>
+          <w:i/>
+          <w:iCs/>
+          <w:color w:val="3D5038"/>
+          <w:sz w:val="20"/>
+          <w:szCs w:val="20"/>
+        </w:rPr>
+        <w:t xml:space="preserve">About: World-famous panda research center — see giant pandas and the moon cub nursery up close; pandas are most active in the morning.</w:t>
       </w:r>
     </w:p>
     <w:p>
@@ -1058,7 +1075,7 @@
           <w:sz w:val="20"/>
           <w:szCs w:val="20"/>
         </w:rPr>
-        <w:t xml:space="preserve">08:40–12:00 visit. Entrance ticket 55CNY/8.12USD per person; mandatory in-park shuttle bus 20CNY/2.95USD per person. Visit moon cub delivery house.</w:t>
+        <w:t xml:space="preserve">Mandatory in-park shuttle required.</w:t>
       </w:r>
     </w:p>
     <w:p>
@@ -1102,6 +1119,66 @@
           <w:szCs w:val="20"/>
         </w:rPr>
         <w:t xml:space="preserve"> — 60 CNY / $8.86 (per person)</w:t>
+      </w:r>
+    </w:p>
+    <w:p>
+      <w:pPr>
+        <w:spacing w:after="80"/>
+        <w:ind w:left="360"/>
+      </w:pPr>
+      <w:r>
+        <w:rPr>
+          <w:rFonts w:ascii="Calibri" w:cs="Calibri" w:eastAsia="Calibri" w:hAnsi="Calibri"/>
+          <w:i/>
+          <w:iCs/>
+          <w:color w:val="3D5038"/>
+          <w:sz w:val="20"/>
+          <w:szCs w:val="20"/>
+        </w:rPr>
+        <w:t xml:space="preserve">About: The only full-service restaurant inside the panda base with panoramic windows overlooking the enclosures — dine while watching pandas, with non-spicy options.</w:t>
+      </w:r>
+    </w:p>
+    <w:p>
+      <w:pPr>
+        <w:spacing w:after="60"/>
+      </w:pPr>
+      <w:r>
+        <w:rPr>
+          <w:rFonts w:ascii="Calibri" w:cs="Calibri" w:eastAsia="Calibri" w:hAnsi="Calibri"/>
+          <w:b/>
+          <w:bCs/>
+          <w:color w:val="7BAE5C"/>
+          <w:sz w:val="22"/>
+          <w:szCs w:val="22"/>
+        </w:rPr>
+        <w:t xml:space="preserve">13:30</w:t>
+      </w:r>
+      <w:r>
+        <w:rPr>
+          <w:sz w:val="22"/>
+          <w:szCs w:val="22"/>
+        </w:rPr>
+        <w:t xml:space="preserve">  </w:t>
+      </w:r>
+      <w:r>
+        <w:rPr>
+          <w:rFonts w:ascii="Calibri" w:cs="Calibri" w:eastAsia="Calibri" w:hAnsi="Calibri"/>
+          <w:b/>
+          <w:bCs/>
+          <w:color w:val="3D5038"/>
+          <w:sz w:val="22"/>
+          <w:szCs w:val="22"/>
+        </w:rPr>
+        <w:t xml:space="preserve">Return Shuttle to IFS</w:t>
+      </w:r>
+      <w:r>
+        <w:rPr>
+          <w:rFonts w:ascii="Calibri" w:cs="Calibri" w:eastAsia="Calibri" w:hAnsi="Calibri"/>
+          <w:color w:val="6B8062"/>
+          <w:sz w:val="20"/>
+          <w:szCs w:val="20"/>
+        </w:rPr>
+        <w:t xml:space="preserve"> — 10 CNY / $1.48 (per person one-way)</w:t>
       </w:r>
     </w:p>
     <w:p>
@@ -1116,7 +1193,7 @@
           <w:sz w:val="20"/>
           <w:szCs w:val="20"/>
         </w:rPr>
-        <w:t xml:space="preserve">12:00–13:10 lunch inside the park. 60CNY/8.86USD per person, all non-spicy dishes available.</w:t>
+        <w:t xml:space="preserve">Return to IFS by the same shuttle bus.</w:t>
       </w:r>
     </w:p>
     <w:p>
@@ -1132,7 +1209,7 @@
           <w:sz w:val="22"/>
           <w:szCs w:val="22"/>
         </w:rPr>
-        <w:t xml:space="preserve">13:30</w:t>
+        <w:t xml:space="preserve">14:00</w:t>
       </w:r>
       <w:r>
         <w:rPr>
@@ -1150,16 +1227,204 @@
           <w:sz w:val="22"/>
           <w:szCs w:val="22"/>
         </w:rPr>
-        <w:t xml:space="preserve">Return Shuttle to IFS</w:t>
-      </w:r>
-      <w:r>
-        <w:rPr>
-          <w:rFonts w:ascii="Calibri" w:cs="Calibri" w:eastAsia="Calibri" w:hAnsi="Calibri"/>
-          <w:color w:val="6B8062"/>
-          <w:sz w:val="20"/>
-          <w:szCs w:val="20"/>
-        </w:rPr>
-        <w:t xml:space="preserve"> — 10 CNY / $1.48 (per person one-way)</w:t>
+        <w:t xml:space="preserve">IFS Sunset Bistro Panda Afternoon Tea</w:t>
+      </w:r>
+      <w:r>
+        <w:rPr>
+          <w:rFonts w:ascii="Calibri" w:cs="Calibri" w:eastAsia="Calibri" w:hAnsi="Calibri"/>
+          <w:color w:val="6B8062"/>
+          <w:sz w:val="20"/>
+          <w:szCs w:val="20"/>
+        </w:rPr>
+        <w:t xml:space="preserve"> — 260 CNY / $38.4 (set for two)</w:t>
+      </w:r>
+    </w:p>
+    <w:p>
+      <w:pPr>
+        <w:spacing w:after="80"/>
+        <w:ind w:left="360"/>
+      </w:pPr>
+      <w:r>
+        <w:rPr>
+          <w:rFonts w:ascii="Calibri" w:cs="Calibri" w:eastAsia="Calibri" w:hAnsi="Calibri"/>
+          <w:i/>
+          <w:iCs/>
+          <w:color w:val="3D5038"/>
+          <w:sz w:val="20"/>
+          <w:szCs w:val="20"/>
+        </w:rPr>
+        <w:t xml:space="preserve">About: Panda-themed afternoon tea on IFS 7F, steps from the iconic climbing panda sculpture — photogenic set menus in a trendy Chengdu landmark.</w:t>
+      </w:r>
+    </w:p>
+    <w:p>
+      <w:pPr>
+        <w:spacing w:after="60"/>
+      </w:pPr>
+      <w:r>
+        <w:rPr>
+          <w:rFonts w:ascii="Calibri" w:cs="Calibri" w:eastAsia="Calibri" w:hAnsi="Calibri"/>
+          <w:b/>
+          <w:bCs/>
+          <w:color w:val="7BAE5C"/>
+          <w:sz w:val="22"/>
+          <w:szCs w:val="22"/>
+        </w:rPr>
+        <w:t xml:space="preserve">16:00</w:t>
+      </w:r>
+      <w:r>
+        <w:rPr>
+          <w:sz w:val="22"/>
+          <w:szCs w:val="22"/>
+        </w:rPr>
+        <w:t xml:space="preserve">  </w:t>
+      </w:r>
+      <w:r>
+        <w:rPr>
+          <w:rFonts w:ascii="Calibri" w:cs="Calibri" w:eastAsia="Calibri" w:hAnsi="Calibri"/>
+          <w:b/>
+          <w:bCs/>
+          <w:color w:val="3D5038"/>
+          <w:sz w:val="22"/>
+          <w:szCs w:val="22"/>
+        </w:rPr>
+        <w:t xml:space="preserve">Times Square Block A Panda Souvenirs</w:t>
+      </w:r>
+    </w:p>
+    <w:p>
+      <w:pPr>
+        <w:spacing w:after="80"/>
+        <w:ind w:left="360"/>
+      </w:pPr>
+      <w:r>
+        <w:rPr>
+          <w:rFonts w:ascii="Calibri" w:cs="Calibri" w:eastAsia="Calibri" w:hAnsi="Calibri"/>
+          <w:i/>
+          <w:iCs/>
+          <w:color w:val="3D5038"/>
+          <w:sz w:val="20"/>
+          <w:szCs w:val="20"/>
+        </w:rPr>
+        <w:t xml:space="preserve">About: Wholesale panda souvenir hub hidden near IFS — licensed plush, blind boxes, and Sichuan gifts at roughly one-third of tourist-street prices.</w:t>
+      </w:r>
+    </w:p>
+    <w:p>
+      <w:pPr>
+        <w:spacing w:after="40"/>
+        <w:ind w:left="360"/>
+      </w:pPr>
+      <w:r>
+        <w:rPr>
+          <w:rFonts w:ascii="Calibri" w:cs="Calibri" w:eastAsia="Calibri" w:hAnsi="Calibri"/>
+          <w:color w:val="6B8062"/>
+          <w:sz w:val="20"/>
+          <w:szCs w:val="20"/>
+        </w:rPr>
+        <w:t xml:space="preserve">Shopping self-paid.</w:t>
+      </w:r>
+    </w:p>
+    <w:p>
+      <w:pPr>
+        <w:spacing w:after="40"/>
+        <w:ind w:left="360"/>
+      </w:pPr>
+      <w:r>
+        <w:rPr>
+          <w:rFonts w:ascii="Calibri" w:cs="Calibri" w:eastAsia="Calibri" w:hAnsi="Calibri"/>
+          <w:color w:val="6B8062"/>
+          <w:sz w:val="20"/>
+          <w:szCs w:val="20"/>
+        </w:rPr>
+        <w:t xml:space="preserve">Directions: From the giant panda on the IFS façade, enter Block A via the side alley opposite Bosideng. Low-rise and high-rise elevators are separate.</w:t>
+      </w:r>
+    </w:p>
+    <w:p>
+      <w:pPr>
+        <w:spacing w:after="40"/>
+        <w:ind w:left="360"/>
+      </w:pPr>
+      <w:r>
+        <w:rPr>
+          <w:rFonts w:ascii="Calibri" w:cs="Calibri" w:eastAsia="Calibri" w:hAnsi="Calibri"/>
+          <w:color w:val="6B8062"/>
+          <w:sz w:val="20"/>
+          <w:szCs w:val="20"/>
+        </w:rPr>
+        <w:t xml:space="preserve">1) 15F · Pop Panda Factory (low-rise elevator)</w:t>
+      </w:r>
+    </w:p>
+    <w:p>
+      <w:pPr>
+        <w:spacing w:after="40"/>
+        <w:ind w:left="360"/>
+      </w:pPr>
+      <w:r>
+        <w:rPr>
+          <w:rFonts w:ascii="Calibri" w:cs="Calibri" w:eastAsia="Calibri" w:hAnsi="Calibri"/>
+          <w:color w:val="6B8062"/>
+          <w:sz w:val="20"/>
+          <w:szCs w:val="20"/>
+        </w:rPr>
+        <w:t xml:space="preserve">Budget mini gifts: ¥1.2 panda headbands, ¥1.5 fridge magnets, knit pouches, panda stationery, 60+ free commemorative stamps — best for small souvenirs.</w:t>
+      </w:r>
+    </w:p>
+    <w:p>
+      <w:pPr>
+        <w:spacing w:after="40"/>
+        <w:ind w:left="360"/>
+      </w:pPr>
+      <w:r>
+        <w:rPr>
+          <w:rFonts w:ascii="Calibri" w:cs="Calibri" w:eastAsia="Calibri" w:hAnsi="Calibri"/>
+          <w:color w:val="6B8062"/>
+          <w:sz w:val="20"/>
+          <w:szCs w:val="20"/>
+        </w:rPr>
+        <w:t xml:space="preserve">2) 28F · Yichuan Ershu Panda Specialties (high-rise elevator)</w:t>
+      </w:r>
+    </w:p>
+    <w:p>
+      <w:pPr>
+        <w:spacing w:after="40"/>
+        <w:ind w:left="360"/>
+      </w:pPr>
+      <w:r>
+        <w:rPr>
+          <w:rFonts w:ascii="Calibri" w:cs="Calibri" w:eastAsia="Calibri" w:hAnsi="Calibri"/>
+          <w:color w:val="6B8062"/>
+          <w:sz w:val="20"/>
+          <w:szCs w:val="20"/>
+        </w:rPr>
+        <w:t xml:space="preserve">Largest shop: licensed Huahua plush, blind boxes, figurines, plus Sichuan local products (mild beef, pastries, tea) — one-stop for souvenirs and food gifts.</w:t>
+      </w:r>
+    </w:p>
+    <w:p>
+      <w:pPr>
+        <w:spacing w:after="40"/>
+        <w:ind w:left="360"/>
+      </w:pPr>
+      <w:r>
+        <w:rPr>
+          <w:rFonts w:ascii="Calibri" w:cs="Calibri" w:eastAsia="Calibri" w:hAnsi="Calibri"/>
+          <w:color w:val="6B8062"/>
+          <w:sz w:val="20"/>
+          <w:szCs w:val="20"/>
+        </w:rPr>
+        <w:t xml:space="preserve">3) 30F · Fufu / Guyü Panda (high-rise elevator)</w:t>
+      </w:r>
+    </w:p>
+    <w:p>
+      <w:pPr>
+        <w:spacing w:after="40"/>
+        <w:ind w:left="360"/>
+      </w:pPr>
+      <w:r>
+        <w:rPr>
+          <w:rFonts w:ascii="Calibri" w:cs="Calibri" w:eastAsia="Calibri" w:hAnsi="Calibri"/>
+          <w:color w:val="6B8062"/>
+          <w:sz w:val="20"/>
+          <w:szCs w:val="20"/>
+        </w:rPr>
+        <w:t xml:space="preserve">Low-price blind boxes, Sanxingdui collab panda merch, commemorative coins; free shipping to China on qualifying orders — ideal for bulk gifting.</w:t>
       </w:r>
     </w:p>
     <w:p>
@@ -1174,7 +1439,7 @@
           <w:sz w:val="20"/>
           <w:szCs w:val="20"/>
         </w:rPr>
-        <w:t xml:space="preserve">13:30 return to IFS by the same shuttle bus. 10CNY/1.48USD per person one-way.</w:t>
+        <w:t xml:space="preserve">• Key perks: ~1/3 of street/tourist-site prices, wholesale even for single items; seating to rest, clear pricing, WeChat / Alipay accepted.</w:t>
       </w:r>
     </w:p>
     <w:p>
@@ -1190,7 +1455,7 @@
           <w:sz w:val="22"/>
           <w:szCs w:val="22"/>
         </w:rPr>
-        <w:t xml:space="preserve">14:00</w:t>
+        <w:t xml:space="preserve">18:00</w:t>
       </w:r>
       <w:r>
         <w:rPr>
@@ -1208,16 +1473,16 @@
           <w:sz w:val="22"/>
           <w:szCs w:val="22"/>
         </w:rPr>
-        <w:t xml:space="preserve">IFS Sunset Bistro Panda Afternoon Tea</w:t>
-      </w:r>
-      <w:r>
-        <w:rPr>
-          <w:rFonts w:ascii="Calibri" w:cs="Calibri" w:eastAsia="Calibri" w:hAnsi="Calibri"/>
-          <w:color w:val="6B8062"/>
-          <w:sz w:val="20"/>
-          <w:szCs w:val="20"/>
-        </w:rPr>
-        <w:t xml:space="preserve"> — 260 CNY / $38.4 (set for two)</w:t>
+        <w:t xml:space="preserve">Panda Sleepy Hotel Check-in</w:t>
+      </w:r>
+      <w:r>
+        <w:rPr>
+          <w:rFonts w:ascii="Calibri" w:cs="Calibri" w:eastAsia="Calibri" w:hAnsi="Calibri"/>
+          <w:color w:val="6B8062"/>
+          <w:sz w:val="20"/>
+          <w:szCs w:val="20"/>
+        </w:rPr>
+        <w:t xml:space="preserve"> — 600 CNY / $88.62 (2-night split)</w:t>
       </w:r>
     </w:p>
     <w:p>
@@ -1232,7 +1497,7 @@
           <w:sz w:val="20"/>
           <w:szCs w:val="20"/>
         </w:rPr>
-        <w:t xml:space="preserve">14:00 panda-themed afternoon tea set at IFS Sunset Bistro (5:59+) on IFS 7F, next to the rooftop panda. Set price for two: 260CNY/38.40USD.</w:t>
+        <w:t xml:space="preserve">Walk back to Panda Sleepy Hotel to check in and rest.</w:t>
       </w:r>
     </w:p>
     <w:p>
@@ -1248,7 +1513,7 @@
           <w:sz w:val="22"/>
           <w:szCs w:val="22"/>
         </w:rPr>
-        <w:t xml:space="preserve">16:00</w:t>
+        <w:t xml:space="preserve">19:00</w:t>
       </w:r>
       <w:r>
         <w:rPr>
@@ -1266,127 +1531,16 @@
           <w:sz w:val="22"/>
           <w:szCs w:val="22"/>
         </w:rPr>
-        <w:t xml:space="preserve">Times Square Block A Panda Souvenirs</w:t>
-      </w:r>
-    </w:p>
-    <w:p>
-      <w:pPr>
-        <w:spacing w:after="40"/>
-        <w:ind w:left="360"/>
-      </w:pPr>
-      <w:r>
-        <w:rPr>
-          <w:rFonts w:ascii="Calibri" w:cs="Calibri" w:eastAsia="Calibri" w:hAnsi="Calibri"/>
-          <w:color w:val="6B8062"/>
-          <w:sz w:val="20"/>
-          <w:szCs w:val="20"/>
-        </w:rPr>
-        <w:t xml:space="preserve">16:00 Walk to Times Square Block A panda souvenir hub (shopping self-paid).</w:t>
-      </w:r>
-    </w:p>
-    <w:p>
-      <w:pPr>
-        <w:spacing w:after="40"/>
-        <w:ind w:left="360"/>
-      </w:pPr>
-      <w:r>
-        <w:rPr>
-          <w:rFonts w:ascii="Calibri" w:cs="Calibri" w:eastAsia="Calibri" w:hAnsi="Calibri"/>
-          <w:color w:val="6B8062"/>
-          <w:sz w:val="20"/>
-          <w:szCs w:val="20"/>
-        </w:rPr>
-        <w:t xml:space="preserve">Directions: From the giant panda on the IFS façade, enter Block A via the side alley opposite Bosideng. Low-rise and high-rise elevators are separate.</w:t>
-      </w:r>
-    </w:p>
-    <w:p>
-      <w:pPr>
-        <w:spacing w:after="40"/>
-        <w:ind w:left="360"/>
-      </w:pPr>
-      <w:r>
-        <w:rPr>
-          <w:rFonts w:ascii="Calibri" w:cs="Calibri" w:eastAsia="Calibri" w:hAnsi="Calibri"/>
-          <w:color w:val="6B8062"/>
-          <w:sz w:val="20"/>
-          <w:szCs w:val="20"/>
-        </w:rPr>
-        <w:t xml:space="preserve">1) 15F · Pop Panda Factory (low-rise elevator)</w:t>
-      </w:r>
-    </w:p>
-    <w:p>
-      <w:pPr>
-        <w:spacing w:after="40"/>
-        <w:ind w:left="360"/>
-      </w:pPr>
-      <w:r>
-        <w:rPr>
-          <w:rFonts w:ascii="Calibri" w:cs="Calibri" w:eastAsia="Calibri" w:hAnsi="Calibri"/>
-          <w:color w:val="6B8062"/>
-          <w:sz w:val="20"/>
-          <w:szCs w:val="20"/>
-        </w:rPr>
-        <w:t xml:space="preserve">Budget mini gifts: ¥1.2 panda headbands, ¥1.5 fridge magnets, knit pouches, panda stationery, 60+ free commemorative stamps — best for small souvenirs.</w:t>
-      </w:r>
-    </w:p>
-    <w:p>
-      <w:pPr>
-        <w:spacing w:after="40"/>
-        <w:ind w:left="360"/>
-      </w:pPr>
-      <w:r>
-        <w:rPr>
-          <w:rFonts w:ascii="Calibri" w:cs="Calibri" w:eastAsia="Calibri" w:hAnsi="Calibri"/>
-          <w:color w:val="6B8062"/>
-          <w:sz w:val="20"/>
-          <w:szCs w:val="20"/>
-        </w:rPr>
-        <w:t xml:space="preserve">2) 28F · Yichuan Ershu Panda Specialties (high-rise elevator)</w:t>
-      </w:r>
-    </w:p>
-    <w:p>
-      <w:pPr>
-        <w:spacing w:after="40"/>
-        <w:ind w:left="360"/>
-      </w:pPr>
-      <w:r>
-        <w:rPr>
-          <w:rFonts w:ascii="Calibri" w:cs="Calibri" w:eastAsia="Calibri" w:hAnsi="Calibri"/>
-          <w:color w:val="6B8062"/>
-          <w:sz w:val="20"/>
-          <w:szCs w:val="20"/>
-        </w:rPr>
-        <w:t xml:space="preserve">Largest shop: licensed Huahua plush, blind boxes, figurines, plus Sichuan local products (mild beef, pastries, tea) — one-stop for souvenirs and food gifts.</w:t>
-      </w:r>
-    </w:p>
-    <w:p>
-      <w:pPr>
-        <w:spacing w:after="40"/>
-        <w:ind w:left="360"/>
-      </w:pPr>
-      <w:r>
-        <w:rPr>
-          <w:rFonts w:ascii="Calibri" w:cs="Calibri" w:eastAsia="Calibri" w:hAnsi="Calibri"/>
-          <w:color w:val="6B8062"/>
-          <w:sz w:val="20"/>
-          <w:szCs w:val="20"/>
-        </w:rPr>
-        <w:t xml:space="preserve">3) 30F · Fufu / Guyü Panda (high-rise elevator)</w:t>
-      </w:r>
-    </w:p>
-    <w:p>
-      <w:pPr>
-        <w:spacing w:after="40"/>
-        <w:ind w:left="360"/>
-      </w:pPr>
-      <w:r>
-        <w:rPr>
-          <w:rFonts w:ascii="Calibri" w:cs="Calibri" w:eastAsia="Calibri" w:hAnsi="Calibri"/>
-          <w:color w:val="6B8062"/>
-          <w:sz w:val="20"/>
-          <w:szCs w:val="20"/>
-        </w:rPr>
-        <w:t xml:space="preserve">Low-price blind boxes, Sanxingdui collab panda merch, commemorative coins; free shipping to China on qualifying orders — ideal for bulk gifting.</w:t>
+        <w:t xml:space="preserve">Taxi: Hotel → Jinli</w:t>
+      </w:r>
+      <w:r>
+        <w:rPr>
+          <w:rFonts w:ascii="Calibri" w:cs="Calibri" w:eastAsia="Calibri" w:hAnsi="Calibri"/>
+          <w:color w:val="6B8062"/>
+          <w:sz w:val="20"/>
+          <w:szCs w:val="20"/>
+        </w:rPr>
+        <w:t xml:space="preserve"> — 9 CNY / $1.33 (one-way)</w:t>
       </w:r>
     </w:p>
     <w:p>
@@ -1401,7 +1555,7 @@
           <w:sz w:val="20"/>
           <w:szCs w:val="20"/>
         </w:rPr>
-        <w:t xml:space="preserve">• Key perks: ~1/3 of street/tourist-site prices, wholesale even for single items; seating to rest, clear pricing, WeChat / Alipay accepted.</w:t>
+        <w:t xml:space="preserve">Taxi from hotel to Jinli Ancient Street.</w:t>
       </w:r>
     </w:p>
     <w:p>
@@ -1417,7 +1571,7 @@
           <w:sz w:val="22"/>
           <w:szCs w:val="22"/>
         </w:rPr>
-        <w:t xml:space="preserve">18:00</w:t>
+        <w:t xml:space="preserve">19:20–20:30</w:t>
       </w:r>
       <w:r>
         <w:rPr>
@@ -1435,16 +1589,24 @@
           <w:sz w:val="22"/>
           <w:szCs w:val="22"/>
         </w:rPr>
-        <w:t xml:space="preserve">Panda Sleepy Hotel Check-in</w:t>
-      </w:r>
-      <w:r>
-        <w:rPr>
-          <w:rFonts w:ascii="Calibri" w:cs="Calibri" w:eastAsia="Calibri" w:hAnsi="Calibri"/>
-          <w:color w:val="6B8062"/>
-          <w:sz w:val="20"/>
-          <w:szCs w:val="20"/>
-        </w:rPr>
-        <w:t xml:space="preserve"> — 600 CNY / $88.62 (2-night split)</w:t>
+        <w:t xml:space="preserve">Jinli Ancient Street</w:t>
+      </w:r>
+    </w:p>
+    <w:p>
+      <w:pPr>
+        <w:spacing w:after="80"/>
+        <w:ind w:left="360"/>
+      </w:pPr>
+      <w:r>
+        <w:rPr>
+          <w:rFonts w:ascii="Calibri" w:cs="Calibri" w:eastAsia="Calibri" w:hAnsi="Calibri"/>
+          <w:i/>
+          <w:iCs/>
+          <w:color w:val="3D5038"/>
+          <w:sz w:val="20"/>
+          <w:szCs w:val="20"/>
+        </w:rPr>
+        <w:t xml:space="preserve">About: Ming–Qing style pedestrian lane beside Wuhou Shrine — red lanterns, folk crafts, and Chengdu street snacks; most atmospheric after dark.</w:t>
       </w:r>
     </w:p>
     <w:p>
@@ -1459,7 +1621,7 @@
           <w:sz w:val="20"/>
           <w:szCs w:val="20"/>
         </w:rPr>
-        <w:t xml:space="preserve">18:00 walk back to Panda Sleepy Hotel to check in and rest. Room rate 300CNY/44.31USD per night; Day 1 budget includes tonight plus the prior night (2-night split: 600CNY/88.62USD total).</w:t>
+        <w:t xml:space="preserve">Light snacks self-paid.</w:t>
       </w:r>
     </w:p>
     <w:p>
@@ -1475,7 +1637,7 @@
           <w:sz w:val="22"/>
           <w:szCs w:val="22"/>
         </w:rPr>
-        <w:t xml:space="preserve">19:00</w:t>
+        <w:t xml:space="preserve">20:40</w:t>
       </w:r>
       <w:r>
         <w:rPr>
@@ -1493,16 +1655,16 @@
           <w:sz w:val="22"/>
           <w:szCs w:val="22"/>
         </w:rPr>
-        <w:t xml:space="preserve">Taxi: Hotel → Jinli</w:t>
-      </w:r>
-      <w:r>
-        <w:rPr>
-          <w:rFonts w:ascii="Calibri" w:cs="Calibri" w:eastAsia="Calibri" w:hAnsi="Calibri"/>
-          <w:color w:val="6B8062"/>
-          <w:sz w:val="20"/>
-          <w:szCs w:val="20"/>
-        </w:rPr>
-        <w:t xml:space="preserve"> — 9 CNY / $1.33 (one-way)</w:t>
+        <w:t xml:space="preserve">Taxi: Jinli → Jiuyan Bridge</w:t>
+      </w:r>
+      <w:r>
+        <w:rPr>
+          <w:rFonts w:ascii="Calibri" w:cs="Calibri" w:eastAsia="Calibri" w:hAnsi="Calibri"/>
+          <w:color w:val="6B8062"/>
+          <w:sz w:val="20"/>
+          <w:szCs w:val="20"/>
+        </w:rPr>
+        <w:t xml:space="preserve"> — 10 CNY / $1.48 (one-way)</w:t>
       </w:r>
     </w:p>
     <w:p>
@@ -1517,7 +1679,7 @@
           <w:sz w:val="20"/>
           <w:szCs w:val="20"/>
         </w:rPr>
-        <w:t xml:space="preserve">19:00 taxi from hotel to Jinli Ancient Street. 9CNY/1.33USD one-way.</w:t>
+        <w:t xml:space="preserve">Taxi from Jinli to Jiuyan Bridge.</w:t>
       </w:r>
     </w:p>
     <w:p>
@@ -1533,7 +1695,7 @@
           <w:sz w:val="22"/>
           <w:szCs w:val="22"/>
         </w:rPr>
-        <w:t xml:space="preserve">19:20–20:30</w:t>
+        <w:t xml:space="preserve">20:50–22:40</w:t>
       </w:r>
       <w:r>
         <w:rPr>
@@ -1551,7 +1713,76 @@
           <w:sz w:val="22"/>
           <w:szCs w:val="22"/>
         </w:rPr>
-        <w:t xml:space="preserve">Jinli Ancient Street</w:t>
+        <w:t xml:space="preserve">Jiuyan Bridge Riverside Bar</w:t>
+      </w:r>
+      <w:r>
+        <w:rPr>
+          <w:rFonts w:ascii="Calibri" w:cs="Calibri" w:eastAsia="Calibri" w:hAnsi="Calibri"/>
+          <w:color w:val="6B8062"/>
+          <w:sz w:val="20"/>
+          <w:szCs w:val="20"/>
+        </w:rPr>
+        <w:t xml:space="preserve"> — 80 CNY / $11.82 (bar/person)</w:t>
+      </w:r>
+    </w:p>
+    <w:p>
+      <w:pPr>
+        <w:spacing w:after="80"/>
+        <w:ind w:left="360"/>
+      </w:pPr>
+      <w:r>
+        <w:rPr>
+          <w:rFonts w:ascii="Calibri" w:cs="Calibri" w:eastAsia="Calibri" w:hAnsi="Calibri"/>
+          <w:i/>
+          <w:iCs/>
+          <w:color w:val="3D5038"/>
+          <w:sz w:val="20"/>
+          <w:szCs w:val="20"/>
+        </w:rPr>
+        <w:t xml:space="preserve">About: Anshun Bridge spans the Jin River with neon reflections at night; riverside folk bars offer live music and mild fruit wine in a relaxed local scene.</w:t>
+      </w:r>
+    </w:p>
+    <w:p>
+      <w:pPr>
+        <w:spacing w:after="60"/>
+      </w:pPr>
+      <w:r>
+        <w:rPr>
+          <w:rFonts w:ascii="Calibri" w:cs="Calibri" w:eastAsia="Calibri" w:hAnsi="Calibri"/>
+          <w:b/>
+          <w:bCs/>
+          <w:color w:val="7BAE5C"/>
+          <w:sz w:val="22"/>
+          <w:szCs w:val="22"/>
+        </w:rPr>
+        <w:t xml:space="preserve">22:40</w:t>
+      </w:r>
+      <w:r>
+        <w:rPr>
+          <w:sz w:val="22"/>
+          <w:szCs w:val="22"/>
+        </w:rPr>
+        <w:t xml:space="preserve">  </w:t>
+      </w:r>
+      <w:r>
+        <w:rPr>
+          <w:rFonts w:ascii="Calibri" w:cs="Calibri" w:eastAsia="Calibri" w:hAnsi="Calibri"/>
+          <w:b/>
+          <w:bCs/>
+          <w:color w:val="3D5038"/>
+          <w:sz w:val="22"/>
+          <w:szCs w:val="22"/>
+        </w:rPr>
+        <w:t xml:space="preserve">Taxi Back to Hotel</w:t>
+      </w:r>
+      <w:r>
+        <w:rPr>
+          <w:rFonts w:ascii="Calibri" w:cs="Calibri" w:eastAsia="Calibri" w:hAnsi="Calibri"/>
+          <w:color w:val="6B8062"/>
+          <w:sz w:val="20"/>
+          <w:szCs w:val="20"/>
+        </w:rPr>
+        <w:t xml:space="preserve"> — 9 CNY / $1.33 (one-way)</w:t>
       </w:r>
     </w:p>
     <w:p>
@@ -1566,181 +1797,7 @@
           <w:sz w:val="20"/>
           <w:szCs w:val="20"/>
         </w:rPr>
-        <w:t xml:space="preserve">19:20–20:30 night stroll in Jinli Ancient Street. Light snacks self-paid.</w:t>
-      </w:r>
-    </w:p>
-    <w:p>
-      <w:pPr>
-        <w:spacing w:after="60"/>
-      </w:pPr>
-      <w:r>
-        <w:rPr>
-          <w:rFonts w:ascii="Calibri" w:cs="Calibri" w:eastAsia="Calibri" w:hAnsi="Calibri"/>
-          <w:b/>
-          <w:bCs/>
-          <w:color w:val="7BAE5C"/>
-          <w:sz w:val="22"/>
-          <w:szCs w:val="22"/>
-        </w:rPr>
-        <w:t xml:space="preserve">20:40</w:t>
-      </w:r>
-      <w:r>
-        <w:rPr>
-          <w:sz w:val="22"/>
-          <w:szCs w:val="22"/>
-        </w:rPr>
-        <w:t xml:space="preserve">  </w:t>
-      </w:r>
-      <w:r>
-        <w:rPr>
-          <w:rFonts w:ascii="Calibri" w:cs="Calibri" w:eastAsia="Calibri" w:hAnsi="Calibri"/>
-          <w:b/>
-          <w:bCs/>
-          <w:color w:val="3D5038"/>
-          <w:sz w:val="22"/>
-          <w:szCs w:val="22"/>
-        </w:rPr>
-        <w:t xml:space="preserve">Taxi: Jinli → Jiuyan Bridge</w:t>
-      </w:r>
-      <w:r>
-        <w:rPr>
-          <w:rFonts w:ascii="Calibri" w:cs="Calibri" w:eastAsia="Calibri" w:hAnsi="Calibri"/>
-          <w:color w:val="6B8062"/>
-          <w:sz w:val="20"/>
-          <w:szCs w:val="20"/>
-        </w:rPr>
-        <w:t xml:space="preserve"> — 10 CNY / $1.48 (one-way)</w:t>
-      </w:r>
-    </w:p>
-    <w:p>
-      <w:pPr>
-        <w:spacing w:after="120"/>
-        <w:ind w:left="360"/>
-      </w:pPr>
-      <w:r>
-        <w:rPr>
-          <w:rFonts w:ascii="Calibri" w:cs="Calibri" w:eastAsia="Calibri" w:hAnsi="Calibri"/>
-          <w:color w:val="6B8062"/>
-          <w:sz w:val="20"/>
-          <w:szCs w:val="20"/>
-        </w:rPr>
-        <w:t xml:space="preserve">20:40 taxi from Jinli to Jiuyan Bridge. 10CNY/1.48USD one-way.</w:t>
-      </w:r>
-    </w:p>
-    <w:p>
-      <w:pPr>
-        <w:spacing w:after="60"/>
-      </w:pPr>
-      <w:r>
-        <w:rPr>
-          <w:rFonts w:ascii="Calibri" w:cs="Calibri" w:eastAsia="Calibri" w:hAnsi="Calibri"/>
-          <w:b/>
-          <w:bCs/>
-          <w:color w:val="7BAE5C"/>
-          <w:sz w:val="22"/>
-          <w:szCs w:val="22"/>
-        </w:rPr>
-        <w:t xml:space="preserve">20:50–22:40</w:t>
-      </w:r>
-      <w:r>
-        <w:rPr>
-          <w:sz w:val="22"/>
-          <w:szCs w:val="22"/>
-        </w:rPr>
-        <w:t xml:space="preserve">  </w:t>
-      </w:r>
-      <w:r>
-        <w:rPr>
-          <w:rFonts w:ascii="Calibri" w:cs="Calibri" w:eastAsia="Calibri" w:hAnsi="Calibri"/>
-          <w:b/>
-          <w:bCs/>
-          <w:color w:val="3D5038"/>
-          <w:sz w:val="22"/>
-          <w:szCs w:val="22"/>
-        </w:rPr>
-        <w:t xml:space="preserve">Jiuyan Bridge Riverside Bar</w:t>
-      </w:r>
-      <w:r>
-        <w:rPr>
-          <w:rFonts w:ascii="Calibri" w:cs="Calibri" w:eastAsia="Calibri" w:hAnsi="Calibri"/>
-          <w:color w:val="6B8062"/>
-          <w:sz w:val="20"/>
-          <w:szCs w:val="20"/>
-        </w:rPr>
-        <w:t xml:space="preserve"> — 80 CNY / $11.82 (bar/person)</w:t>
-      </w:r>
-    </w:p>
-    <w:p>
-      <w:pPr>
-        <w:spacing w:after="120"/>
-        <w:ind w:left="360"/>
-      </w:pPr>
-      <w:r>
-        <w:rPr>
-          <w:rFonts w:ascii="Calibri" w:cs="Calibri" w:eastAsia="Calibri" w:hAnsi="Calibri"/>
-          <w:color w:val="6B8062"/>
-          <w:sz w:val="20"/>
-          <w:szCs w:val="20"/>
-        </w:rPr>
-        <w:t xml:space="preserve">20:50–22:40 free photos at Anshun Corridor. Affordable riverside folk bar: 80CNY/11.82USD per person, mild fruit wine &amp; non-spicy bites.</w:t>
-      </w:r>
-    </w:p>
-    <w:p>
-      <w:pPr>
-        <w:spacing w:after="60"/>
-      </w:pPr>
-      <w:r>
-        <w:rPr>
-          <w:rFonts w:ascii="Calibri" w:cs="Calibri" w:eastAsia="Calibri" w:hAnsi="Calibri"/>
-          <w:b/>
-          <w:bCs/>
-          <w:color w:val="7BAE5C"/>
-          <w:sz w:val="22"/>
-          <w:szCs w:val="22"/>
-        </w:rPr>
-        <w:t xml:space="preserve">22:40</w:t>
-      </w:r>
-      <w:r>
-        <w:rPr>
-          <w:sz w:val="22"/>
-          <w:szCs w:val="22"/>
-        </w:rPr>
-        <w:t xml:space="preserve">  </w:t>
-      </w:r>
-      <w:r>
-        <w:rPr>
-          <w:rFonts w:ascii="Calibri" w:cs="Calibri" w:eastAsia="Calibri" w:hAnsi="Calibri"/>
-          <w:b/>
-          <w:bCs/>
-          <w:color w:val="3D5038"/>
-          <w:sz w:val="22"/>
-          <w:szCs w:val="22"/>
-        </w:rPr>
-        <w:t xml:space="preserve">Taxi Back to Hotel</w:t>
-      </w:r>
-      <w:r>
-        <w:rPr>
-          <w:rFonts w:ascii="Calibri" w:cs="Calibri" w:eastAsia="Calibri" w:hAnsi="Calibri"/>
-          <w:color w:val="6B8062"/>
-          <w:sz w:val="20"/>
-          <w:szCs w:val="20"/>
-        </w:rPr>
-        <w:t xml:space="preserve"> — 9 CNY / $1.33 (one-way)</w:t>
-      </w:r>
-    </w:p>
-    <w:p>
-      <w:pPr>
-        <w:spacing w:after="120"/>
-        <w:ind w:left="360"/>
-      </w:pPr>
-      <w:r>
-        <w:rPr>
-          <w:rFonts w:ascii="Calibri" w:cs="Calibri" w:eastAsia="Calibri" w:hAnsi="Calibri"/>
-          <w:color w:val="6B8062"/>
-          <w:sz w:val="20"/>
-          <w:szCs w:val="20"/>
-        </w:rPr>
-        <w:t xml:space="preserve">22:40 taxi back to Panda Sleepy Hotel. 9CNY/1.33USD one-way.</w:t>
+        <w:t xml:space="preserve">Taxi back to Panda Sleepy Hotel.</w:t>
       </w:r>
     </w:p>
     <w:p>
@@ -1816,7 +1873,7 @@
           <w:sz w:val="21"/>
           <w:szCs w:val="21"/>
         </w:rPr>
-        <w:t xml:space="preserve">864 CNY / $127.6</w:t>
+        <w:t xml:space="preserve">873 CNY / $128.93</w:t>
       </w:r>
     </w:p>
     <w:p>
@@ -1890,7 +1947,7 @@
           <w:sz w:val="20"/>
           <w:szCs w:val="20"/>
         </w:rPr>
-        <w:t xml:space="preserve">09:00 Metro Line 2 from Chunxi Road to People's Park, 2CNY/0.30USD per person, then walk to Wide &amp; Narrow Alleys.</w:t>
+        <w:t xml:space="preserve">Metro Line 2 from Chunxi Road to People's Park.</w:t>
       </w:r>
     </w:p>
     <w:p>
@@ -1906,7 +1963,7 @@
           <w:sz w:val="22"/>
           <w:szCs w:val="22"/>
         </w:rPr>
-        <w:t xml:space="preserve">09:30–11:40</w:t>
+        <w:t xml:space="preserve">09:30–10:30</w:t>
       </w:r>
       <w:r>
         <w:rPr>
@@ -1924,7 +1981,24 @@
           <w:sz w:val="22"/>
           <w:szCs w:val="22"/>
         </w:rPr>
-        <w:t xml:space="preserve">Wide &amp; Narrow Alleys</w:t>
+        <w:t xml:space="preserve">People's Park</w:t>
+      </w:r>
+    </w:p>
+    <w:p>
+      <w:pPr>
+        <w:spacing w:after="80"/>
+        <w:ind w:left="360"/>
+      </w:pPr>
+      <w:r>
+        <w:rPr>
+          <w:rFonts w:ascii="Calibri" w:cs="Calibri" w:eastAsia="Calibri" w:hAnsi="Calibri"/>
+          <w:i/>
+          <w:iCs/>
+          <w:color w:val="3D5038"/>
+          <w:sz w:val="20"/>
+          <w:szCs w:val="20"/>
+        </w:rPr>
+        <w:t xml:space="preserve">About: Chengdu's oldest public park (since 1911) — square dancing, the famous marriage market, and century-old Heming Teahouse gaiwan tea culture.</w:t>
       </w:r>
     </w:p>
     <w:p>
@@ -1939,7 +2013,7 @@
           <w:sz w:val="20"/>
           <w:szCs w:val="20"/>
         </w:rPr>
-        <w:t xml:space="preserve">09:30–11:40 sightseeing and photo walk through Wide &amp; Narrow Alleys.</w:t>
+        <w:t xml:space="preserve">Free entry.</w:t>
       </w:r>
     </w:p>
     <w:p>
@@ -1955,7 +2029,7 @@
           <w:sz w:val="22"/>
           <w:szCs w:val="22"/>
         </w:rPr>
-        <w:t xml:space="preserve">12:00</w:t>
+        <w:t xml:space="preserve">10:30</w:t>
       </w:r>
       <w:r>
         <w:rPr>
@@ -1973,16 +2047,7 @@
           <w:sz w:val="22"/>
           <w:szCs w:val="22"/>
         </w:rPr>
-        <w:t xml:space="preserve">Tingxiang Mansion Panda Banquet</w:t>
-      </w:r>
-      <w:r>
-        <w:rPr>
-          <w:rFonts w:ascii="Calibri" w:cs="Calibri" w:eastAsia="Calibri" w:hAnsi="Calibri"/>
-          <w:color w:val="6B8062"/>
-          <w:sz w:val="20"/>
-          <w:szCs w:val="20"/>
-        </w:rPr>
-        <w:t xml:space="preserve"> — 200 CNY / $29.54 (set for two)</w:t>
+        <w:t xml:space="preserve">Walk to Wide &amp; Narrow Alleys</w:t>
       </w:r>
     </w:p>
     <w:p>
@@ -1997,7 +2062,7 @@
           <w:sz w:val="20"/>
           <w:szCs w:val="20"/>
         </w:rPr>
-        <w:t xml:space="preserve">12:00 private panda creative banquet at Tingxiang Mansion. Set for two: 200CNY/29.54USD, fully customized non-spicy menu.</w:t>
+        <w:t xml:space="preserve">5-min walk to Wide &amp; Narrow Alleys.</w:t>
       </w:r>
     </w:p>
     <w:p>
@@ -2013,6 +2078,66 @@
           <w:sz w:val="22"/>
           <w:szCs w:val="22"/>
         </w:rPr>
+        <w:t xml:space="preserve">12:00</w:t>
+      </w:r>
+      <w:r>
+        <w:rPr>
+          <w:sz w:val="22"/>
+          <w:szCs w:val="22"/>
+        </w:rPr>
+        <w:t xml:space="preserve">  </w:t>
+      </w:r>
+      <w:r>
+        <w:rPr>
+          <w:rFonts w:ascii="Calibri" w:cs="Calibri" w:eastAsia="Calibri" w:hAnsi="Calibri"/>
+          <w:b/>
+          <w:bCs/>
+          <w:color w:val="3D5038"/>
+          <w:sz w:val="22"/>
+          <w:szCs w:val="22"/>
+        </w:rPr>
+        <w:t xml:space="preserve">Tingxiang Mansion Panda Banquet</w:t>
+      </w:r>
+      <w:r>
+        <w:rPr>
+          <w:rFonts w:ascii="Calibri" w:cs="Calibri" w:eastAsia="Calibri" w:hAnsi="Calibri"/>
+          <w:color w:val="6B8062"/>
+          <w:sz w:val="20"/>
+          <w:szCs w:val="20"/>
+        </w:rPr>
+        <w:t xml:space="preserve"> — 200 CNY / $29.54 (set for two)</w:t>
+      </w:r>
+    </w:p>
+    <w:p>
+      <w:pPr>
+        <w:spacing w:after="80"/>
+        <w:ind w:left="360"/>
+      </w:pPr>
+      <w:r>
+        <w:rPr>
+          <w:rFonts w:ascii="Calibri" w:cs="Calibri" w:eastAsia="Calibri" w:hAnsi="Calibri"/>
+          <w:i/>
+          <w:iCs/>
+          <w:color w:val="3D5038"/>
+          <w:sz w:val="20"/>
+          <w:szCs w:val="20"/>
+        </w:rPr>
+        <w:t xml:space="preserve">About: Private dining in Wide &amp; Narrow Alleys with panda-shaped creative dishes — fully customizable non-spicy menu in a Qing-era courtyard setting.</w:t>
+      </w:r>
+    </w:p>
+    <w:p>
+      <w:pPr>
+        <w:spacing w:after="60"/>
+      </w:pPr>
+      <w:r>
+        <w:rPr>
+          <w:rFonts w:ascii="Calibri" w:cs="Calibri" w:eastAsia="Calibri" w:hAnsi="Calibri"/>
+          <w:b/>
+          <w:bCs/>
+          <w:color w:val="7BAE5C"/>
+          <w:sz w:val="22"/>
+          <w:szCs w:val="22"/>
+        </w:rPr>
         <w:t xml:space="preserve">15:00</w:t>
       </w:r>
       <w:r>
@@ -2031,16 +2156,16 @@
           <w:sz w:val="22"/>
           <w:szCs w:val="22"/>
         </w:rPr>
-        <w:t xml:space="preserve">Taxi: People's Park → Jinsha</w:t>
-      </w:r>
-      <w:r>
-        <w:rPr>
-          <w:rFonts w:ascii="Calibri" w:cs="Calibri" w:eastAsia="Calibri" w:hAnsi="Calibri"/>
-          <w:color w:val="6B8062"/>
-          <w:sz w:val="20"/>
-          <w:szCs w:val="20"/>
-        </w:rPr>
-        <w:t xml:space="preserve"> — 11 CNY / $1.62 (one-way)</w:t>
+        <w:t xml:space="preserve">Taxi: Wide &amp; Narrow Alleys → Jinsha</w:t>
+      </w:r>
+      <w:r>
+        <w:rPr>
+          <w:rFonts w:ascii="Calibri" w:cs="Calibri" w:eastAsia="Calibri" w:hAnsi="Calibri"/>
+          <w:color w:val="6B8062"/>
+          <w:sz w:val="20"/>
+          <w:szCs w:val="20"/>
+        </w:rPr>
+        <w:t xml:space="preserve"> — 20 CNY / $2.95 (one-way)</w:t>
       </w:r>
     </w:p>
     <w:p>
@@ -2055,7 +2180,7 @@
           <w:sz w:val="20"/>
           <w:szCs w:val="20"/>
         </w:rPr>
-        <w:t xml:space="preserve">15:00 taxi from People's Park to Jinsha Site Museum. 11CNY/1.62USD one-way.</w:t>
+        <w:t xml:space="preserve">Taxi from Wide &amp; Narrow Alleys to Jinsha Site Museum.</w:t>
       </w:r>
     </w:p>
     <w:p>
@@ -2099,6 +2224,66 @@
           <w:szCs w:val="20"/>
         </w:rPr>
         <w:t xml:space="preserve"> — 70 CNY / $10.34 (ticket/person + 30 audio)</w:t>
+      </w:r>
+    </w:p>
+    <w:p>
+      <w:pPr>
+        <w:spacing w:after="80"/>
+        <w:ind w:left="360"/>
+      </w:pPr>
+      <w:r>
+        <w:rPr>
+          <w:rFonts w:ascii="Calibri" w:cs="Calibri" w:eastAsia="Calibri" w:hAnsi="Calibri"/>
+          <w:i/>
+          <w:iCs/>
+          <w:color w:val="3D5038"/>
+          <w:sz w:val="20"/>
+          <w:szCs w:val="20"/>
+        </w:rPr>
+        <w:t xml:space="preserve">About: 3,000-year-old Shu Kingdom site — home of the golden Sun Bird (China's cultural heritage logo) and exquisite jade and gold artifacts.</w:t>
+      </w:r>
+    </w:p>
+    <w:p>
+      <w:pPr>
+        <w:spacing w:after="60"/>
+      </w:pPr>
+      <w:r>
+        <w:rPr>
+          <w:rFonts w:ascii="Calibri" w:cs="Calibri" w:eastAsia="Calibri" w:hAnsi="Calibri"/>
+          <w:b/>
+          <w:bCs/>
+          <w:color w:val="7BAE5C"/>
+          <w:sz w:val="22"/>
+          <w:szCs w:val="22"/>
+        </w:rPr>
+        <w:t xml:space="preserve">18:30</w:t>
+      </w:r>
+      <w:r>
+        <w:rPr>
+          <w:sz w:val="22"/>
+          <w:szCs w:val="22"/>
+        </w:rPr>
+        <w:t xml:space="preserve">  </w:t>
+      </w:r>
+      <w:r>
+        <w:rPr>
+          <w:rFonts w:ascii="Calibri" w:cs="Calibri" w:eastAsia="Calibri" w:hAnsi="Calibri"/>
+          <w:b/>
+          <w:bCs/>
+          <w:color w:val="3D5038"/>
+          <w:sz w:val="22"/>
+          <w:szCs w:val="22"/>
+        </w:rPr>
+        <w:t xml:space="preserve">Metro Line 7: Jinsha → Wenshu Monastery</w:t>
+      </w:r>
+      <w:r>
+        <w:rPr>
+          <w:rFonts w:ascii="Calibri" w:cs="Calibri" w:eastAsia="Calibri" w:hAnsi="Calibri"/>
+          <w:color w:val="6B8062"/>
+          <w:sz w:val="20"/>
+          <w:szCs w:val="20"/>
+        </w:rPr>
+        <w:t xml:space="preserve"> — 2 CNY / $0.3 (per person)</w:t>
       </w:r>
     </w:p>
     <w:p>
@@ -2113,7 +2298,7 @@
           <w:sz w:val="20"/>
           <w:szCs w:val="20"/>
         </w:rPr>
-        <w:t xml:space="preserve">15:20–18:00 Jinsha Site Museum. Ticket 70CNY/10.34USD per person; English audio guide 30CNY/4.43USD per person.</w:t>
+        <w:t xml:space="preserve">Metro Line 7 from Jinsha Site Museum to Wenshu Monastery.</w:t>
       </w:r>
     </w:p>
     <w:p>
@@ -2129,7 +2314,7 @@
           <w:sz w:val="22"/>
           <w:szCs w:val="22"/>
         </w:rPr>
-        <w:t xml:space="preserve">18:30</w:t>
+        <w:t xml:space="preserve">19:00</w:t>
       </w:r>
       <w:r>
         <w:rPr>
@@ -2147,16 +2332,127 @@
           <w:sz w:val="22"/>
           <w:szCs w:val="22"/>
         </w:rPr>
-        <w:t xml:space="preserve">Metro Line 7: Jinsha → Wenshu Monastery</w:t>
-      </w:r>
-      <w:r>
-        <w:rPr>
-          <w:rFonts w:ascii="Calibri" w:cs="Calibri" w:eastAsia="Calibri" w:hAnsi="Calibri"/>
-          <w:color w:val="6B8062"/>
-          <w:sz w:val="20"/>
-          <w:szCs w:val="20"/>
-        </w:rPr>
-        <w:t xml:space="preserve"> — 2 CNY / $0.3 (per person)</w:t>
+        <w:t xml:space="preserve">Long Chaoshou (Wenshu Branch)</w:t>
+      </w:r>
+      <w:r>
+        <w:rPr>
+          <w:rFonts w:ascii="Calibri" w:cs="Calibri" w:eastAsia="Calibri" w:hAnsi="Calibri"/>
+          <w:color w:val="6B8062"/>
+          <w:sz w:val="20"/>
+          <w:szCs w:val="20"/>
+        </w:rPr>
+        <w:t xml:space="preserve"> — 25 CNY / $3.69 (per person)</w:t>
+      </w:r>
+    </w:p>
+    <w:p>
+      <w:pPr>
+        <w:spacing w:after="80"/>
+        <w:ind w:left="360"/>
+      </w:pPr>
+      <w:r>
+        <w:rPr>
+          <w:rFonts w:ascii="Calibri" w:cs="Calibri" w:eastAsia="Calibri" w:hAnsi="Calibri"/>
+          <w:i/>
+          <w:iCs/>
+          <w:color w:val="3D5038"/>
+          <w:sz w:val="20"/>
+          <w:szCs w:val="20"/>
+        </w:rPr>
+        <w:t xml:space="preserve">About: Chengdu's classic wonton chain since 1941 — clear-broth wontons are light, mild, and perfect for a non-spicy local dinner near Wenshu Monastery.</w:t>
+      </w:r>
+    </w:p>
+    <w:p>
+      <w:pPr>
+        <w:spacing w:after="60"/>
+      </w:pPr>
+      <w:r>
+        <w:rPr>
+          <w:rFonts w:ascii="Calibri" w:cs="Calibri" w:eastAsia="Calibri" w:hAnsi="Calibri"/>
+          <w:b/>
+          <w:bCs/>
+          <w:color w:val="7BAE5C"/>
+          <w:sz w:val="22"/>
+          <w:szCs w:val="22"/>
+        </w:rPr>
+        <w:t xml:space="preserve">20:00–21:10</w:t>
+      </w:r>
+      <w:r>
+        <w:rPr>
+          <w:sz w:val="22"/>
+          <w:szCs w:val="22"/>
+        </w:rPr>
+        <w:t xml:space="preserve">  </w:t>
+      </w:r>
+      <w:r>
+        <w:rPr>
+          <w:rFonts w:ascii="Calibri" w:cs="Calibri" w:eastAsia="Calibri" w:hAnsi="Calibri"/>
+          <w:b/>
+          <w:bCs/>
+          <w:color w:val="3D5038"/>
+          <w:sz w:val="22"/>
+          <w:szCs w:val="22"/>
+        </w:rPr>
+        <w:t xml:space="preserve">Sichuan Opera at Liyuan Club Wenshu Branch</w:t>
+      </w:r>
+      <w:r>
+        <w:rPr>
+          <w:rFonts w:ascii="Calibri" w:cs="Calibri" w:eastAsia="Calibri" w:hAnsi="Calibri"/>
+          <w:color w:val="6B8062"/>
+          <w:sz w:val="20"/>
+          <w:szCs w:val="20"/>
+        </w:rPr>
+        <w:t xml:space="preserve"> — 99 CNY / $14.61 (two-person ticket)</w:t>
+      </w:r>
+    </w:p>
+    <w:p>
+      <w:pPr>
+        <w:spacing w:after="80"/>
+        <w:ind w:left="360"/>
+      </w:pPr>
+      <w:r>
+        <w:rPr>
+          <w:rFonts w:ascii="Calibri" w:cs="Calibri" w:eastAsia="Calibri" w:hAnsi="Calibri"/>
+          <w:i/>
+          <w:iCs/>
+          <w:color w:val="3D5038"/>
+          <w:sz w:val="20"/>
+          <w:szCs w:val="20"/>
+        </w:rPr>
+        <w:t xml:space="preserve">About: Intimate 70-min Sichuan Opera — face-changing, fire-breathing, and long-spout tea pouring; UNESCO-listed intangible heritage in a small traditional venue.</w:t>
+      </w:r>
+    </w:p>
+    <w:p>
+      <w:pPr>
+        <w:spacing w:after="60"/>
+      </w:pPr>
+      <w:r>
+        <w:rPr>
+          <w:rFonts w:ascii="Calibri" w:cs="Calibri" w:eastAsia="Calibri" w:hAnsi="Calibri"/>
+          <w:b/>
+          <w:bCs/>
+          <w:color w:val="7BAE5C"/>
+          <w:sz w:val="22"/>
+          <w:szCs w:val="22"/>
+        </w:rPr>
+        <w:t xml:space="preserve">21:30</w:t>
+      </w:r>
+      <w:r>
+        <w:rPr>
+          <w:sz w:val="22"/>
+          <w:szCs w:val="22"/>
+        </w:rPr>
+        <w:t xml:space="preserve">  </w:t>
+      </w:r>
+      <w:r>
+        <w:rPr>
+          <w:rFonts w:ascii="Calibri" w:cs="Calibri" w:eastAsia="Calibri" w:hAnsi="Calibri"/>
+          <w:b/>
+          <w:bCs/>
+          <w:color w:val="3D5038"/>
+          <w:sz w:val="22"/>
+          <w:szCs w:val="22"/>
+        </w:rPr>
+        <w:t xml:space="preserve">Metro Back to Hotel</w:t>
       </w:r>
     </w:p>
     <w:p>
@@ -2171,7 +2467,7 @@
           <w:sz w:val="20"/>
           <w:szCs w:val="20"/>
         </w:rPr>
-        <w:t xml:space="preserve">18:30 Metro Line 7 from Jinsha Site Museum to Wenshu Monastery. 2CNY/0.30USD per person.</w:t>
+        <w:t xml:space="preserve">metro back to Panda Sleepy Hotel.</w:t>
       </w:r>
     </w:p>
     <w:p>
@@ -2187,7 +2483,7 @@
           <w:sz w:val="22"/>
           <w:szCs w:val="22"/>
         </w:rPr>
-        <w:t xml:space="preserve">19:00</w:t>
+        <w:t xml:space="preserve">22:00</w:t>
       </w:r>
       <w:r>
         <w:rPr>
@@ -2205,16 +2501,16 @@
           <w:sz w:val="22"/>
           <w:szCs w:val="22"/>
         </w:rPr>
-        <w:t xml:space="preserve">Long Chaoshou (Wenshu Branch)</w:t>
-      </w:r>
-      <w:r>
-        <w:rPr>
-          <w:rFonts w:ascii="Calibri" w:cs="Calibri" w:eastAsia="Calibri" w:hAnsi="Calibri"/>
-          <w:color w:val="6B8062"/>
-          <w:sz w:val="20"/>
-          <w:szCs w:val="20"/>
-        </w:rPr>
-        <w:t xml:space="preserve"> — 25 CNY / $3.69 (per person)</w:t>
+        <w:t xml:space="preserve">Panda Sleepy Hotel</w:t>
+      </w:r>
+      <w:r>
+        <w:rPr>
+          <w:rFonts w:ascii="Calibri" w:cs="Calibri" w:eastAsia="Calibri" w:hAnsi="Calibri"/>
+          <w:color w:val="6B8062"/>
+          <w:sz w:val="20"/>
+          <w:szCs w:val="20"/>
+        </w:rPr>
+        <w:t xml:space="preserve"> — 300 CNY / $44.31 (daily split)</w:t>
       </w:r>
     </w:p>
     <w:p>
@@ -2229,172 +2525,7 @@
           <w:sz w:val="20"/>
           <w:szCs w:val="20"/>
         </w:rPr>
-        <w:t xml:space="preserve">19:00 Long Chaoshou Wenshu Monastery branch. Clear soup wontons 25CNY/3.69USD per person.</w:t>
-      </w:r>
-    </w:p>
-    <w:p>
-      <w:pPr>
-        <w:spacing w:after="60"/>
-      </w:pPr>
-      <w:r>
-        <w:rPr>
-          <w:rFonts w:ascii="Calibri" w:cs="Calibri" w:eastAsia="Calibri" w:hAnsi="Calibri"/>
-          <w:b/>
-          <w:bCs/>
-          <w:color w:val="7BAE5C"/>
-          <w:sz w:val="22"/>
-          <w:szCs w:val="22"/>
-        </w:rPr>
-        <w:t xml:space="preserve">20:00–21:10</w:t>
-      </w:r>
-      <w:r>
-        <w:rPr>
-          <w:sz w:val="22"/>
-          <w:szCs w:val="22"/>
-        </w:rPr>
-        <w:t xml:space="preserve">  </w:t>
-      </w:r>
-      <w:r>
-        <w:rPr>
-          <w:rFonts w:ascii="Calibri" w:cs="Calibri" w:eastAsia="Calibri" w:hAnsi="Calibri"/>
-          <w:b/>
-          <w:bCs/>
-          <w:color w:val="3D5038"/>
-          <w:sz w:val="22"/>
-          <w:szCs w:val="22"/>
-        </w:rPr>
-        <w:t xml:space="preserve">Sichuan Opera at Liyuan Club Wenshu Branch</w:t>
-      </w:r>
-      <w:r>
-        <w:rPr>
-          <w:rFonts w:ascii="Calibri" w:cs="Calibri" w:eastAsia="Calibri" w:hAnsi="Calibri"/>
-          <w:color w:val="6B8062"/>
-          <w:sz w:val="20"/>
-          <w:szCs w:val="20"/>
-        </w:rPr>
-        <w:t xml:space="preserve"> — 99 CNY / $14.61 (two-person ticket)</w:t>
-      </w:r>
-    </w:p>
-    <w:p>
-      <w:pPr>
-        <w:spacing w:after="120"/>
-        <w:ind w:left="360"/>
-      </w:pPr>
-      <w:r>
-        <w:rPr>
-          <w:rFonts w:ascii="Calibri" w:cs="Calibri" w:eastAsia="Calibri" w:hAnsi="Calibri"/>
-          <w:color w:val="6B8062"/>
-          <w:sz w:val="20"/>
-          <w:szCs w:val="20"/>
-        </w:rPr>
-        <w:t xml:space="preserve">20:00–21:10 Sichuan Opera at Liyuan Club Wenshu Branch. Ticket set for two: 99CNY/14.61USD. 70-min intangible cultural heritage performance (face-changing, fire-spitting, long-spout tea art).</w:t>
-      </w:r>
-    </w:p>
-    <w:p>
-      <w:pPr>
-        <w:spacing w:after="60"/>
-      </w:pPr>
-      <w:r>
-        <w:rPr>
-          <w:rFonts w:ascii="Calibri" w:cs="Calibri" w:eastAsia="Calibri" w:hAnsi="Calibri"/>
-          <w:b/>
-          <w:bCs/>
-          <w:color w:val="7BAE5C"/>
-          <w:sz w:val="22"/>
-          <w:szCs w:val="22"/>
-        </w:rPr>
-        <w:t xml:space="preserve">21:30</w:t>
-      </w:r>
-      <w:r>
-        <w:rPr>
-          <w:sz w:val="22"/>
-          <w:szCs w:val="22"/>
-        </w:rPr>
-        <w:t xml:space="preserve">  </w:t>
-      </w:r>
-      <w:r>
-        <w:rPr>
-          <w:rFonts w:ascii="Calibri" w:cs="Calibri" w:eastAsia="Calibri" w:hAnsi="Calibri"/>
-          <w:b/>
-          <w:bCs/>
-          <w:color w:val="3D5038"/>
-          <w:sz w:val="22"/>
-          <w:szCs w:val="22"/>
-        </w:rPr>
-        <w:t xml:space="preserve">Metro Back to Hotel</w:t>
-      </w:r>
-    </w:p>
-    <w:p>
-      <w:pPr>
-        <w:spacing w:after="120"/>
-        <w:ind w:left="360"/>
-      </w:pPr>
-      <w:r>
-        <w:rPr>
-          <w:rFonts w:ascii="Calibri" w:cs="Calibri" w:eastAsia="Calibri" w:hAnsi="Calibri"/>
-          <w:color w:val="6B8062"/>
-          <w:sz w:val="20"/>
-          <w:szCs w:val="20"/>
-        </w:rPr>
-        <w:t xml:space="preserve">21:30 metro back to Panda Sleepy Hotel.</w:t>
-      </w:r>
-    </w:p>
-    <w:p>
-      <w:pPr>
-        <w:spacing w:after="60"/>
-      </w:pPr>
-      <w:r>
-        <w:rPr>
-          <w:rFonts w:ascii="Calibri" w:cs="Calibri" w:eastAsia="Calibri" w:hAnsi="Calibri"/>
-          <w:b/>
-          <w:bCs/>
-          <w:color w:val="7BAE5C"/>
-          <w:sz w:val="22"/>
-          <w:szCs w:val="22"/>
-        </w:rPr>
-        <w:t xml:space="preserve">22:00</w:t>
-      </w:r>
-      <w:r>
-        <w:rPr>
-          <w:sz w:val="22"/>
-          <w:szCs w:val="22"/>
-        </w:rPr>
-        <w:t xml:space="preserve">  </w:t>
-      </w:r>
-      <w:r>
-        <w:rPr>
-          <w:rFonts w:ascii="Calibri" w:cs="Calibri" w:eastAsia="Calibri" w:hAnsi="Calibri"/>
-          <w:b/>
-          <w:bCs/>
-          <w:color w:val="3D5038"/>
-          <w:sz w:val="22"/>
-          <w:szCs w:val="22"/>
-        </w:rPr>
-        <w:t xml:space="preserve">Panda Sleepy Hotel</w:t>
-      </w:r>
-      <w:r>
-        <w:rPr>
-          <w:rFonts w:ascii="Calibri" w:cs="Calibri" w:eastAsia="Calibri" w:hAnsi="Calibri"/>
-          <w:color w:val="6B8062"/>
-          <w:sz w:val="20"/>
-          <w:szCs w:val="20"/>
-        </w:rPr>
-        <w:t xml:space="preserve"> — 300 CNY / $44.31 (daily split)</w:t>
-      </w:r>
-    </w:p>
-    <w:p>
-      <w:pPr>
-        <w:spacing w:after="120"/>
-        <w:ind w:left="360"/>
-      </w:pPr>
-      <w:r>
-        <w:rPr>
-          <w:rFonts w:ascii="Calibri" w:cs="Calibri" w:eastAsia="Calibri" w:hAnsi="Calibri"/>
-          <w:color w:val="6B8062"/>
-          <w:sz w:val="20"/>
-          <w:szCs w:val="20"/>
-        </w:rPr>
-        <w:t xml:space="preserve">Overnight at Panda Sleepy Hotel. Daily room split: 300CNY/44.31USD.</w:t>
+        <w:t xml:space="preserve">Overnight at Panda Sleepy Hotel.</w:t>
       </w:r>
     </w:p>
     <w:p>
@@ -2544,7 +2675,7 @@
           <w:sz w:val="20"/>
           <w:szCs w:val="20"/>
         </w:rPr>
-        <w:t xml:space="preserve">08:00 fixed shuttle bus from IFS to Sanxingdui Museum. One-way 33CNY/4.87USD per person, 70 min ride. Departures at 08:00 &amp; 10:30 daily.</w:t>
+        <w:t xml:space="preserve">Fixed shuttle bus from IFS to Sanxingdui Museum, 70 min ride. Departures at 08:00 &amp; 10:30 daily.</w:t>
       </w:r>
     </w:p>
     <w:p>
@@ -2588,6 +2719,128 @@
           <w:szCs w:val="20"/>
         </w:rPr>
         <w:t xml:space="preserve"> — 72 CNY / $10.63 (ticket/person + 30 audio)</w:t>
+      </w:r>
+    </w:p>
+    <w:p>
+      <w:pPr>
+        <w:spacing w:after="80"/>
+        <w:ind w:left="360"/>
+      </w:pPr>
+      <w:r>
+        <w:rPr>
+          <w:rFonts w:ascii="Calibri" w:cs="Calibri" w:eastAsia="Calibri" w:hAnsi="Calibri"/>
+          <w:i/>
+          <w:iCs/>
+          <w:color w:val="3D5038"/>
+          <w:sz w:val="20"/>
+          <w:szCs w:val="20"/>
+        </w:rPr>
+        <w:t xml:space="preserve">About: One of China's greatest archaeological discoveries — towering bronze masks, gold scepters, and a mysterious civilization unlike anything else in Chinese history.</w:t>
+      </w:r>
+    </w:p>
+    <w:p>
+      <w:pPr>
+        <w:spacing w:after="40"/>
+        <w:ind w:left="360"/>
+      </w:pPr>
+      <w:r>
+        <w:rPr>
+          <w:rFonts w:ascii="Calibri" w:cs="Calibri" w:eastAsia="Calibri" w:hAnsi="Calibri"/>
+          <w:color w:val="6B8062"/>
+          <w:sz w:val="20"/>
+          <w:szCs w:val="20"/>
+        </w:rPr>
+        <w:t xml:space="preserve">Available for rent:</w:t>
+      </w:r>
+    </w:p>
+    <w:p>
+      <w:pPr>
+        <w:spacing w:after="40"/>
+        <w:ind w:left="360"/>
+      </w:pPr>
+      <w:r>
+        <w:rPr>
+          <w:rFonts w:ascii="Calibri" w:cs="Calibri" w:eastAsia="Calibri" w:hAnsi="Calibri"/>
+          <w:color w:val="6B8062"/>
+          <w:sz w:val="20"/>
+          <w:szCs w:val="20"/>
+        </w:rPr>
+        <w:t xml:space="preserve">1. Smart audio guide (recommended for two sharing one device)</w:t>
+      </w:r>
+    </w:p>
+    <w:p>
+      <w:pPr>
+        <w:spacing w:after="40"/>
+        <w:ind w:left="360"/>
+      </w:pPr>
+      <w:r>
+        <w:rPr>
+          <w:rFonts w:ascii="Calibri" w:cs="Calibri" w:eastAsia="Calibri" w:hAnsi="Calibri"/>
+          <w:color w:val="6B8062"/>
+          <w:sz w:val="20"/>
+          <w:szCs w:val="20"/>
+        </w:rPr>
+        <w:t xml:space="preserve">Rental: 30CNY / 4.43USD per unit; deposit 200CNY (fully refunded on return)</w:t>
+      </w:r>
+    </w:p>
+    <w:p>
+      <w:pPr>
+        <w:spacing w:after="40"/>
+        <w:ind w:left="360"/>
+      </w:pPr>
+      <w:r>
+        <w:rPr>
+          <w:rFonts w:ascii="Calibri" w:cs="Calibri" w:eastAsia="Calibri" w:hAnsi="Calibri"/>
+          <w:color w:val="6B8062"/>
+          <w:sz w:val="20"/>
+          <w:szCs w:val="20"/>
+        </w:rPr>
+        <w:t xml:space="preserve">Languages: English, Chinese, Japanese &amp; more; auto-triggered exhibit narration</w:t>
+      </w:r>
+    </w:p>
+    <w:p>
+      <w:pPr>
+        <w:spacing w:after="40"/>
+        <w:ind w:left="360"/>
+      </w:pPr>
+      <w:r>
+        <w:rPr>
+          <w:rFonts w:ascii="Calibri" w:cs="Calibri" w:eastAsia="Calibri" w:hAnsi="Calibri"/>
+          <w:color w:val="6B8062"/>
+          <w:sz w:val="20"/>
+          <w:szCs w:val="20"/>
+        </w:rPr>
+        <w:t xml:space="preserve">Hours: 08:30–17:00; 4-hour battery — enough for a full-day visit</w:t>
+      </w:r>
+    </w:p>
+    <w:p>
+      <w:pPr>
+        <w:spacing w:after="40"/>
+        <w:ind w:left="360"/>
+      </w:pPr>
+      <w:r>
+        <w:rPr>
+          <w:rFonts w:ascii="Calibri" w:cs="Calibri" w:eastAsia="Calibri" w:hAnsi="Calibri"/>
+          <w:color w:val="6B8062"/>
+          <w:sz w:val="20"/>
+          <w:szCs w:val="20"/>
+        </w:rPr>
+        <w:t xml:space="preserve">2. MR immersive guide glasses (Shu Kingdom Secret Mirror)</w:t>
+      </w:r>
+    </w:p>
+    <w:p>
+      <w:pPr>
+        <w:spacing w:after="40"/>
+        <w:ind w:left="360"/>
+      </w:pPr>
+      <w:r>
+        <w:rPr>
+          <w:rFonts w:ascii="Calibri" w:cs="Calibri" w:eastAsia="Calibri" w:hAnsi="Calibri"/>
+          <w:color w:val="6B8062"/>
+          <w:sz w:val="20"/>
+          <w:szCs w:val="20"/>
+        </w:rPr>
+        <w:t xml:space="preserve">Rental: 38CNY / 5.61USD per unit</w:t>
       </w:r>
     </w:p>
     <w:p>
@@ -2602,7 +2855,7 @@
           <w:sz w:val="20"/>
           <w:szCs w:val="20"/>
         </w:rPr>
-        <w:t xml:space="preserve">10:00–16:00 in-depth visit to Sanxingdui Museum. Ticket 72CNY/10.63USD per person; English audio guide 30CNY/4.43USD per person.</w:t>
+        <w:t xml:space="preserve">Highlight: AR animations recreate ancient Shu scenes — ideal for immersive experience seekers</w:t>
       </w:r>
     </w:p>
     <w:p>
@@ -2651,7 +2904,7 @@
           <w:sz w:val="20"/>
           <w:szCs w:val="20"/>
         </w:rPr>
-        <w:t xml:space="preserve">16:30 shuttle bus return to Chunxi Road. Free evening to buy souvenirs; hotel free luggage storage, pack for Jiuzhaigou trip.</w:t>
+        <w:t xml:space="preserve">shuttle bus return to Chunxi Road. Free evening to buy souvenirs; hotel free luggage storage, pack for Jiuzhaigou trip.</w:t>
       </w:r>
     </w:p>
     <w:p>
@@ -2709,7 +2962,7 @@
           <w:sz w:val="20"/>
           <w:szCs w:val="20"/>
         </w:rPr>
-        <w:t xml:space="preserve">Evening at Panda Sleepy Hotel — free luggage storage, pack for Jiuzhaigou. Daily room split: 300CNY/44.31USD.</w:t>
+        <w:t xml:space="preserve">Evening at Panda Sleepy Hotel — free luggage storage, pack for Jiuzhaigou.</w:t>
       </w:r>
     </w:p>
     <w:p>
@@ -2859,7 +3112,7 @@
           <w:sz w:val="20"/>
           <w:szCs w:val="20"/>
         </w:rPr>
-        <w:t xml:space="preserve">Recommended train C5782: departs Chengdu East at 06:45, arrives Huanglong Jiuzhai at 08:24. Alternative departures: 08:12/10:06/11:46/15:45/18:36. Second-class 135CNY/19.94USD per person, 1h 39m.</w:t>
+        <w:t xml:space="preserve">Recommended train C5782: departs Chengdu East at 06:45, arrives Huanglong Jiuzhai at 08:24. Alternative departures: 08:12/10:06/11:46/15:45/18:36, 1h 39m.</w:t>
       </w:r>
     </w:p>
     <w:p>
@@ -2917,7 +3170,7 @@
           <w:sz w:val="20"/>
           <w:szCs w:val="20"/>
         </w:rPr>
-        <w:t xml:space="preserve">Transfer to direct scenic shuttle bus to Jiuzhaigou entrance after exit. 51CNY/7.53USD per person, rolling departure, 2-hour ride.</w:t>
+        <w:t xml:space="preserve">Transfer to direct scenic shuttle bus to Jiuzhaigou entrance after exit, rolling departure, 2-hour ride.</w:t>
       </w:r>
     </w:p>
     <w:p>
@@ -2975,7 +3228,7 @@
           <w:sz w:val="20"/>
           <w:szCs w:val="20"/>
         </w:rPr>
-        <w:t xml:space="preserve">11:00 check in. Free Tibetan costume photoshoot in hotel courtyard in the afternoon (included, no extra charge). Self-arranged light non-spicy dinner; rest to adapt to plateau altitude. Amenities: full-room diffused oxygen, free round-trip scenic shuttle, complimentary breakfast for two included.</w:t>
+        <w:t xml:space="preserve">Check in. Free Tibetan costume photoshoot in hotel courtyard in the afternoon (included). Self-arranged light non-spicy dinner; rest to adapt to plateau altitude. Amenities: full-room diffused oxygen, free round-trip scenic shuttle, complimentary breakfast for two included.</w:t>
       </w:r>
     </w:p>
     <w:p>
@@ -3115,17 +3368,19 @@
     </w:p>
     <w:p>
       <w:pPr>
-        <w:spacing w:after="120"/>
+        <w:spacing w:after="80"/>
         <w:ind w:left="360"/>
       </w:pPr>
       <w:r>
         <w:rPr>
           <w:rFonts w:ascii="Calibri" w:cs="Calibri" w:eastAsia="Calibri" w:hAnsi="Calibri"/>
-          <w:color w:val="6B8062"/>
-          <w:sz w:val="20"/>
-          <w:szCs w:val="20"/>
-        </w:rPr>
-        <w:t xml:space="preserve">Jiuzhaigou entrance ticket + mandatory in-valley shuttle bus: 280CNY/41.36USD per person (combined). Shuttle buses cover the whole scenic area, gentle wooden boardwalks with rest benches, panda souvenir shops inside the park. Vivid lake colors in September, free exploration all day, return to hotel at night. Next day's complimentary breakfast is covered in the hotel package.</w:t>
+          <w:i/>
+          <w:iCs/>
+          <w:color w:val="3D5038"/>
+          <w:sz w:val="20"/>
+          <w:szCs w:val="20"/>
+        </w:rPr>
+        <w:t xml:space="preserve">About: UNESCO World Heritage valley of turquoise lakes and waterfalls — shuttle buses and boardwalks make it accessible without strenuous hiking.</w:t>
       </w:r>
     </w:p>
     <w:p>
@@ -3275,7 +3530,7 @@
           <w:sz w:val="20"/>
           <w:szCs w:val="20"/>
         </w:rPr>
-        <w:t xml:space="preserve">Shuttle bus from Jiuzhaigou entrance back to Huanglong Jiuzhai Station. 51CNY/7.53USD per person.</w:t>
+        <w:t xml:space="preserve">Shuttle bus from Jiuzhaigou entrance back to Huanglong Jiuzhai Station.</w:t>
       </w:r>
     </w:p>
     <w:p>
@@ -3333,7 +3588,7 @@
           <w:sz w:val="20"/>
           <w:szCs w:val="20"/>
         </w:rPr>
-        <w:t xml:space="preserve">Midday high-speed train back to Chengdu East Station. 135CNY/19.94USD per person. Arrive Chunxi Road in the evening, organize luggage for Chongqing trip next day.</w:t>
+        <w:t xml:space="preserve">high-speed train back to Chengdu East Station. Arrive Chunxi Road in the evening, organize luggage for Chongqing trip next day.</w:t>
       </w:r>
     </w:p>
     <w:p>
@@ -3391,7 +3646,7 @@
           <w:sz w:val="20"/>
           <w:szCs w:val="20"/>
         </w:rPr>
-        <w:t xml:space="preserve">Check in Panda Sleepy Hotel. Reminder: no free breakfast; buy on street or at hotel front desk (38CNY/person/day optional).</w:t>
+        <w:t xml:space="preserve">Check in Panda Sleepy Hotel. Reminder: no free breakfast; buy on street or at hotel front desk optional.</w:t>
       </w:r>
     </w:p>
     <w:p>
@@ -3541,7 +3796,7 @@
           <w:sz w:val="20"/>
           <w:szCs w:val="20"/>
         </w:rPr>
-        <w:t xml:space="preserve">09:00 metro from Chunxi Road to Sichuan Museum. 2CNY/0.30USD per person.</w:t>
+        <w:t xml:space="preserve">Metro from Chunxi Road to Sichuan Museum.</w:t>
       </w:r>
     </w:p>
     <w:p>
@@ -3576,6 +3831,23 @@
           <w:szCs w:val="22"/>
         </w:rPr>
         <w:t xml:space="preserve">Sichuan Museum</w:t>
+      </w:r>
+    </w:p>
+    <w:p>
+      <w:pPr>
+        <w:spacing w:after="80"/>
+        <w:ind w:left="360"/>
+      </w:pPr>
+      <w:r>
+        <w:rPr>
+          <w:rFonts w:ascii="Calibri" w:cs="Calibri" w:eastAsia="Calibri" w:hAnsi="Calibri"/>
+          <w:i/>
+          <w:iCs/>
+          <w:color w:val="3D5038"/>
+          <w:sz w:val="20"/>
+          <w:szCs w:val="20"/>
+        </w:rPr>
+        <w:t xml:space="preserve">About: Sichuan's top provincial museum — free entry, strong collection of Shu relics, Tibetan artifacts, and Zhang Daqian paintings; separate from Chengdu Museum.</w:t>
       </w:r>
     </w:p>
     <w:p>
@@ -3590,7 +3862,7 @@
           <w:sz w:val="20"/>
           <w:szCs w:val="20"/>
         </w:rPr>
-        <w:t xml:space="preserve">09:30–12:00 Sichuan Museum. Free entry, online reservation required, top provincial cultural relic collection, fully retained in itinerary.</w:t>
+        <w:t xml:space="preserve">Online reservation required.</w:t>
       </w:r>
     </w:p>
     <w:p>
@@ -3648,7 +3920,7 @@
           <w:sz w:val="20"/>
           <w:szCs w:val="20"/>
         </w:rPr>
-        <w:t xml:space="preserve">12:30 taxi from Sichuan Museum to Chengdu Museum at Tianfu Square. 10CNY/1.48USD one-way.</w:t>
+        <w:t xml:space="preserve">Taxi from Sichuan Museum to Chengdu Museum at Tianfu Square.</w:t>
       </w:r>
     </w:p>
     <w:p>
@@ -3683,6 +3955,23 @@
           <w:szCs w:val="22"/>
         </w:rPr>
         <w:t xml:space="preserve">Chengdu Museum</w:t>
+      </w:r>
+    </w:p>
+    <w:p>
+      <w:pPr>
+        <w:spacing w:after="80"/>
+        <w:ind w:left="360"/>
+      </w:pPr>
+      <w:r>
+        <w:rPr>
+          <w:rFonts w:ascii="Calibri" w:cs="Calibri" w:eastAsia="Calibri" w:hAnsi="Calibri"/>
+          <w:i/>
+          <w:iCs/>
+          <w:color w:val="3D5038"/>
+          <w:sz w:val="20"/>
+          <w:szCs w:val="20"/>
+        </w:rPr>
+        <w:t xml:space="preserve">About: Free city museum at Tianfu Square tracing 4,500 years of Chengdu history — from ancient Shu to modern teahouse culture.</w:t>
       </w:r>
     </w:p>
     <w:p>
@@ -3697,7 +3986,7 @@
           <w:sz w:val="20"/>
           <w:szCs w:val="20"/>
         </w:rPr>
-        <w:t xml:space="preserve">13:00–15:00 Chengdu Museum. Free entry, displays Chengdu city history — two independent venues from Sichuan Museum.</w:t>
+        <w:t xml:space="preserve">Free entry. Separate venue from Sichuan Museum — visit both in one day.</w:t>
       </w:r>
     </w:p>
     <w:p>
@@ -3755,7 +4044,7 @@
           <w:sz w:val="20"/>
           <w:szCs w:val="20"/>
         </w:rPr>
-        <w:t xml:space="preserve">16:30 panda-themed high-speed train Chengdu East → Chongqing West. Second-class 148CNY/21.86USD per person, 1h 20m ride.</w:t>
+        <w:t xml:space="preserve">Panda-themed high-speed train Chengdu East → Chongqing West, 1h 20m ride.</w:t>
       </w:r>
     </w:p>
     <w:p>
@@ -3813,7 +4102,7 @@
           <w:sz w:val="20"/>
           <w:szCs w:val="20"/>
         </w:rPr>
-        <w:t xml:space="preserve">18:00 metro from Chongqing West Station to Jiefangbei. 3CNY/0.44USD per person. Check into Kaiyuan Mingting Hotel — daily complimentary breakfast for two included.</w:t>
+        <w:t xml:space="preserve">Metro from Chongqing West Station to Jiefangbei. Check into Kaiyuan Mingting Hotel — daily complimentary breakfast for two included.</w:t>
       </w:r>
     </w:p>
     <w:p>
@@ -3848,6 +4137,23 @@
           <w:szCs w:val="22"/>
         </w:rPr>
         <w:t xml:space="preserve">Bai Xiang Ju · Shiba Ti · Huashi Wanza Noodles</w:t>
+      </w:r>
+    </w:p>
+    <w:p>
+      <w:pPr>
+        <w:spacing w:after="80"/>
+        <w:ind w:left="360"/>
+      </w:pPr>
+      <w:r>
+        <w:rPr>
+          <w:rFonts w:ascii="Calibri" w:cs="Calibri" w:eastAsia="Calibri" w:hAnsi="Calibri"/>
+          <w:i/>
+          <w:iCs/>
+          <w:color w:val="3D5038"/>
+          <w:sz w:val="20"/>
+          <w:szCs w:val="20"/>
+        </w:rPr>
+        <w:t xml:space="preserve">About: Huashi Wanza Noodles is a Chongqing staple — dry pea noodles with minced pork, customizable no-chili; paired with Bai Xiang Ju cliffside apartments and Shiba Ti's restored steps.</w:t>
       </w:r>
     </w:p>
     <w:p>
@@ -3862,7 +4168,7 @@
           <w:sz w:val="20"/>
           <w:szCs w:val="20"/>
         </w:rPr>
-        <w:t xml:space="preserve">From hotel, 5-min walk to Huashi Pea &amp; Minced Pork Noodles (Minsheng Road Main Store) for a light dinner (self-paid, not in fixed budget). Cost for two: 34CNY / 5.02USD. Order: two bowls dry pea noodles, no chili, add one soft-boiled fried egg each (~17CNY/person). Evening stroll through Bai Xiang Ju &amp; Shiba Ti.</w:t>
+        <w:t xml:space="preserve">5-min walk from hotel (self-paid, not in fixed budget). Order: two bowls dry pea noodles, no chili, one soft-boiled fried egg each.</w:t>
       </w:r>
     </w:p>
     <w:p>
@@ -3897,6 +4203,23 @@
           <w:szCs w:val="22"/>
         </w:rPr>
         <w:t xml:space="preserve">Hongyadong Night View</w:t>
+      </w:r>
+    </w:p>
+    <w:p>
+      <w:pPr>
+        <w:spacing w:after="80"/>
+        <w:ind w:left="360"/>
+      </w:pPr>
+      <w:r>
+        <w:rPr>
+          <w:rFonts w:ascii="Calibri" w:cs="Calibri" w:eastAsia="Calibri" w:hAnsi="Calibri"/>
+          <w:i/>
+          <w:iCs/>
+          <w:color w:val="3D5038"/>
+          <w:sz w:val="20"/>
+          <w:szCs w:val="20"/>
+        </w:rPr>
+        <w:t xml:space="preserve">About: Chongqing's iconic 11-story stilt-house complex lit above the Jialing River — looks like a scene from Spirited Away; free to explore, best at dusk.</w:t>
       </w:r>
     </w:p>
     <w:p>
@@ -3911,7 +4234,7 @@
           <w:sz w:val="20"/>
           <w:szCs w:val="20"/>
         </w:rPr>
-        <w:t xml:space="preserve">19:00 8-min walk to Hongyadong light show. The largest square dancing group in Chongqing gathers at Jiefangbei Pedestrian Street 19:00–21:30, 3-min walk from hotel.</w:t>
+        <w:t xml:space="preserve">8-min walk from hotel. Jiefangbei square dancing 19:00–21:30, 3-min walk.</w:t>
       </w:r>
     </w:p>
     <w:p>
@@ -4061,7 +4384,7 @@
           <w:sz w:val="20"/>
           <w:szCs w:val="20"/>
         </w:rPr>
-        <w:t xml:space="preserve">07:30 have complimentary hotel breakfast, then take round-trip direct shuttle from Jiefangbei Bombing Site to Wulong. 130CNY/19.20USD per person round-trip, 3-hour one-way to Xiannv Town, no transfers needed.</w:t>
+        <w:t xml:space="preserve">Direct round-trip shuttle from Jiefangbei Bombing Site to Wulong — 3 hours per direction to Xiannv Town, no transfers needed.</w:t>
       </w:r>
     </w:p>
     <w:p>
@@ -4105,6 +4428,83 @@
           <w:szCs w:val="20"/>
         </w:rPr>
         <w:t xml:space="preserve"> — 155 CNY / $22.89 (per person)</w:t>
+      </w:r>
+    </w:p>
+    <w:p>
+      <w:pPr>
+        <w:spacing w:after="80"/>
+        <w:ind w:left="360"/>
+      </w:pPr>
+      <w:r>
+        <w:rPr>
+          <w:rFonts w:ascii="Calibri" w:cs="Calibri" w:eastAsia="Calibri" w:hAnsi="Calibri"/>
+          <w:i/>
+          <w:iCs/>
+          <w:color w:val="3D5038"/>
+          <w:sz w:val="20"/>
+          <w:szCs w:val="20"/>
+        </w:rPr>
+        <w:t xml:space="preserve">About: UNESCO karst wonder — three natural stone arch bridges spanning a forested gorge; elevator access avoids the steepest climbs.</w:t>
+      </w:r>
+    </w:p>
+    <w:p>
+      <w:pPr>
+        <w:spacing w:after="60"/>
+      </w:pPr>
+      <w:r>
+        <w:rPr>
+          <w:rFonts w:ascii="Calibri" w:cs="Calibri" w:eastAsia="Calibri" w:hAnsi="Calibri"/>
+          <w:b/>
+          <w:bCs/>
+          <w:color w:val="7BAE5C"/>
+          <w:sz w:val="22"/>
+          <w:szCs w:val="22"/>
+        </w:rPr>
+        <w:t xml:space="preserve">13:30</w:t>
+      </w:r>
+      <w:r>
+        <w:rPr>
+          <w:sz w:val="22"/>
+          <w:szCs w:val="22"/>
+        </w:rPr>
+        <w:t xml:space="preserve">  </w:t>
+      </w:r>
+      <w:r>
+        <w:rPr>
+          <w:rFonts w:ascii="Calibri" w:cs="Calibri" w:eastAsia="Calibri" w:hAnsi="Calibri"/>
+          <w:b/>
+          <w:bCs/>
+          <w:color w:val="3D5038"/>
+          <w:sz w:val="22"/>
+          <w:szCs w:val="22"/>
+        </w:rPr>
+        <w:t xml:space="preserve">Longshui Gorge</w:t>
+      </w:r>
+      <w:r>
+        <w:rPr>
+          <w:rFonts w:ascii="Calibri" w:cs="Calibri" w:eastAsia="Calibri" w:hAnsi="Calibri"/>
+          <w:color w:val="6B8062"/>
+          <w:sz w:val="20"/>
+          <w:szCs w:val="20"/>
+        </w:rPr>
+        <w:t xml:space="preserve"> — 116 CNY / $17.13 (per person)</w:t>
+      </w:r>
+    </w:p>
+    <w:p>
+      <w:pPr>
+        <w:spacing w:after="80"/>
+        <w:ind w:left="360"/>
+      </w:pPr>
+      <w:r>
+        <w:rPr>
+          <w:rFonts w:ascii="Calibri" w:cs="Calibri" w:eastAsia="Calibri" w:hAnsi="Calibri"/>
+          <w:i/>
+          <w:iCs/>
+          <w:color w:val="3D5038"/>
+          <w:sz w:val="20"/>
+          <w:szCs w:val="20"/>
+        </w:rPr>
+        <w:t xml:space="preserve">About: A narrow limestone gorge with elevator descent, gentle downhill boardwalks, and the dramatic Galaxy Waterfall — cooler and less crowded than the bridges.</w:t>
       </w:r>
     </w:p>
     <w:p>
@@ -4119,65 +4519,7 @@
           <w:sz w:val="20"/>
           <w:szCs w:val="20"/>
         </w:rPr>
-        <w:t xml:space="preserve">10:30 visit Three Natural Bridges. Combo ticket (entrance + sightseeing elevator) 155CNY/22.89USD per person, elevator avoids steep climbing.</w:t>
-      </w:r>
-    </w:p>
-    <w:p>
-      <w:pPr>
-        <w:spacing w:after="60"/>
-      </w:pPr>
-      <w:r>
-        <w:rPr>
-          <w:rFonts w:ascii="Calibri" w:cs="Calibri" w:eastAsia="Calibri" w:hAnsi="Calibri"/>
-          <w:b/>
-          <w:bCs/>
-          <w:color w:val="7BAE5C"/>
-          <w:sz w:val="22"/>
-          <w:szCs w:val="22"/>
-        </w:rPr>
-        <w:t xml:space="preserve">13:30</w:t>
-      </w:r>
-      <w:r>
-        <w:rPr>
-          <w:sz w:val="22"/>
-          <w:szCs w:val="22"/>
-        </w:rPr>
-        <w:t xml:space="preserve">  </w:t>
-      </w:r>
-      <w:r>
-        <w:rPr>
-          <w:rFonts w:ascii="Calibri" w:cs="Calibri" w:eastAsia="Calibri" w:hAnsi="Calibri"/>
-          <w:b/>
-          <w:bCs/>
-          <w:color w:val="3D5038"/>
-          <w:sz w:val="22"/>
-          <w:szCs w:val="22"/>
-        </w:rPr>
-        <w:t xml:space="preserve">Longshui Gorge</w:t>
-      </w:r>
-      <w:r>
-        <w:rPr>
-          <w:rFonts w:ascii="Calibri" w:cs="Calibri" w:eastAsia="Calibri" w:hAnsi="Calibri"/>
-          <w:color w:val="6B8062"/>
-          <w:sz w:val="20"/>
-          <w:szCs w:val="20"/>
-        </w:rPr>
-        <w:t xml:space="preserve"> — 116 CNY / $17.13 (per person)</w:t>
-      </w:r>
-    </w:p>
-    <w:p>
-      <w:pPr>
-        <w:spacing w:after="120"/>
-        <w:ind w:left="360"/>
-      </w:pPr>
-      <w:r>
-        <w:rPr>
-          <w:rFonts w:ascii="Calibri" w:cs="Calibri" w:eastAsia="Calibri" w:hAnsi="Calibri"/>
-          <w:color w:val="6B8062"/>
-          <w:sz w:val="20"/>
-          <w:szCs w:val="20"/>
-        </w:rPr>
-        <w:t xml:space="preserve">13:30 transfer bus to Longshui Gorge. Free elevator down to valley bottom, walk 10–15 mins to Galaxy Waterfall, full gentle downhill boardwalk, 1.5–2 hours full tour. Gorge entrance ticket 116CNY/17.13USD per person.</w:t>
+        <w:t xml:space="preserve">Transfer bus from bridges area; full tour 1.5–2 hours.</w:t>
       </w:r>
     </w:p>
     <w:p>
@@ -4357,6 +4699,66 @@
     </w:p>
     <w:p>
       <w:pPr>
+        <w:spacing w:after="80"/>
+        <w:ind w:left="360"/>
+      </w:pPr>
+      <w:r>
+        <w:rPr>
+          <w:rFonts w:ascii="Calibri" w:cs="Calibri" w:eastAsia="Calibri" w:hAnsi="Calibri"/>
+          <w:i/>
+          <w:iCs/>
+          <w:color w:val="3D5038"/>
+          <w:sz w:val="20"/>
+          <w:szCs w:val="20"/>
+        </w:rPr>
+        <w:t xml:space="preserve">About: Complimentary buffet at Kaiyuan Mingting — a good start before a full day of Chongqing sightseeing.</w:t>
+      </w:r>
+    </w:p>
+    <w:p>
+      <w:pPr>
+        <w:spacing w:after="60"/>
+      </w:pPr>
+      <w:r>
+        <w:rPr>
+          <w:rFonts w:ascii="Calibri" w:cs="Calibri" w:eastAsia="Calibri" w:hAnsi="Calibri"/>
+          <w:b/>
+          <w:bCs/>
+          <w:color w:val="7BAE5C"/>
+          <w:sz w:val="22"/>
+          <w:szCs w:val="22"/>
+        </w:rPr>
+        <w:t xml:space="preserve">09:30</w:t>
+      </w:r>
+      <w:r>
+        <w:rPr>
+          <w:sz w:val="22"/>
+          <w:szCs w:val="22"/>
+        </w:rPr>
+        <w:t xml:space="preserve">  </w:t>
+      </w:r>
+      <w:r>
+        <w:rPr>
+          <w:rFonts w:ascii="Calibri" w:cs="Calibri" w:eastAsia="Calibri" w:hAnsi="Calibri"/>
+          <w:b/>
+          <w:bCs/>
+          <w:color w:val="3D5038"/>
+          <w:sz w:val="22"/>
+          <w:szCs w:val="22"/>
+        </w:rPr>
+        <w:t xml:space="preserve">Metro to Liziba</w:t>
+      </w:r>
+      <w:r>
+        <w:rPr>
+          <w:rFonts w:ascii="Calibri" w:cs="Calibri" w:eastAsia="Calibri" w:hAnsi="Calibri"/>
+          <w:color w:val="6B8062"/>
+          <w:sz w:val="20"/>
+          <w:szCs w:val="20"/>
+        </w:rPr>
+        <w:t xml:space="preserve"> — 2 CNY / $0.3 (per person)</w:t>
+      </w:r>
+    </w:p>
+    <w:p>
+      <w:pPr>
         <w:spacing w:after="120"/>
         <w:ind w:left="360"/>
       </w:pPr>
@@ -4367,7 +4769,7 @@
           <w:sz w:val="20"/>
           <w:szCs w:val="20"/>
         </w:rPr>
-        <w:t xml:space="preserve">09:30 enjoy complimentary hotel breakfast for two before heading out.</w:t>
+        <w:t xml:space="preserve">Metro Line 2 from Jiefangbei to Liziba. Photo spot for panda light rail &amp; train-through-building sight.</w:t>
       </w:r>
     </w:p>
     <w:p>
@@ -4383,7 +4785,7 @@
           <w:sz w:val="22"/>
           <w:szCs w:val="22"/>
         </w:rPr>
-        <w:t xml:space="preserve">09:30</w:t>
+        <w:t xml:space="preserve">11:00</w:t>
       </w:r>
       <w:r>
         <w:rPr>
@@ -4401,16 +4803,67 @@
           <w:sz w:val="22"/>
           <w:szCs w:val="22"/>
         </w:rPr>
-        <w:t xml:space="preserve">Metro to Liziba</w:t>
-      </w:r>
-      <w:r>
-        <w:rPr>
-          <w:rFonts w:ascii="Calibri" w:cs="Calibri" w:eastAsia="Calibri" w:hAnsi="Calibri"/>
-          <w:color w:val="6B8062"/>
-          <w:sz w:val="20"/>
-          <w:szCs w:val="20"/>
-        </w:rPr>
-        <w:t xml:space="preserve"> — 2 CNY / $0.3 (per person)</w:t>
+        <w:t xml:space="preserve">Yangtze River Cableway</w:t>
+      </w:r>
+      <w:r>
+        <w:rPr>
+          <w:rFonts w:ascii="Calibri" w:cs="Calibri" w:eastAsia="Calibri" w:hAnsi="Calibri"/>
+          <w:color w:val="6B8062"/>
+          <w:sz w:val="20"/>
+          <w:szCs w:val="20"/>
+        </w:rPr>
+        <w:t xml:space="preserve"> — 20 CNY / $2.95 (per person)</w:t>
+      </w:r>
+    </w:p>
+    <w:p>
+      <w:pPr>
+        <w:spacing w:after="60"/>
+      </w:pPr>
+      <w:r>
+        <w:rPr>
+          <w:rFonts w:ascii="Calibri" w:cs="Calibri" w:eastAsia="Calibri" w:hAnsi="Calibri"/>
+          <w:b/>
+          <w:bCs/>
+          <w:color w:val="7BAE5C"/>
+          <w:sz w:val="22"/>
+          <w:szCs w:val="22"/>
+        </w:rPr>
+        <w:t xml:space="preserve">13:00</w:t>
+      </w:r>
+      <w:r>
+        <w:rPr>
+          <w:sz w:val="22"/>
+          <w:szCs w:val="22"/>
+        </w:rPr>
+        <w:t xml:space="preserve">  </w:t>
+      </w:r>
+      <w:r>
+        <w:rPr>
+          <w:rFonts w:ascii="Calibri" w:cs="Calibri" w:eastAsia="Calibri" w:hAnsi="Calibri"/>
+          <w:b/>
+          <w:bCs/>
+          <w:color w:val="3D5038"/>
+          <w:sz w:val="22"/>
+          <w:szCs w:val="22"/>
+        </w:rPr>
+        <w:t xml:space="preserve">Brother Mao Old Duck Soup (Linjiang Branch)</w:t>
+      </w:r>
+    </w:p>
+    <w:p>
+      <w:pPr>
+        <w:spacing w:after="80"/>
+        <w:ind w:left="360"/>
+      </w:pPr>
+      <w:r>
+        <w:rPr>
+          <w:rFonts w:ascii="Calibri" w:cs="Calibri" w:eastAsia="Calibri" w:hAnsi="Calibri"/>
+          <w:i/>
+          <w:iCs/>
+          <w:color w:val="3D5038"/>
+          <w:sz w:val="20"/>
+          <w:szCs w:val="20"/>
+        </w:rPr>
+        <w:t xml:space="preserve">About: Light duck-soup hotpot popular with locals — mild broth, tender duck, customizable spice level; a non-spicy-friendly choice on Nanbin Road.</w:t>
       </w:r>
     </w:p>
     <w:p>
@@ -4425,7 +4878,7 @@
           <w:sz w:val="20"/>
           <w:szCs w:val="20"/>
         </w:rPr>
-        <w:t xml:space="preserve">Metro Line 2 from Jiefangbei to Liziba. 2CNY/0.30USD per person. Photo spot for panda light rail &amp; train-through-building sight.</w:t>
+        <w:t xml:space="preserve">Self-paid, not in fixed budget.</w:t>
       </w:r>
     </w:p>
     <w:p>
@@ -4441,7 +4894,7 @@
           <w:sz w:val="22"/>
           <w:szCs w:val="22"/>
         </w:rPr>
-        <w:t xml:space="preserve">11:00</w:t>
+        <w:t xml:space="preserve">15:00</w:t>
       </w:r>
       <w:r>
         <w:rPr>
@@ -4459,16 +4912,16 @@
           <w:sz w:val="22"/>
           <w:szCs w:val="22"/>
         </w:rPr>
-        <w:t xml:space="preserve">Yangtze River Cableway</w:t>
-      </w:r>
-      <w:r>
-        <w:rPr>
-          <w:rFonts w:ascii="Calibri" w:cs="Calibri" w:eastAsia="Calibri" w:hAnsi="Calibri"/>
-          <w:color w:val="6B8062"/>
-          <w:sz w:val="20"/>
-          <w:szCs w:val="20"/>
-        </w:rPr>
-        <w:t xml:space="preserve"> — 20 CNY / $2.95 (per person)</w:t>
+        <w:t xml:space="preserve">Taxi: Jiefangbei → Nanbin Road</w:t>
+      </w:r>
+      <w:r>
+        <w:rPr>
+          <w:rFonts w:ascii="Calibri" w:cs="Calibri" w:eastAsia="Calibri" w:hAnsi="Calibri"/>
+          <w:color w:val="6B8062"/>
+          <w:sz w:val="20"/>
+          <w:szCs w:val="20"/>
+        </w:rPr>
+        <w:t xml:space="preserve"> — 8 CNY / $1.18 (one-way)</w:t>
       </w:r>
     </w:p>
     <w:p>
@@ -4483,7 +4936,7 @@
           <w:sz w:val="20"/>
           <w:szCs w:val="20"/>
         </w:rPr>
-        <w:t xml:space="preserve">11:00 round-trip Yangtze River Cableway ticket. 20CNY/2.95USD per person.</w:t>
+        <w:t xml:space="preserve">Taxi from Jiefangbei to Nanbin Road. Distance note: 800m straight line between Nanbin Road and Xiahaoli, 10-min gentle downhill walk; 5-min walk from Shangxinjie Metro Exit 5 to entrance.</w:t>
       </w:r>
     </w:p>
     <w:p>
@@ -4499,7 +4952,7 @@
           <w:sz w:val="22"/>
           <w:szCs w:val="22"/>
         </w:rPr>
-        <w:t xml:space="preserve">13:00</w:t>
+        <w:t xml:space="preserve">16:00–19:00</w:t>
       </w:r>
       <w:r>
         <w:rPr>
@@ -4517,7 +4970,24 @@
           <w:sz w:val="22"/>
           <w:szCs w:val="22"/>
         </w:rPr>
-        <w:t xml:space="preserve">Brother Mao Old Duck Soup (Linjiang Branch)</w:t>
+        <w:t xml:space="preserve">Nanbin Road &amp; Xiahaoli</w:t>
+      </w:r>
+    </w:p>
+    <w:p>
+      <w:pPr>
+        <w:spacing w:after="80"/>
+        <w:ind w:left="360"/>
+      </w:pPr>
+      <w:r>
+        <w:rPr>
+          <w:rFonts w:ascii="Calibri" w:cs="Calibri" w:eastAsia="Calibri" w:hAnsi="Calibri"/>
+          <w:i/>
+          <w:iCs/>
+          <w:color w:val="3D5038"/>
+          <w:sz w:val="20"/>
+          <w:szCs w:val="20"/>
+        </w:rPr>
+        <w:t xml:space="preserve">About: Nanbin Road faces Yuzhong Peninsula across the Yangtze — Xiahaoli is a restored hillside lane with cafés and Longmenhao sunset views over Chongqing's skyline.</w:t>
       </w:r>
     </w:p>
     <w:p>
@@ -4532,7 +5002,7 @@
           <w:sz w:val="20"/>
           <w:szCs w:val="20"/>
         </w:rPr>
-        <w:t xml:space="preserve">13:00 lunch at Brother Mao Old Duck Soup (Linjiang Branch). 70CNY/10.34USD per person, light non-spicy duck soup (self-paid, not in fixed budget).</w:t>
+        <w:t xml:space="preserve">Sunset viewing at Longmenhao View Platform.</w:t>
       </w:r>
     </w:p>
     <w:p>
@@ -4548,7 +5018,7 @@
           <w:sz w:val="22"/>
           <w:szCs w:val="22"/>
         </w:rPr>
-        <w:t xml:space="preserve">15:00</w:t>
+        <w:t xml:space="preserve">19:30</w:t>
       </w:r>
       <w:r>
         <w:rPr>
@@ -4566,16 +5036,7 @@
           <w:sz w:val="22"/>
           <w:szCs w:val="22"/>
         </w:rPr>
-        <w:t xml:space="preserve">Taxi: Jiefangbei → Nanbin Road</w:t>
-      </w:r>
-      <w:r>
-        <w:rPr>
-          <w:rFonts w:ascii="Calibri" w:cs="Calibri" w:eastAsia="Calibri" w:hAnsi="Calibri"/>
-          <w:color w:val="6B8062"/>
-          <w:sz w:val="20"/>
-          <w:szCs w:val="20"/>
-        </w:rPr>
-        <w:t xml:space="preserve"> — 8 CNY / $1.18 (one-way)</w:t>
+        <w:t xml:space="preserve">Taxi Back to Jiefangbei</w:t>
       </w:r>
     </w:p>
     <w:p>
@@ -4590,105 +5051,7 @@
           <w:sz w:val="20"/>
           <w:szCs w:val="20"/>
         </w:rPr>
-        <w:t xml:space="preserve">15:00 taxi from Jiefangbei to Nanbin Road. 8CNY/1.18USD one-way. Distance note: 800m straight line between Nanbin Road and Xiahaoli, 10-min gentle downhill walk; 5-min walk from Shangxinjie Metro Exit 5 to entrance.</w:t>
-      </w:r>
-    </w:p>
-    <w:p>
-      <w:pPr>
-        <w:spacing w:after="60"/>
-      </w:pPr>
-      <w:r>
-        <w:rPr>
-          <w:rFonts w:ascii="Calibri" w:cs="Calibri" w:eastAsia="Calibri" w:hAnsi="Calibri"/>
-          <w:b/>
-          <w:bCs/>
-          <w:color w:val="7BAE5C"/>
-          <w:sz w:val="22"/>
-          <w:szCs w:val="22"/>
-        </w:rPr>
-        <w:t xml:space="preserve">16:00–19:00</w:t>
-      </w:r>
-      <w:r>
-        <w:rPr>
-          <w:sz w:val="22"/>
-          <w:szCs w:val="22"/>
-        </w:rPr>
-        <w:t xml:space="preserve">  </w:t>
-      </w:r>
-      <w:r>
-        <w:rPr>
-          <w:rFonts w:ascii="Calibri" w:cs="Calibri" w:eastAsia="Calibri" w:hAnsi="Calibri"/>
-          <w:b/>
-          <w:bCs/>
-          <w:color w:val="3D5038"/>
-          <w:sz w:val="22"/>
-          <w:szCs w:val="22"/>
-        </w:rPr>
-        <w:t xml:space="preserve">Nanbin Road &amp; Xiahaoli</w:t>
-      </w:r>
-    </w:p>
-    <w:p>
-      <w:pPr>
-        <w:spacing w:after="120"/>
-        <w:ind w:left="360"/>
-      </w:pPr>
-      <w:r>
-        <w:rPr>
-          <w:rFonts w:ascii="Calibri" w:cs="Calibri" w:eastAsia="Calibri" w:hAnsi="Calibri"/>
-          <w:color w:val="6B8062"/>
-          <w:sz w:val="20"/>
-          <w:szCs w:val="20"/>
-        </w:rPr>
-        <w:t xml:space="preserve">16:00–19:00 visit Xiahaoli Literary Old Street, overlook Yuzhong Peninsula sunset at Longmenhao View Platform.</w:t>
-      </w:r>
-    </w:p>
-    <w:p>
-      <w:pPr>
-        <w:spacing w:after="60"/>
-      </w:pPr>
-      <w:r>
-        <w:rPr>
-          <w:rFonts w:ascii="Calibri" w:cs="Calibri" w:eastAsia="Calibri" w:hAnsi="Calibri"/>
-          <w:b/>
-          <w:bCs/>
-          <w:color w:val="7BAE5C"/>
-          <w:sz w:val="22"/>
-          <w:szCs w:val="22"/>
-        </w:rPr>
-        <w:t xml:space="preserve">19:30</w:t>
-      </w:r>
-      <w:r>
-        <w:rPr>
-          <w:sz w:val="22"/>
-          <w:szCs w:val="22"/>
-        </w:rPr>
-        <w:t xml:space="preserve">  </w:t>
-      </w:r>
-      <w:r>
-        <w:rPr>
-          <w:rFonts w:ascii="Calibri" w:cs="Calibri" w:eastAsia="Calibri" w:hAnsi="Calibri"/>
-          <w:b/>
-          <w:bCs/>
-          <w:color w:val="3D5038"/>
-          <w:sz w:val="22"/>
-          <w:szCs w:val="22"/>
-        </w:rPr>
-        <w:t xml:space="preserve">Taxi Back to Jiefangbei</w:t>
-      </w:r>
-    </w:p>
-    <w:p>
-      <w:pPr>
-        <w:spacing w:after="120"/>
-        <w:ind w:left="360"/>
-      </w:pPr>
-      <w:r>
-        <w:rPr>
-          <w:rFonts w:ascii="Calibri" w:cs="Calibri" w:eastAsia="Calibri" w:hAnsi="Calibri"/>
-          <w:color w:val="6B8062"/>
-          <w:sz w:val="20"/>
-          <w:szCs w:val="20"/>
-        </w:rPr>
-        <w:t xml:space="preserve">19:30 taxi back to Jiefangbei for self-arranged dinner and rest.</w:t>
+        <w:t xml:space="preserve">taxi back to Jiefangbei for self-arranged dinner and rest.</w:t>
       </w:r>
     </w:p>
     <w:p>
@@ -4819,6 +5182,66 @@
     </w:p>
     <w:p>
       <w:pPr>
+        <w:spacing w:after="80"/>
+        <w:ind w:left="360"/>
+      </w:pPr>
+      <w:r>
+        <w:rPr>
+          <w:rFonts w:ascii="Calibri" w:cs="Calibri" w:eastAsia="Calibri" w:hAnsi="Calibri"/>
+          <w:i/>
+          <w:iCs/>
+          <w:color w:val="3D5038"/>
+          <w:sz w:val="20"/>
+          <w:szCs w:val="20"/>
+        </w:rPr>
+        <w:t xml:space="preserve">About: Early hotel buffet before the long Wulingyuan day trip — included in your stay.</w:t>
+      </w:r>
+    </w:p>
+    <w:p>
+      <w:pPr>
+        <w:spacing w:after="60"/>
+      </w:pPr>
+      <w:r>
+        <w:rPr>
+          <w:rFonts w:ascii="Calibri" w:cs="Calibri" w:eastAsia="Calibri" w:hAnsi="Calibri"/>
+          <w:b/>
+          <w:bCs/>
+          <w:color w:val="7BAE5C"/>
+          <w:sz w:val="22"/>
+          <w:szCs w:val="22"/>
+        </w:rPr>
+        <w:t xml:space="preserve">07:00</w:t>
+      </w:r>
+      <w:r>
+        <w:rPr>
+          <w:sz w:val="22"/>
+          <w:szCs w:val="22"/>
+        </w:rPr>
+        <w:t xml:space="preserve">  </w:t>
+      </w:r>
+      <w:r>
+        <w:rPr>
+          <w:rFonts w:ascii="Calibri" w:cs="Calibri" w:eastAsia="Calibri" w:hAnsi="Calibri"/>
+          <w:b/>
+          <w:bCs/>
+          <w:color w:val="3D5038"/>
+          <w:sz w:val="22"/>
+          <w:szCs w:val="22"/>
+        </w:rPr>
+        <w:t xml:space="preserve">Taxi: Jiefangbei → Chongqing East</w:t>
+      </w:r>
+      <w:r>
+        <w:rPr>
+          <w:rFonts w:ascii="Calibri" w:cs="Calibri" w:eastAsia="Calibri" w:hAnsi="Calibri"/>
+          <w:color w:val="6B8062"/>
+          <w:sz w:val="20"/>
+          <w:szCs w:val="20"/>
+        </w:rPr>
+        <w:t xml:space="preserve"> — 15 CNY / $2.22 (one-way)</w:t>
+      </w:r>
+    </w:p>
+    <w:p>
+      <w:pPr>
         <w:spacing w:after="120"/>
         <w:ind w:left="360"/>
       </w:pPr>
@@ -4829,7 +5252,7 @@
           <w:sz w:val="20"/>
           <w:szCs w:val="20"/>
         </w:rPr>
-        <w:t xml:space="preserve">07:00 have complimentary hotel breakfast for two before departure.</w:t>
+        <w:t xml:space="preserve">Taxi from Jiefangbei to Chongqing East Railway Station.</w:t>
       </w:r>
     </w:p>
     <w:p>
@@ -4845,7 +5268,7 @@
           <w:sz w:val="22"/>
           <w:szCs w:val="22"/>
         </w:rPr>
-        <w:t xml:space="preserve">07:00</w:t>
+        <w:t xml:space="preserve">07:40</w:t>
       </w:r>
       <w:r>
         <w:rPr>
@@ -4863,16 +5286,16 @@
           <w:sz w:val="22"/>
           <w:szCs w:val="22"/>
         </w:rPr>
-        <w:t xml:space="preserve">Taxi: Jiefangbei → Chongqing East</w:t>
-      </w:r>
-      <w:r>
-        <w:rPr>
-          <w:rFonts w:ascii="Calibri" w:cs="Calibri" w:eastAsia="Calibri" w:hAnsi="Calibri"/>
-          <w:color w:val="6B8062"/>
-          <w:sz w:val="20"/>
-          <w:szCs w:val="20"/>
-        </w:rPr>
-        <w:t xml:space="preserve"> — 15 CNY / $2.22 (one-way)</w:t>
+        <w:t xml:space="preserve">High-Speed Train to Zhangjiajie</w:t>
+      </w:r>
+      <w:r>
+        <w:rPr>
+          <w:rFonts w:ascii="Calibri" w:cs="Calibri" w:eastAsia="Calibri" w:hAnsi="Calibri"/>
+          <w:color w:val="6B8062"/>
+          <w:sz w:val="20"/>
+          <w:szCs w:val="20"/>
+        </w:rPr>
+        <w:t xml:space="preserve"> — 226 CNY / $33.38 (2nd class/person)</w:t>
       </w:r>
     </w:p>
     <w:p>
@@ -4887,7 +5310,7 @@
           <w:sz w:val="20"/>
           <w:szCs w:val="20"/>
         </w:rPr>
-        <w:t xml:space="preserve">07:00 taxi from Jiefangbei to Chongqing East Railway Station. 15CNY/2.22USD one-way.</w:t>
+        <w:t xml:space="preserve">High-speed train Chongqing East → Zhangjiajie West. Fastest ride 2h 02m, multiple daily shifts.</w:t>
       </w:r>
     </w:p>
     <w:p>
@@ -4903,7 +5326,7 @@
           <w:sz w:val="22"/>
           <w:szCs w:val="22"/>
         </w:rPr>
-        <w:t xml:space="preserve">07:40</w:t>
+        <w:t xml:space="preserve">10:00</w:t>
       </w:r>
       <w:r>
         <w:rPr>
@@ -4921,16 +5344,16 @@
           <w:sz w:val="22"/>
           <w:szCs w:val="22"/>
         </w:rPr>
-        <w:t xml:space="preserve">High-Speed Train to Zhangjiajie</w:t>
-      </w:r>
-      <w:r>
-        <w:rPr>
-          <w:rFonts w:ascii="Calibri" w:cs="Calibri" w:eastAsia="Calibri" w:hAnsi="Calibri"/>
-          <w:color w:val="6B8062"/>
-          <w:sz w:val="20"/>
-          <w:szCs w:val="20"/>
-        </w:rPr>
-        <w:t xml:space="preserve"> — 226 CNY / $33.38 (2nd class/person)</w:t>
+        <w:t xml:space="preserve">Shuttle to Wulingyuan Gate</w:t>
+      </w:r>
+      <w:r>
+        <w:rPr>
+          <w:rFonts w:ascii="Calibri" w:cs="Calibri" w:eastAsia="Calibri" w:hAnsi="Calibri"/>
+          <w:color w:val="6B8062"/>
+          <w:sz w:val="20"/>
+          <w:szCs w:val="20"/>
+        </w:rPr>
+        <w:t xml:space="preserve"> — 40 CNY / $5.91 (per person)</w:t>
       </w:r>
     </w:p>
     <w:p>
@@ -4945,7 +5368,7 @@
           <w:sz w:val="20"/>
           <w:szCs w:val="20"/>
         </w:rPr>
-        <w:t xml:space="preserve">07:40 high-speed train Chongqing East → Zhangjiajie West. Average second-class 226CNY/33.38USD per person, fastest ride 2h 02m, multiple daily shifts.</w:t>
+        <w:t xml:space="preserve">Scenic shuttle bus from Zhangjiajie West Station to Wulingyuan Gate, 40-min ride.</w:t>
       </w:r>
     </w:p>
     <w:p>
@@ -4961,7 +5384,7 @@
           <w:sz w:val="22"/>
           <w:szCs w:val="22"/>
         </w:rPr>
-        <w:t xml:space="preserve">10:00</w:t>
+        <w:t xml:space="preserve">10:40</w:t>
       </w:r>
       <w:r>
         <w:rPr>
@@ -4979,16 +5402,33 @@
           <w:sz w:val="22"/>
           <w:szCs w:val="22"/>
         </w:rPr>
-        <w:t xml:space="preserve">Shuttle to Wulingyuan Gate</w:t>
-      </w:r>
-      <w:r>
-        <w:rPr>
-          <w:rFonts w:ascii="Calibri" w:cs="Calibri" w:eastAsia="Calibri" w:hAnsi="Calibri"/>
-          <w:color w:val="6B8062"/>
-          <w:sz w:val="20"/>
-          <w:szCs w:val="20"/>
-        </w:rPr>
-        <w:t xml:space="preserve"> — 40 CNY / $5.91 (per person)</w:t>
+        <w:t xml:space="preserve">Wulingyuan National Forest Park</w:t>
+      </w:r>
+      <w:r>
+        <w:rPr>
+          <w:rFonts w:ascii="Calibri" w:cs="Calibri" w:eastAsia="Calibri" w:hAnsi="Calibri"/>
+          <w:color w:val="6B8062"/>
+          <w:sz w:val="20"/>
+          <w:szCs w:val="20"/>
+        </w:rPr>
+        <w:t xml:space="preserve"> — 230 CNY / $33.97 (incl. Bailong Elevator 65/person)</w:t>
+      </w:r>
+    </w:p>
+    <w:p>
+      <w:pPr>
+        <w:spacing w:after="80"/>
+        <w:ind w:left="360"/>
+      </w:pPr>
+      <w:r>
+        <w:rPr>
+          <w:rFonts w:ascii="Calibri" w:cs="Calibri" w:eastAsia="Calibri" w:hAnsi="Calibri"/>
+          <w:i/>
+          <w:iCs/>
+          <w:color w:val="3D5038"/>
+          <w:sz w:val="20"/>
+          <w:szCs w:val="20"/>
+        </w:rPr>
+        <w:t xml:space="preserve">About: Zhangjiajie's sandstone pillars inspired Avatar's floating mountains — Bailong Elevator lifts you to the cliff tops for iconic forest views.</w:t>
       </w:r>
     </w:p>
     <w:p>
@@ -5003,7 +5443,7 @@
           <w:sz w:val="20"/>
           <w:szCs w:val="20"/>
         </w:rPr>
-        <w:t xml:space="preserve">10:00 scenic shuttle bus from Zhangjiajie West Station to Wulingyuan Gate. 40CNY/5.91USD per person, 40-min ride.</w:t>
+        <w:t xml:space="preserve">Last admission 17:00; in-park shuttles stop at 18:00.</w:t>
       </w:r>
     </w:p>
     <w:p>
@@ -5019,7 +5459,7 @@
           <w:sz w:val="22"/>
           <w:szCs w:val="22"/>
         </w:rPr>
-        <w:t xml:space="preserve">10:40</w:t>
+        <w:t xml:space="preserve">17:20</w:t>
       </w:r>
       <w:r>
         <w:rPr>
@@ -5037,16 +5477,16 @@
           <w:sz w:val="22"/>
           <w:szCs w:val="22"/>
         </w:rPr>
-        <w:t xml:space="preserve">Wulingyuan National Forest Park</w:t>
-      </w:r>
-      <w:r>
-        <w:rPr>
-          <w:rFonts w:ascii="Calibri" w:cs="Calibri" w:eastAsia="Calibri" w:hAnsi="Calibri"/>
-          <w:color w:val="6B8062"/>
-          <w:sz w:val="20"/>
-          <w:szCs w:val="20"/>
-        </w:rPr>
-        <w:t xml:space="preserve"> — 230 CNY / $33.97 (incl. Bailong Elevator 65/person)</w:t>
+        <w:t xml:space="preserve">Return Shuttle to Zhangjiajie West</w:t>
+      </w:r>
+      <w:r>
+        <w:rPr>
+          <w:rFonts w:ascii="Calibri" w:cs="Calibri" w:eastAsia="Calibri" w:hAnsi="Calibri"/>
+          <w:color w:val="6B8062"/>
+          <w:sz w:val="20"/>
+          <w:szCs w:val="20"/>
+        </w:rPr>
+        <w:t xml:space="preserve"> — 40 CNY / $5.91 (per person)</w:t>
       </w:r>
     </w:p>
     <w:p>
@@ -5061,7 +5501,7 @@
           <w:sz w:val="20"/>
           <w:szCs w:val="20"/>
         </w:rPr>
-        <w:t xml:space="preserve">Full-day Wulingyuan tour. Combined entrance ticket 230CNY/33.97USD per person, including Bailong Elevator (65CNY/9.60USD). Cableways &amp; elevators cover most scenic areas to minimize climbing, plenty of gentle viewing platforms. The park stops admitting visitors at 17:00, and internal shuttle buses stop service at 18:00.</w:t>
+        <w:t xml:space="preserve">Take the return scenic shuttle bus back to Zhangjiajie West Station, 40-min ride, arrive at the station at 18:00.</w:t>
       </w:r>
     </w:p>
     <w:p>
@@ -5077,7 +5517,7 @@
           <w:sz w:val="22"/>
           <w:szCs w:val="22"/>
         </w:rPr>
-        <w:t xml:space="preserve">17:20</w:t>
+        <w:t xml:space="preserve">20:48</w:t>
       </w:r>
       <w:r>
         <w:rPr>
@@ -5095,16 +5535,16 @@
           <w:sz w:val="22"/>
           <w:szCs w:val="22"/>
         </w:rPr>
-        <w:t xml:space="preserve">Return Shuttle to Zhangjiajie West</w:t>
-      </w:r>
-      <w:r>
-        <w:rPr>
-          <w:rFonts w:ascii="Calibri" w:cs="Calibri" w:eastAsia="Calibri" w:hAnsi="Calibri"/>
-          <w:color w:val="6B8062"/>
-          <w:sz w:val="20"/>
-          <w:szCs w:val="20"/>
-        </w:rPr>
-        <w:t xml:space="preserve"> — 40 CNY / $5.91 (per person)</w:t>
+        <w:t xml:space="preserve">G2442 High-Speed Train to Chongqing East</w:t>
+      </w:r>
+      <w:r>
+        <w:rPr>
+          <w:rFonts w:ascii="Calibri" w:cs="Calibri" w:eastAsia="Calibri" w:hAnsi="Calibri"/>
+          <w:color w:val="6B8062"/>
+          <w:sz w:val="20"/>
+          <w:szCs w:val="20"/>
+        </w:rPr>
+        <w:t xml:space="preserve"> — 206 CNY / $30.43 (2nd class/person)</w:t>
       </w:r>
     </w:p>
     <w:p>
@@ -5119,7 +5559,7 @@
           <w:sz w:val="20"/>
           <w:szCs w:val="20"/>
         </w:rPr>
-        <w:t xml:space="preserve">Take the return scenic shuttle bus back to Zhangjiajie West Station. 40CNY/5.91USD per person, 40-min ride, arrive at the station at 18:00.</w:t>
+        <w:t xml:space="preserve">G2442 departs Zhangjiajie West Station back to Chongqing East. Travel time 2h 07m, arrive at Chongqing East Station at 22:55 — entire itinerary complete.</w:t>
       </w:r>
     </w:p>
     <w:p>
@@ -5135,7 +5575,7 @@
           <w:sz w:val="22"/>
           <w:szCs w:val="22"/>
         </w:rPr>
-        <w:t xml:space="preserve">20:48</w:t>
+        <w:t xml:space="preserve">23:00</w:t>
       </w:r>
       <w:r>
         <w:rPr>
@@ -5153,16 +5593,16 @@
           <w:sz w:val="22"/>
           <w:szCs w:val="22"/>
         </w:rPr>
-        <w:t xml:space="preserve">G2442 High-Speed Train to Chongqing East</w:t>
-      </w:r>
-      <w:r>
-        <w:rPr>
-          <w:rFonts w:ascii="Calibri" w:cs="Calibri" w:eastAsia="Calibri" w:hAnsi="Calibri"/>
-          <w:color w:val="6B8062"/>
-          <w:sz w:val="20"/>
-          <w:szCs w:val="20"/>
-        </w:rPr>
-        <w:t xml:space="preserve"> — 206 CNY / $30.43 (2nd class/person)</w:t>
+        <w:t xml:space="preserve">Kaiyuan Mingting Hotel</w:t>
+      </w:r>
+      <w:r>
+        <w:rPr>
+          <w:rFonts w:ascii="Calibri" w:cs="Calibri" w:eastAsia="Calibri" w:hAnsi="Calibri"/>
+          <w:color w:val="6B8062"/>
+          <w:sz w:val="20"/>
+          <w:szCs w:val="20"/>
+        </w:rPr>
+        <w:t xml:space="preserve"> — 388 CNY / $57.31 (2-night split)</w:t>
       </w:r>
     </w:p>
     <w:p>
@@ -5177,65 +5617,7 @@
           <w:sz w:val="20"/>
           <w:szCs w:val="20"/>
         </w:rPr>
-        <w:t xml:space="preserve">G2442 departs Zhangjiajie West Station back to Chongqing East. Second-class seat 206CNY/30.43USD per person. Travel time 2h 07m, arrive at Chongqing East Station at 22:55 — entire itinerary complete.</w:t>
-      </w:r>
-    </w:p>
-    <w:p>
-      <w:pPr>
-        <w:spacing w:after="60"/>
-      </w:pPr>
-      <w:r>
-        <w:rPr>
-          <w:rFonts w:ascii="Calibri" w:cs="Calibri" w:eastAsia="Calibri" w:hAnsi="Calibri"/>
-          <w:b/>
-          <w:bCs/>
-          <w:color w:val="7BAE5C"/>
-          <w:sz w:val="22"/>
-          <w:szCs w:val="22"/>
-        </w:rPr>
-        <w:t xml:space="preserve">23:00</w:t>
-      </w:r>
-      <w:r>
-        <w:rPr>
-          <w:sz w:val="22"/>
-          <w:szCs w:val="22"/>
-        </w:rPr>
-        <w:t xml:space="preserve">  </w:t>
-      </w:r>
-      <w:r>
-        <w:rPr>
-          <w:rFonts w:ascii="Calibri" w:cs="Calibri" w:eastAsia="Calibri" w:hAnsi="Calibri"/>
-          <w:b/>
-          <w:bCs/>
-          <w:color w:val="3D5038"/>
-          <w:sz w:val="22"/>
-          <w:szCs w:val="22"/>
-        </w:rPr>
-        <w:t xml:space="preserve">Kaiyuan Mingting Hotel</w:t>
-      </w:r>
-      <w:r>
-        <w:rPr>
-          <w:rFonts w:ascii="Calibri" w:cs="Calibri" w:eastAsia="Calibri" w:hAnsi="Calibri"/>
-          <w:color w:val="6B8062"/>
-          <w:sz w:val="20"/>
-          <w:szCs w:val="20"/>
-        </w:rPr>
-        <w:t xml:space="preserve"> — 388 CNY / $57.31 (2-night split)</w:t>
-      </w:r>
-    </w:p>
-    <w:p>
-      <w:pPr>
-        <w:spacing w:after="120"/>
-        <w:ind w:left="360"/>
-      </w:pPr>
-      <w:r>
-        <w:rPr>
-          <w:rFonts w:ascii="Calibri" w:cs="Calibri" w:eastAsia="Calibri" w:hAnsi="Calibri"/>
-          <w:color w:val="6B8062"/>
-          <w:sz w:val="20"/>
-          <w:szCs w:val="20"/>
-        </w:rPr>
-        <w:t xml:space="preserve">Return to Kaiyuan Mingting Hotel after the day trip. 2-night room split allocated on Day 10: 388CNY/57.31USD total.</w:t>
+        <w:t xml:space="preserve">Return to Kaiyuan Mingting Hotel after the day trip.</w:t>
       </w:r>
     </w:p>
     <w:p>
@@ -6758,7 +7140,7 @@
                 <w:sz w:val="20"/>
                 <w:szCs w:val="20"/>
               </w:rPr>
-              <w:t xml:space="preserve">11</w:t>
+              <w:t xml:space="preserve">20</w:t>
             </w:r>
           </w:p>
         </w:tc>
@@ -6784,7 +7166,7 @@
                 <w:sz w:val="20"/>
                 <w:szCs w:val="20"/>
               </w:rPr>
-              <w:t xml:space="preserve">1.62</w:t>
+              <w:t xml:space="preserve">2.95</w:t>
             </w:r>
           </w:p>
         </w:tc>
@@ -7072,7 +7454,7 @@
                 <w:sz w:val="20"/>
                 <w:szCs w:val="20"/>
               </w:rPr>
-              <w:t xml:space="preserve">864</w:t>
+              <w:t xml:space="preserve">873</w:t>
             </w:r>
           </w:p>
         </w:tc>
@@ -7101,7 +7483,7 @@
                 <w:sz w:val="20"/>
                 <w:szCs w:val="20"/>
               </w:rPr>
-              <w:t xml:space="preserve">127.6</w:t>
+              <w:t xml:space="preserve">128.93</w:t>
             </w:r>
           </w:p>
         </w:tc>
@@ -11189,7 +11571,7 @@
           <w:sz w:val="28"/>
           <w:szCs w:val="28"/>
         </w:rPr>
-        <w:t xml:space="preserve">Grand total (two travelers): 9177 CNY / $1355.43</w:t>
+        <w:t xml:space="preserve">Grand total (two travelers): 9186 CNY / $1356.76</w:t>
       </w:r>
     </w:p>
     <w:p>
@@ -11203,7 +11585,7 @@
           <w:sz w:val="21"/>
           <w:szCs w:val="21"/>
         </w:rPr>
-        <w:t xml:space="preserve">Budget cap 9820 CNY — 643 CNY / $93.98 remaining for optional spending</w:t>
+        <w:t xml:space="preserve">Budget cap 9820 CNY — 634 CNY / $92.65 remaining for optional spending</w:t>
       </w:r>
     </w:p>
     <w:p>

</xml_diff>

<commit_message>
Update right navigation pane
</commit_message>
<xml_diff>
--- a/downloads/itinerary-en.docx
+++ b/downloads/itinerary-en.docx
@@ -855,7 +855,7 @@
           <w:sz w:val="32"/>
           <w:szCs w:val="32"/>
         </w:rPr>
-        <w:t xml:space="preserve">Daily Itinerary D1–D10</w:t>
+        <w:t xml:space="preserve">Daily Itinerary</w:t>
       </w:r>
     </w:p>
     <w:p>
@@ -5657,7 +5657,7 @@
           <w:sz w:val="32"/>
           <w:szCs w:val="32"/>
         </w:rPr>
-        <w:t xml:space="preserve">Key Travel Reminders</w:t>
+        <w:t xml:space="preserve">Travel Tips</w:t>
       </w:r>
     </w:p>
     <w:p>
@@ -5998,7 +5998,7 @@
           <w:sz w:val="32"/>
           <w:szCs w:val="32"/>
         </w:rPr>
-        <w:t xml:space="preserve">Daily Fixed Cost Breakdown</w:t>
+        <w:t xml:space="preserve">Daily Fixed Costs</w:t>
       </w:r>
     </w:p>
     <w:p>
@@ -11620,7 +11620,7 @@
           <w:sz w:val="32"/>
           <w:szCs w:val="32"/>
         </w:rPr>
-        <w:t xml:space="preserve">Optional Self-Paid (not in 9390 CNY)</w:t>
+        <w:t xml:space="preserve">Optional Expenses</w:t>
       </w:r>
     </w:p>
     <w:p>

</xml_diff>

<commit_message>
Revise Where You're Going
</commit_message>
<xml_diff>
--- a/downloads/itinerary-en.docx
+++ b/downloads/itinerary-en.docx
@@ -153,7 +153,7 @@
           <w:sz w:val="21"/>
           <w:szCs w:val="21"/>
         </w:rPr>
-        <w:t xml:space="preserve">• Day 10 fixed Plan B: full-day Wulingyuan National Forest Park</w:t>
+        <w:t xml:space="preserve">• Day 10: full-day Wulingyuan National Forest Park</w:t>
       </w:r>
     </w:p>
     <w:p>
@@ -484,6 +484,2004 @@
           <w:szCs w:val="21"/>
         </w:rPr>
         <w:t xml:space="preserve">Works without VPN. Instant camera translation for menus &amp; museum exhibits.</w:t>
+      </w:r>
+    </w:p>
+    <w:p>
+      <w:pPr>
+        <w:spacing w:after="80"/>
+      </w:pPr>
+    </w:p>
+    <w:p>
+      <w:pPr>
+        <w:pStyle w:val="Heading2"/>
+        <w:shd w:fill="E8F3DC" w:color="6A9B4E" w:val="clear"/>
+        <w:spacing w:after="160" w:before="240"/>
+      </w:pPr>
+      <w:r>
+        <w:rPr>
+          <w:rFonts w:ascii="Calibri" w:cs="Calibri" w:eastAsia="Calibri" w:hAnsi="Calibri"/>
+          <w:b/>
+          <w:bCs/>
+          <w:color w:val="4A7A38"/>
+          <w:sz w:val="32"/>
+          <w:szCs w:val="32"/>
+        </w:rPr>
+        <w:t xml:space="preserve">Where You're Going</w:t>
+      </w:r>
+    </w:p>
+    <w:p>
+      <w:pPr>
+        <w:spacing w:after="160"/>
+      </w:pPr>
+      <w:r>
+        <w:rPr>
+          <w:rFonts w:ascii="Calibri" w:cs="Calibri" w:eastAsia="Calibri" w:hAnsi="Calibri"/>
+          <w:i/>
+          <w:iCs/>
+          <w:color w:val="6B8062"/>
+          <w:sz w:val="20"/>
+          <w:szCs w:val="20"/>
+        </w:rPr>
+        <w:t xml:space="preserve">Rough analogies for American readers — not exact comparisons. In China: a province ≈ a U.S. state; Chengdu is a city; Chongqing is a provincial-level municipality (city plus surrounding counties — not a single city in the American sense). Population figures are approximate.</w:t>
+      </w:r>
+    </w:p>
+    <w:p>
+      <w:pPr>
+        <w:pStyle w:val="Heading3"/>
+        <w:spacing w:after="160" w:before="240"/>
+      </w:pPr>
+      <w:r>
+        <w:rPr>
+          <w:rFonts w:ascii="Calibri" w:cs="Calibri" w:eastAsia="Calibri" w:hAnsi="Calibri"/>
+          <w:b/>
+          <w:bCs/>
+          <w:color w:val="4A7A38"/>
+          <w:sz w:val="26"/>
+          <w:szCs w:val="26"/>
+        </w:rPr>
+        <w:t xml:space="preserve">Sichuan Province</w:t>
+      </w:r>
+    </w:p>
+    <w:p>
+      <w:pPr>
+        <w:spacing w:after="80"/>
+      </w:pPr>
+      <w:r>
+        <w:rPr>
+          <w:rFonts w:ascii="Calibri" w:cs="Calibri" w:eastAsia="Calibri" w:hAnsi="Calibri"/>
+          <w:b/>
+          <w:bCs/>
+          <w:color w:val="4A7A38"/>
+          <w:sz w:val="21"/>
+          <w:szCs w:val="21"/>
+        </w:rPr>
+        <w:t xml:space="preserve">Province · ~83 million people · 3,000+ years of recorded history</w:t>
+      </w:r>
+      <w:r>
+        <w:rPr>
+          <w:sz w:val="21"/>
+          <w:szCs w:val="21"/>
+        </w:rPr>
+        <w:t xml:space="preserve">  </w:t>
+      </w:r>
+      <w:r>
+        <w:rPr>
+          <w:rFonts w:ascii="Calibri" w:cs="Calibri" w:eastAsia="Calibri" w:hAnsi="Calibri"/>
+          <w:color w:val="7BAE5C"/>
+          <w:sz w:val="20"/>
+          <w:szCs w:val="20"/>
+        </w:rPr>
+        <w:t xml:space="preserve">Province vs. state: ~2.5× the population of Texas</w:t>
+      </w:r>
+    </w:p>
+    <w:p>
+      <w:pPr>
+        <w:spacing w:after="80"/>
+      </w:pPr>
+      <w:r>
+        <w:rPr>
+          <w:rFonts w:ascii="Calibri" w:cs="Calibri" w:eastAsia="Calibri" w:hAnsi="Calibri"/>
+          <w:color w:val="3D5038"/>
+          <w:sz w:val="20"/>
+          <w:szCs w:val="20"/>
+        </w:rPr>
+        <w:t xml:space="preserve">Admin level: province (comparable to a U.S. state). The figure below is the whole province — not one city.</w:t>
+      </w:r>
+    </w:p>
+    <w:p>
+      <w:pPr>
+        <w:spacing w:after="100"/>
+      </w:pPr>
+      <w:r>
+        <w:rPr>
+          <w:rFonts w:ascii="Calibri" w:cs="Calibri" w:eastAsia="Calibri" w:hAnsi="Calibri"/>
+          <w:color w:val="3D5038"/>
+          <w:sz w:val="21"/>
+          <w:szCs w:val="21"/>
+        </w:rPr>
+        <w:t xml:space="preserve">Southwest China's most populous province; known as the Land of Abundance (天府之国). A cultural and economic heartland of the upper Yangtze.</w:t>
+      </w:r>
+    </w:p>
+    <w:p>
+      <w:pPr>
+        <w:spacing w:after="60" w:before="100"/>
+      </w:pPr>
+      <w:r>
+        <w:rPr>
+          <w:rFonts w:ascii="Calibri" w:cs="Calibri" w:eastAsia="Calibri" w:hAnsi="Calibri"/>
+          <w:b/>
+          <w:bCs/>
+          <w:color w:val="4A7A38"/>
+          <w:sz w:val="22"/>
+          <w:szCs w:val="22"/>
+        </w:rPr>
+        <w:t xml:space="preserve">Notable titles</w:t>
+      </w:r>
+    </w:p>
+    <w:p>
+      <w:pPr>
+        <w:spacing w:after="80"/>
+      </w:pPr>
+      <w:r>
+        <w:rPr>
+          <w:rFonts w:ascii="Calibri" w:cs="Calibri" w:eastAsia="Calibri" w:hAnsi="Calibri"/>
+          <w:color w:val="3D5038"/>
+          <w:sz w:val="21"/>
+          <w:szCs w:val="21"/>
+        </w:rPr>
+        <w:t xml:space="preserve">• </w:t>
+      </w:r>
+      <w:r>
+        <w:rPr>
+          <w:rFonts w:ascii="Calibri" w:cs="Calibri" w:eastAsia="Calibri" w:hAnsi="Calibri"/>
+          <w:color w:val="3D5038"/>
+          <w:sz w:val="21"/>
+          <w:szCs w:val="21"/>
+        </w:rPr>
+        <w:t xml:space="preserve">5 UNESCO World Heritage sites — among the highest of any Chinese province (tied with Fujian, Henan, and Yunnan; Beijing as a municipality has more)</w:t>
+      </w:r>
+    </w:p>
+    <w:p>
+      <w:pPr>
+        <w:spacing w:after="80"/>
+      </w:pPr>
+      <w:r>
+        <w:rPr>
+          <w:rFonts w:ascii="Calibri" w:cs="Calibri" w:eastAsia="Calibri" w:hAnsi="Calibri"/>
+          <w:color w:val="3D5038"/>
+          <w:sz w:val="21"/>
+          <w:szCs w:val="21"/>
+        </w:rPr>
+        <w:t xml:space="preserve">• </w:t>
+      </w:r>
+      <w:r>
+        <w:rPr>
+          <w:rFonts w:ascii="Calibri" w:cs="Calibri" w:eastAsia="Calibri" w:hAnsi="Calibri"/>
+          <w:color w:val="3D5038"/>
+          <w:sz w:val="21"/>
+          <w:szCs w:val="21"/>
+        </w:rPr>
+        <w:t xml:space="preserve">Sites include Jiuzhaigou, Huanglong, Mount Emei–Leshan Giant Buddha, Qingcheng–Dujiangyan, and Sichuan Giant Panda Sanctuaries — your trip visits </w:t>
+      </w:r>
+      <w:r>
+        <w:rPr>
+          <w:rFonts w:ascii="Calibri" w:cs="Calibri" w:eastAsia="Calibri" w:hAnsi="Calibri"/>
+          <w:b/>
+          <w:bCs/>
+          <w:color w:val="4A7A38"/>
+          <w:sz w:val="21"/>
+          <w:szCs w:val="21"/>
+        </w:rPr>
+        <w:t xml:space="preserve">Jiuzhaigou</w:t>
+      </w:r>
+      <w:r>
+        <w:rPr>
+          <w:rFonts w:ascii="Calibri" w:cs="Calibri" w:eastAsia="Calibri" w:hAnsi="Calibri"/>
+          <w:color w:val="7BAE5C"/>
+          <w:sz w:val="20"/>
+          <w:szCs w:val="20"/>
+        </w:rPr>
+        <w:t xml:space="preserve"> (Day 5)</w:t>
+      </w:r>
+    </w:p>
+    <w:p>
+      <w:pPr>
+        <w:spacing w:after="80"/>
+      </w:pPr>
+      <w:r>
+        <w:rPr>
+          <w:rFonts w:ascii="Calibri" w:cs="Calibri" w:eastAsia="Calibri" w:hAnsi="Calibri"/>
+          <w:color w:val="3D5038"/>
+          <w:sz w:val="21"/>
+          <w:szCs w:val="21"/>
+        </w:rPr>
+        <w:t xml:space="preserve">• </w:t>
+      </w:r>
+      <w:r>
+        <w:rPr>
+          <w:rFonts w:ascii="Calibri" w:cs="Calibri" w:eastAsia="Calibri" w:hAnsi="Calibri"/>
+          <w:color w:val="3D5038"/>
+          <w:sz w:val="21"/>
+          <w:szCs w:val="21"/>
+        </w:rPr>
+        <w:t xml:space="preserve">Land of Abundance (天府之国) — a title used for 2,000+ years</w:t>
+      </w:r>
+    </w:p>
+    <w:p>
+      <w:pPr>
+        <w:spacing w:after="80"/>
+      </w:pPr>
+      <w:r>
+        <w:rPr>
+          <w:rFonts w:ascii="Calibri" w:cs="Calibri" w:eastAsia="Calibri" w:hAnsi="Calibri"/>
+          <w:color w:val="3D5038"/>
+          <w:sz w:val="21"/>
+          <w:szCs w:val="21"/>
+        </w:rPr>
+        <w:t xml:space="preserve">• </w:t>
+      </w:r>
+      <w:r>
+        <w:rPr>
+          <w:rFonts w:ascii="Calibri" w:cs="Calibri" w:eastAsia="Calibri" w:hAnsi="Calibri"/>
+          <w:color w:val="3D5038"/>
+          <w:sz w:val="21"/>
+          <w:szCs w:val="21"/>
+        </w:rPr>
+        <w:t xml:space="preserve">Birthplace of Sichuan cuisine — one of China's Four Great Cuisines</w:t>
+      </w:r>
+    </w:p>
+    <w:p>
+      <w:pPr>
+        <w:spacing w:after="80"/>
+      </w:pPr>
+      <w:r>
+        <w:rPr>
+          <w:rFonts w:ascii="Calibri" w:cs="Calibri" w:eastAsia="Calibri" w:hAnsi="Calibri"/>
+          <w:color w:val="3D5038"/>
+          <w:sz w:val="21"/>
+          <w:szCs w:val="21"/>
+        </w:rPr>
+        <w:t xml:space="preserve">• </w:t>
+      </w:r>
+      <w:r>
+        <w:rPr>
+          <w:rFonts w:ascii="Calibri" w:cs="Calibri" w:eastAsia="Calibri" w:hAnsi="Calibri"/>
+          <w:color w:val="3D5038"/>
+          <w:sz w:val="21"/>
+          <w:szCs w:val="21"/>
+        </w:rPr>
+        <w:t xml:space="preserve">Heartland of the giant panda — world's largest panda habitat network</w:t>
+      </w:r>
+    </w:p>
+    <w:p>
+      <w:pPr>
+        <w:spacing w:after="60" w:before="100"/>
+      </w:pPr>
+      <w:r>
+        <w:rPr>
+          <w:rFonts w:ascii="Calibri" w:cs="Calibri" w:eastAsia="Calibri" w:hAnsi="Calibri"/>
+          <w:b/>
+          <w:bCs/>
+          <w:color w:val="4A7A38"/>
+          <w:sz w:val="22"/>
+          <w:szCs w:val="22"/>
+        </w:rPr>
+        <w:t xml:space="preserve">U.S. mental map</w:t>
+      </w:r>
+    </w:p>
+    <w:p>
+      <w:pPr>
+        <w:shd w:fill="E8F3DC" w:val="clear"/>
+        <w:spacing w:after="100"/>
+      </w:pPr>
+      <w:r>
+        <w:rPr>
+          <w:rFonts w:ascii="Calibri" w:cs="Calibri" w:eastAsia="Calibri" w:hAnsi="Calibri"/>
+          <w:color w:val="3D5038"/>
+          <w:sz w:val="21"/>
+          <w:szCs w:val="21"/>
+        </w:rPr>
+        <w:t xml:space="preserve">Regional identity as strong as Texas or Louisiana in the U.S. — distinct food, dialect, and pace that the whole country recognizes.</w:t>
+      </w:r>
+    </w:p>
+    <w:p>
+      <w:pPr>
+        <w:spacing w:after="60" w:before="100"/>
+      </w:pPr>
+      <w:r>
+        <w:rPr>
+          <w:rFonts w:ascii="Calibri" w:cs="Calibri" w:eastAsia="Calibri" w:hAnsi="Calibri"/>
+          <w:b/>
+          <w:bCs/>
+          <w:color w:val="4A7A38"/>
+          <w:sz w:val="22"/>
+          <w:szCs w:val="22"/>
+        </w:rPr>
+        <w:t xml:space="preserve">History highlights</w:t>
+      </w:r>
+    </w:p>
+    <w:p>
+      <w:pPr>
+        <w:spacing w:after="100"/>
+      </w:pPr>
+      <w:r>
+        <w:rPr>
+          <w:rFonts w:ascii="Calibri" w:cs="Calibri" w:eastAsia="Calibri" w:hAnsi="Calibri"/>
+          <w:color w:val="3D5038"/>
+          <w:sz w:val="21"/>
+          <w:szCs w:val="21"/>
+        </w:rPr>
+        <w:t xml:space="preserve">Ancient Ba-Shu kingdoms; Three Kingdoms-era Shu Han (蜀汉); major WWII rear base. The 256 BCE Dujiangyan irrigation system still feeds the Chengdu Plain.</w:t>
+      </w:r>
+    </w:p>
+    <w:p>
+      <w:pPr>
+        <w:spacing w:after="60" w:before="100"/>
+      </w:pPr>
+      <w:r>
+        <w:rPr>
+          <w:rFonts w:ascii="Calibri" w:cs="Calibri" w:eastAsia="Calibri" w:hAnsi="Calibri"/>
+          <w:b/>
+          <w:bCs/>
+          <w:color w:val="4A7A38"/>
+          <w:sz w:val="22"/>
+          <w:szCs w:val="22"/>
+        </w:rPr>
+        <w:t xml:space="preserve">Known for &amp; firsts</w:t>
+      </w:r>
+    </w:p>
+    <w:p>
+      <w:pPr>
+        <w:spacing w:after="80"/>
+      </w:pPr>
+      <w:r>
+        <w:rPr>
+          <w:rFonts w:ascii="Calibri" w:cs="Calibri" w:eastAsia="Calibri" w:hAnsi="Calibri"/>
+          <w:color w:val="3D5038"/>
+          <w:sz w:val="21"/>
+          <w:szCs w:val="21"/>
+        </w:rPr>
+        <w:t xml:space="preserve">• </w:t>
+      </w:r>
+      <w:r>
+        <w:rPr>
+          <w:rFonts w:ascii="Calibri" w:cs="Calibri" w:eastAsia="Calibri" w:hAnsi="Calibri"/>
+          <w:color w:val="3D5038"/>
+          <w:sz w:val="21"/>
+          <w:szCs w:val="21"/>
+        </w:rPr>
+        <w:t xml:space="preserve">Jiaozi (交子) — often cited as the world's first paper money, issued by Chengdu merchants in the 11th century</w:t>
+      </w:r>
+    </w:p>
+    <w:p>
+      <w:pPr>
+        <w:spacing w:after="80"/>
+      </w:pPr>
+      <w:r>
+        <w:rPr>
+          <w:rFonts w:ascii="Calibri" w:cs="Calibri" w:eastAsia="Calibri" w:hAnsi="Calibri"/>
+          <w:color w:val="3D5038"/>
+          <w:sz w:val="21"/>
+          <w:szCs w:val="21"/>
+        </w:rPr>
+        <w:t xml:space="preserve">• </w:t>
+      </w:r>
+      <w:r>
+        <w:rPr>
+          <w:rFonts w:ascii="Calibri" w:cs="Calibri" w:eastAsia="Calibri" w:hAnsi="Calibri"/>
+          <w:color w:val="3D5038"/>
+          <w:sz w:val="21"/>
+          <w:szCs w:val="21"/>
+        </w:rPr>
+        <w:t xml:space="preserve">Dujiangyan — ancient irrigation masterpiece, still operating after 2,200+ years</w:t>
+      </w:r>
+    </w:p>
+    <w:p>
+      <w:pPr>
+        <w:spacing w:after="80"/>
+      </w:pPr>
+      <w:r>
+        <w:rPr>
+          <w:rFonts w:ascii="Calibri" w:cs="Calibri" w:eastAsia="Calibri" w:hAnsi="Calibri"/>
+          <w:color w:val="3D5038"/>
+          <w:sz w:val="21"/>
+          <w:szCs w:val="21"/>
+        </w:rPr>
+        <w:t xml:space="preserve">• </w:t>
+      </w:r>
+      <w:r>
+        <w:rPr>
+          <w:rFonts w:ascii="Calibri" w:cs="Calibri" w:eastAsia="Calibri" w:hAnsi="Calibri"/>
+          <w:color w:val="3D5038"/>
+          <w:sz w:val="21"/>
+          <w:szCs w:val="21"/>
+        </w:rPr>
+        <w:t xml:space="preserve">Sichuan cuisine — birthplace of mapo tofu, kung pao chicken, and hot-pot traditions that spread nationwide</w:t>
+      </w:r>
+    </w:p>
+    <w:p>
+      <w:pPr>
+        <w:spacing w:after="80"/>
+      </w:pPr>
+      <w:r>
+        <w:rPr>
+          <w:rFonts w:ascii="Calibri" w:cs="Calibri" w:eastAsia="Calibri" w:hAnsi="Calibri"/>
+          <w:color w:val="3D5038"/>
+          <w:sz w:val="21"/>
+          <w:szCs w:val="21"/>
+        </w:rPr>
+        <w:t xml:space="preserve">• </w:t>
+      </w:r>
+      <w:r>
+        <w:rPr>
+          <w:rFonts w:ascii="Calibri" w:cs="Calibri" w:eastAsia="Calibri" w:hAnsi="Calibri"/>
+          <w:color w:val="3D5038"/>
+          <w:sz w:val="21"/>
+          <w:szCs w:val="21"/>
+        </w:rPr>
+        <w:t xml:space="preserve">Shu brocade (蜀锦) — prized silk weaving since Han-dynasty trade along the Silk Road</w:t>
+      </w:r>
+    </w:p>
+    <w:p>
+      <w:pPr>
+        <w:spacing w:after="80"/>
+      </w:pPr>
+      <w:r>
+        <w:rPr>
+          <w:rFonts w:ascii="Calibri" w:cs="Calibri" w:eastAsia="Calibri" w:hAnsi="Calibri"/>
+          <w:color w:val="3D5038"/>
+          <w:sz w:val="21"/>
+          <w:szCs w:val="21"/>
+        </w:rPr>
+        <w:t xml:space="preserve">• </w:t>
+      </w:r>
+      <w:r>
+        <w:rPr>
+          <w:rFonts w:ascii="Calibri" w:cs="Calibri" w:eastAsia="Calibri" w:hAnsi="Calibri"/>
+          <w:color w:val="3D5038"/>
+          <w:sz w:val="21"/>
+          <w:szCs w:val="21"/>
+        </w:rPr>
+        <w:t xml:space="preserve">Shu embroidery (蜀绣) — one of China's Four Great Embroideries; needlework tradition centered in the Chengdu plain</w:t>
+      </w:r>
+    </w:p>
+    <w:p>
+      <w:pPr>
+        <w:spacing w:after="80"/>
+      </w:pPr>
+      <w:r>
+        <w:rPr>
+          <w:rFonts w:ascii="Calibri" w:cs="Calibri" w:eastAsia="Calibri" w:hAnsi="Calibri"/>
+          <w:color w:val="3D5038"/>
+          <w:sz w:val="21"/>
+          <w:szCs w:val="21"/>
+        </w:rPr>
+        <w:t xml:space="preserve">• </w:t>
+      </w:r>
+      <w:r>
+        <w:rPr>
+          <w:rFonts w:ascii="Calibri" w:cs="Calibri" w:eastAsia="Calibri" w:hAnsi="Calibri"/>
+          <w:color w:val="3D5038"/>
+          <w:sz w:val="21"/>
+          <w:szCs w:val="21"/>
+        </w:rPr>
+        <w:t xml:space="preserve">Zigong well salt (自贡井盐) — 2,000+ years of brine-well drilling; pioneers of deep-well salt mining and early natural-gas use</w:t>
+      </w:r>
+    </w:p>
+    <w:p>
+      <w:pPr>
+        <w:spacing w:after="60" w:before="100"/>
+      </w:pPr>
+      <w:r>
+        <w:rPr>
+          <w:rFonts w:ascii="Calibri" w:cs="Calibri" w:eastAsia="Calibri" w:hAnsi="Calibri"/>
+          <w:b/>
+          <w:bCs/>
+          <w:color w:val="4A7A38"/>
+          <w:sz w:val="22"/>
+          <w:szCs w:val="22"/>
+        </w:rPr>
+        <w:t xml:space="preserve">On your itinerary</w:t>
+      </w:r>
+    </w:p>
+    <w:p>
+      <w:pPr>
+        <w:spacing w:after="200"/>
+      </w:pPr>
+      <w:r>
+        <w:rPr>
+          <w:rFonts w:ascii="Calibri" w:cs="Calibri" w:eastAsia="Calibri" w:hAnsi="Calibri"/>
+          <w:color w:val="3D5038"/>
+          <w:sz w:val="21"/>
+          <w:szCs w:val="21"/>
+        </w:rPr>
+        <w:t xml:space="preserve">Your trip: </w:t>
+      </w:r>
+      <w:r>
+        <w:rPr>
+          <w:rFonts w:ascii="Calibri" w:cs="Calibri" w:eastAsia="Calibri" w:hAnsi="Calibri"/>
+          <w:b/>
+          <w:bCs/>
+          <w:color w:val="4A7A38"/>
+          <w:sz w:val="21"/>
+          <w:szCs w:val="21"/>
+        </w:rPr>
+        <w:t xml:space="preserve">Chengdu hub</w:t>
+      </w:r>
+      <w:r>
+        <w:rPr>
+          <w:rFonts w:ascii="Calibri" w:cs="Calibri" w:eastAsia="Calibri" w:hAnsi="Calibri"/>
+          <w:color w:val="7BAE5C"/>
+          <w:sz w:val="20"/>
+          <w:szCs w:val="20"/>
+        </w:rPr>
+        <w:t xml:space="preserve"> (Day 1)</w:t>
+      </w:r>
+      <w:r>
+        <w:rPr>
+          <w:rFonts w:ascii="Calibri" w:cs="Calibri" w:eastAsia="Calibri" w:hAnsi="Calibri"/>
+          <w:color w:val="3D5038"/>
+          <w:sz w:val="21"/>
+          <w:szCs w:val="21"/>
+        </w:rPr>
+        <w:t xml:space="preserve"> (Days 1–3, 6), </w:t>
+      </w:r>
+      <w:r>
+        <w:rPr>
+          <w:rFonts w:ascii="Calibri" w:cs="Calibri" w:eastAsia="Calibri" w:hAnsi="Calibri"/>
+          <w:b/>
+          <w:bCs/>
+          <w:color w:val="4A7A38"/>
+          <w:sz w:val="21"/>
+          <w:szCs w:val="21"/>
+        </w:rPr>
+        <w:t xml:space="preserve">Jiuzhaigou</w:t>
+      </w:r>
+      <w:r>
+        <w:rPr>
+          <w:rFonts w:ascii="Calibri" w:cs="Calibri" w:eastAsia="Calibri" w:hAnsi="Calibri"/>
+          <w:color w:val="7BAE5C"/>
+          <w:sz w:val="20"/>
+          <w:szCs w:val="20"/>
+        </w:rPr>
+        <w:t xml:space="preserve"> (Day 5)</w:t>
+      </w:r>
+      <w:r>
+        <w:rPr>
+          <w:rFonts w:ascii="Calibri" w:cs="Calibri" w:eastAsia="Calibri" w:hAnsi="Calibri"/>
+          <w:color w:val="3D5038"/>
+          <w:sz w:val="21"/>
+          <w:szCs w:val="21"/>
+        </w:rPr>
+        <w:t xml:space="preserve"> (Days 4–5), </w:t>
+      </w:r>
+      <w:r>
+        <w:rPr>
+          <w:rFonts w:ascii="Calibri" w:cs="Calibri" w:eastAsia="Calibri" w:hAnsi="Calibri"/>
+          <w:b/>
+          <w:bCs/>
+          <w:color w:val="4A7A38"/>
+          <w:sz w:val="21"/>
+          <w:szCs w:val="21"/>
+        </w:rPr>
+        <w:t xml:space="preserve">Sichuan Museum</w:t>
+      </w:r>
+      <w:r>
+        <w:rPr>
+          <w:rFonts w:ascii="Calibri" w:cs="Calibri" w:eastAsia="Calibri" w:hAnsi="Calibri"/>
+          <w:color w:val="7BAE5C"/>
+          <w:sz w:val="20"/>
+          <w:szCs w:val="20"/>
+        </w:rPr>
+        <w:t xml:space="preserve"> (Day 7)</w:t>
+      </w:r>
+      <w:r>
+        <w:rPr>
+          <w:rFonts w:ascii="Calibri" w:cs="Calibri" w:eastAsia="Calibri" w:hAnsi="Calibri"/>
+          <w:color w:val="3D5038"/>
+          <w:sz w:val="21"/>
+          <w:szCs w:val="21"/>
+        </w:rPr>
+        <w:t xml:space="preserve"> &amp; </w:t>
+      </w:r>
+      <w:r>
+        <w:rPr>
+          <w:rFonts w:ascii="Calibri" w:cs="Calibri" w:eastAsia="Calibri" w:hAnsi="Calibri"/>
+          <w:b/>
+          <w:bCs/>
+          <w:color w:val="4A7A38"/>
+          <w:sz w:val="21"/>
+          <w:szCs w:val="21"/>
+        </w:rPr>
+        <w:t xml:space="preserve">Chengdu Museum</w:t>
+      </w:r>
+      <w:r>
+        <w:rPr>
+          <w:rFonts w:ascii="Calibri" w:cs="Calibri" w:eastAsia="Calibri" w:hAnsi="Calibri"/>
+          <w:color w:val="7BAE5C"/>
+          <w:sz w:val="20"/>
+          <w:szCs w:val="20"/>
+        </w:rPr>
+        <w:t xml:space="preserve"> (Day 7)</w:t>
+      </w:r>
+      <w:r>
+        <w:rPr>
+          <w:rFonts w:ascii="Calibri" w:cs="Calibri" w:eastAsia="Calibri" w:hAnsi="Calibri"/>
+          <w:color w:val="3D5038"/>
+          <w:sz w:val="21"/>
+          <w:szCs w:val="21"/>
+        </w:rPr>
+        <w:t xml:space="preserve"> en route to Chongqing (Day 7).</w:t>
+      </w:r>
+    </w:p>
+    <w:p>
+      <w:pPr>
+        <w:pStyle w:val="Heading3"/>
+        <w:spacing w:after="160" w:before="240"/>
+      </w:pPr>
+      <w:r>
+        <w:rPr>
+          <w:rFonts w:ascii="Calibri" w:cs="Calibri" w:eastAsia="Calibri" w:hAnsi="Calibri"/>
+          <w:b/>
+          <w:bCs/>
+          <w:color w:val="4A7A38"/>
+          <w:sz w:val="26"/>
+          <w:szCs w:val="26"/>
+        </w:rPr>
+        <w:t xml:space="preserve">Chengdu City</w:t>
+      </w:r>
+    </w:p>
+    <w:p>
+      <w:pPr>
+        <w:spacing w:after="80"/>
+      </w:pPr>
+      <w:r>
+        <w:rPr>
+          <w:rFonts w:ascii="Calibri" w:cs="Calibri" w:eastAsia="Calibri" w:hAnsi="Calibri"/>
+          <w:b/>
+          <w:bCs/>
+          <w:color w:val="4A7A38"/>
+          <w:sz w:val="21"/>
+          <w:szCs w:val="21"/>
+        </w:rPr>
+        <w:t xml:space="preserve">City · ~21 million (greater metro area) · 2,300+ years at the same city site</w:t>
+      </w:r>
+      <w:r>
+        <w:rPr>
+          <w:sz w:val="21"/>
+          <w:szCs w:val="21"/>
+        </w:rPr>
+        <w:t xml:space="preserve">  </w:t>
+      </w:r>
+      <w:r>
+        <w:rPr>
+          <w:rFonts w:ascii="Calibri" w:cs="Calibri" w:eastAsia="Calibri" w:hAnsi="Calibri"/>
+          <w:color w:val="7BAE5C"/>
+          <w:sz w:val="20"/>
+          <w:szCs w:val="20"/>
+        </w:rPr>
+        <w:t xml:space="preserve">City metro area ≈ NYC + Philadelphia combined (not a state comparison)</w:t>
+      </w:r>
+    </w:p>
+    <w:p>
+      <w:pPr>
+        <w:spacing w:after="80"/>
+      </w:pPr>
+      <w:r>
+        <w:rPr>
+          <w:rFonts w:ascii="Calibri" w:cs="Calibri" w:eastAsia="Calibri" w:hAnsi="Calibri"/>
+          <w:color w:val="3D5038"/>
+          <w:sz w:val="20"/>
+          <w:szCs w:val="20"/>
+        </w:rPr>
+        <w:t xml:space="preserve">Admin level: city (prefecture-level). The ~21 million figure is the greater Chengdu metro area — a city region, not a U.S. state.</w:t>
+      </w:r>
+    </w:p>
+    <w:p>
+      <w:pPr>
+        <w:spacing w:after="100"/>
+      </w:pPr>
+      <w:r>
+        <w:rPr>
+          <w:rFonts w:ascii="Calibri" w:cs="Calibri" w:eastAsia="Calibri" w:hAnsi="Calibri"/>
+          <w:color w:val="3D5038"/>
+          <w:sz w:val="21"/>
+          <w:szCs w:val="21"/>
+        </w:rPr>
+        <w:t xml:space="preserve">Southwest China's tech, trade, and leisure hub; one of China's most visited inland cities. Nicknamed the City of Hibiscus (蓉城).</w:t>
+      </w:r>
+    </w:p>
+    <w:p>
+      <w:pPr>
+        <w:spacing w:after="60" w:before="100"/>
+      </w:pPr>
+      <w:r>
+        <w:rPr>
+          <w:rFonts w:ascii="Calibri" w:cs="Calibri" w:eastAsia="Calibri" w:hAnsi="Calibri"/>
+          <w:b/>
+          <w:bCs/>
+          <w:color w:val="4A7A38"/>
+          <w:sz w:val="22"/>
+          <w:szCs w:val="22"/>
+        </w:rPr>
+        <w:t xml:space="preserve">Notable titles</w:t>
+      </w:r>
+    </w:p>
+    <w:p>
+      <w:pPr>
+        <w:spacing w:after="80"/>
+      </w:pPr>
+      <w:r>
+        <w:rPr>
+          <w:rFonts w:ascii="Calibri" w:cs="Calibri" w:eastAsia="Calibri" w:hAnsi="Calibri"/>
+          <w:color w:val="3D5038"/>
+          <w:sz w:val="21"/>
+          <w:szCs w:val="21"/>
+        </w:rPr>
+        <w:t xml:space="preserve">• </w:t>
+      </w:r>
+      <w:r>
+        <w:rPr>
+          <w:rFonts w:ascii="Calibri" w:cs="Calibri" w:eastAsia="Calibri" w:hAnsi="Calibri"/>
+          <w:color w:val="3D5038"/>
+          <w:sz w:val="21"/>
+          <w:szCs w:val="21"/>
+        </w:rPr>
+        <w:t xml:space="preserve">First UNESCO City of Gastronomy in Asia (2010) — member of UNESCO's Creative Cities Network (City of Gastronomy category)</w:t>
+      </w:r>
+    </w:p>
+    <w:p>
+      <w:pPr>
+        <w:spacing w:after="80"/>
+      </w:pPr>
+      <w:r>
+        <w:rPr>
+          <w:rFonts w:ascii="Calibri" w:cs="Calibri" w:eastAsia="Calibri" w:hAnsi="Calibri"/>
+          <w:color w:val="3D5038"/>
+          <w:sz w:val="21"/>
+          <w:szCs w:val="21"/>
+        </w:rPr>
+        <w:t xml:space="preserve">• </w:t>
+      </w:r>
+      <w:r>
+        <w:rPr>
+          <w:rFonts w:ascii="Calibri" w:cs="Calibri" w:eastAsia="Calibri" w:hAnsi="Calibri"/>
+          <w:color w:val="3D5038"/>
+          <w:sz w:val="21"/>
+          <w:szCs w:val="21"/>
+        </w:rPr>
+        <w:t xml:space="preserve">Cradle of Sichuan cuisine — recognized globally by UNESCO for living food culture</w:t>
+      </w:r>
+    </w:p>
+    <w:p>
+      <w:pPr>
+        <w:spacing w:after="80"/>
+      </w:pPr>
+      <w:r>
+        <w:rPr>
+          <w:rFonts w:ascii="Calibri" w:cs="Calibri" w:eastAsia="Calibri" w:hAnsi="Calibri"/>
+          <w:color w:val="3D5038"/>
+          <w:sz w:val="21"/>
+          <w:szCs w:val="21"/>
+        </w:rPr>
+        <w:t xml:space="preserve">• </w:t>
+      </w:r>
+      <w:r>
+        <w:rPr>
+          <w:rFonts w:ascii="Calibri" w:cs="Calibri" w:eastAsia="Calibri" w:hAnsi="Calibri"/>
+          <w:color w:val="3D5038"/>
+          <w:sz w:val="21"/>
+          <w:szCs w:val="21"/>
+        </w:rPr>
+        <w:t xml:space="preserve">Important central city of western China (西部地区重要的中心城市) — leading urban hub of China's west</w:t>
+      </w:r>
+    </w:p>
+    <w:p>
+      <w:pPr>
+        <w:spacing w:after="80"/>
+      </w:pPr>
+      <w:r>
+        <w:rPr>
+          <w:rFonts w:ascii="Calibri" w:cs="Calibri" w:eastAsia="Calibri" w:hAnsi="Calibri"/>
+          <w:color w:val="3D5038"/>
+          <w:sz w:val="21"/>
+          <w:szCs w:val="21"/>
+        </w:rPr>
+        <w:t xml:space="preserve">• </w:t>
+      </w:r>
+      <w:r>
+        <w:rPr>
+          <w:rFonts w:ascii="Calibri" w:cs="Calibri" w:eastAsia="Calibri" w:hAnsi="Calibri"/>
+          <w:color w:val="3D5038"/>
+          <w:sz w:val="21"/>
+          <w:szCs w:val="21"/>
+        </w:rPr>
+        <w:t xml:space="preserve">Named a Best Tourist City in China by the UN World Tourism Organization and China National Tourism Administration</w:t>
+      </w:r>
+    </w:p>
+    <w:p>
+      <w:pPr>
+        <w:spacing w:after="80"/>
+      </w:pPr>
+      <w:r>
+        <w:rPr>
+          <w:rFonts w:ascii="Calibri" w:cs="Calibri" w:eastAsia="Calibri" w:hAnsi="Calibri"/>
+          <w:color w:val="3D5038"/>
+          <w:sz w:val="21"/>
+          <w:szCs w:val="21"/>
+        </w:rPr>
+        <w:t xml:space="preserve">• </w:t>
+      </w:r>
+      <w:r>
+        <w:rPr>
+          <w:rFonts w:ascii="Calibri" w:cs="Calibri" w:eastAsia="Calibri" w:hAnsi="Calibri"/>
+          <w:color w:val="3D5038"/>
+          <w:sz w:val="21"/>
+          <w:szCs w:val="21"/>
+        </w:rPr>
+        <w:t xml:space="preserve">Member, World Centers of Excellence for Destinations (CED)</w:t>
+      </w:r>
+    </w:p>
+    <w:p>
+      <w:pPr>
+        <w:spacing w:after="60" w:before="100"/>
+      </w:pPr>
+      <w:r>
+        <w:rPr>
+          <w:rFonts w:ascii="Calibri" w:cs="Calibri" w:eastAsia="Calibri" w:hAnsi="Calibri"/>
+          <w:b/>
+          <w:bCs/>
+          <w:color w:val="4A7A38"/>
+          <w:sz w:val="22"/>
+          <w:szCs w:val="22"/>
+        </w:rPr>
+        <w:t xml:space="preserve">U.S. mental map</w:t>
+      </w:r>
+    </w:p>
+    <w:p>
+      <w:pPr>
+        <w:shd w:fill="E8F3DC" w:val="clear"/>
+        <w:spacing w:after="100"/>
+      </w:pPr>
+      <w:r>
+        <w:rPr>
+          <w:rFonts w:ascii="Calibri" w:cs="Calibri" w:eastAsia="Calibri" w:hAnsi="Calibri"/>
+          <w:color w:val="3D5038"/>
+          <w:sz w:val="21"/>
+          <w:szCs w:val="21"/>
+        </w:rPr>
+        <w:t xml:space="preserve">A western China lifestyle capital — less Wall Street hustle, more food, tea houses, and pandas — similar to how Portland or Austin lean into "live well" over "move fast."</w:t>
+      </w:r>
+    </w:p>
+    <w:p>
+      <w:pPr>
+        <w:spacing w:after="60" w:before="100"/>
+      </w:pPr>
+      <w:r>
+        <w:rPr>
+          <w:rFonts w:ascii="Calibri" w:cs="Calibri" w:eastAsia="Calibri" w:hAnsi="Calibri"/>
+          <w:b/>
+          <w:bCs/>
+          <w:color w:val="4A7A38"/>
+          <w:sz w:val="22"/>
+          <w:szCs w:val="22"/>
+        </w:rPr>
+        <w:t xml:space="preserve">History highlights</w:t>
+      </w:r>
+    </w:p>
+    <w:p>
+      <w:pPr>
+        <w:spacing w:after="100"/>
+      </w:pPr>
+      <w:r>
+        <w:rPr>
+          <w:rFonts w:ascii="Calibri" w:cs="Calibri" w:eastAsia="Calibri" w:hAnsi="Calibri"/>
+          <w:color w:val="3D5038"/>
+          <w:sz w:val="21"/>
+          <w:szCs w:val="21"/>
+        </w:rPr>
+        <w:t xml:space="preserve">From Jinsha and Sanxingdui roots to Tang–Song "Brocade City." One of the few major world cities that never relocated its urban core.</w:t>
+      </w:r>
+    </w:p>
+    <w:p>
+      <w:pPr>
+        <w:spacing w:after="60" w:before="100"/>
+      </w:pPr>
+      <w:r>
+        <w:rPr>
+          <w:rFonts w:ascii="Calibri" w:cs="Calibri" w:eastAsia="Calibri" w:hAnsi="Calibri"/>
+          <w:b/>
+          <w:bCs/>
+          <w:color w:val="4A7A38"/>
+          <w:sz w:val="22"/>
+          <w:szCs w:val="22"/>
+        </w:rPr>
+        <w:t xml:space="preserve">Known for &amp; firsts</w:t>
+      </w:r>
+    </w:p>
+    <w:p>
+      <w:pPr>
+        <w:spacing w:after="80"/>
+      </w:pPr>
+      <w:r>
+        <w:rPr>
+          <w:rFonts w:ascii="Calibri" w:cs="Calibri" w:eastAsia="Calibri" w:hAnsi="Calibri"/>
+          <w:color w:val="3D5038"/>
+          <w:sz w:val="21"/>
+          <w:szCs w:val="21"/>
+        </w:rPr>
+        <w:t xml:space="preserve">• </w:t>
+      </w:r>
+      <w:r>
+        <w:rPr>
+          <w:rFonts w:ascii="Calibri" w:cs="Calibri" w:eastAsia="Calibri" w:hAnsi="Calibri"/>
+          <w:color w:val="3D5038"/>
+          <w:sz w:val="21"/>
+          <w:szCs w:val="21"/>
+        </w:rPr>
+        <w:t xml:space="preserve">Birthplace of Jiaozi paper money and a Song-dynasty printing &amp; commerce center</w:t>
+      </w:r>
+    </w:p>
+    <w:p>
+      <w:pPr>
+        <w:spacing w:after="80"/>
+      </w:pPr>
+      <w:r>
+        <w:rPr>
+          <w:rFonts w:ascii="Calibri" w:cs="Calibri" w:eastAsia="Calibri" w:hAnsi="Calibri"/>
+          <w:color w:val="3D5038"/>
+          <w:sz w:val="21"/>
+          <w:szCs w:val="21"/>
+        </w:rPr>
+        <w:t xml:space="preserve">• </w:t>
+      </w:r>
+      <w:r>
+        <w:rPr>
+          <w:rFonts w:ascii="Calibri" w:cs="Calibri" w:eastAsia="Calibri" w:hAnsi="Calibri"/>
+          <w:color w:val="3D5038"/>
+          <w:sz w:val="21"/>
+          <w:szCs w:val="21"/>
+        </w:rPr>
+        <w:t xml:space="preserve">Sichuan opera </w:t>
+      </w:r>
+      <w:r>
+        <w:rPr>
+          <w:rFonts w:ascii="Calibri" w:cs="Calibri" w:eastAsia="Calibri" w:hAnsi="Calibri"/>
+          <w:b/>
+          <w:bCs/>
+          <w:color w:val="4A7A38"/>
+          <w:sz w:val="21"/>
+          <w:szCs w:val="21"/>
+        </w:rPr>
+        <w:t xml:space="preserve">face-changing (变脸)</w:t>
+      </w:r>
+      <w:r>
+        <w:rPr>
+          <w:rFonts w:ascii="Calibri" w:cs="Calibri" w:eastAsia="Calibri" w:hAnsi="Calibri"/>
+          <w:color w:val="7BAE5C"/>
+          <w:sz w:val="20"/>
+          <w:szCs w:val="20"/>
+        </w:rPr>
+        <w:t xml:space="preserve"> (Day 2)</w:t>
+      </w:r>
+      <w:r>
+        <w:rPr>
+          <w:rFonts w:ascii="Calibri" w:cs="Calibri" w:eastAsia="Calibri" w:hAnsi="Calibri"/>
+          <w:color w:val="3D5038"/>
+          <w:sz w:val="21"/>
+          <w:szCs w:val="21"/>
+        </w:rPr>
+        <w:t xml:space="preserve"> — iconic performing-arts innovation</w:t>
+      </w:r>
+    </w:p>
+    <w:p>
+      <w:pPr>
+        <w:spacing w:after="80"/>
+      </w:pPr>
+      <w:r>
+        <w:rPr>
+          <w:rFonts w:ascii="Calibri" w:cs="Calibri" w:eastAsia="Calibri" w:hAnsi="Calibri"/>
+          <w:color w:val="3D5038"/>
+          <w:sz w:val="21"/>
+          <w:szCs w:val="21"/>
+        </w:rPr>
+        <w:t xml:space="preserve">• </w:t>
+      </w:r>
+      <w:r>
+        <w:rPr>
+          <w:rFonts w:ascii="Calibri" w:cs="Calibri" w:eastAsia="Calibri" w:hAnsi="Calibri"/>
+          <w:color w:val="3D5038"/>
+          <w:sz w:val="21"/>
+          <w:szCs w:val="21"/>
+        </w:rPr>
+        <w:t xml:space="preserve">World center for </w:t>
+      </w:r>
+      <w:r>
+        <w:rPr>
+          <w:rFonts w:ascii="Calibri" w:cs="Calibri" w:eastAsia="Calibri" w:hAnsi="Calibri"/>
+          <w:b/>
+          <w:bCs/>
+          <w:color w:val="4A7A38"/>
+          <w:sz w:val="21"/>
+          <w:szCs w:val="21"/>
+        </w:rPr>
+        <w:t xml:space="preserve">giant panda breeding</w:t>
+      </w:r>
+      <w:r>
+        <w:rPr>
+          <w:rFonts w:ascii="Calibri" w:cs="Calibri" w:eastAsia="Calibri" w:hAnsi="Calibri"/>
+          <w:color w:val="7BAE5C"/>
+          <w:sz w:val="20"/>
+          <w:szCs w:val="20"/>
+        </w:rPr>
+        <w:t xml:space="preserve"> (Day 1)</w:t>
+      </w:r>
+      <w:r>
+        <w:rPr>
+          <w:rFonts w:ascii="Calibri" w:cs="Calibri" w:eastAsia="Calibri" w:hAnsi="Calibri"/>
+          <w:color w:val="3D5038"/>
+          <w:sz w:val="21"/>
+          <w:szCs w:val="21"/>
+        </w:rPr>
+        <w:t xml:space="preserve"> and conservation research</w:t>
+      </w:r>
+    </w:p>
+    <w:p>
+      <w:pPr>
+        <w:spacing w:after="80"/>
+      </w:pPr>
+      <w:r>
+        <w:rPr>
+          <w:rFonts w:ascii="Calibri" w:cs="Calibri" w:eastAsia="Calibri" w:hAnsi="Calibri"/>
+          <w:color w:val="3D5038"/>
+          <w:sz w:val="21"/>
+          <w:szCs w:val="21"/>
+        </w:rPr>
+        <w:t xml:space="preserve">• </w:t>
+      </w:r>
+      <w:r>
+        <w:rPr>
+          <w:rFonts w:ascii="Calibri" w:cs="Calibri" w:eastAsia="Calibri" w:hAnsi="Calibri"/>
+          <w:color w:val="3D5038"/>
+          <w:sz w:val="21"/>
+          <w:szCs w:val="21"/>
+        </w:rPr>
+        <w:t xml:space="preserve">Tea-house culture — slow-living urban style that defines daily Chengdu life</w:t>
+      </w:r>
+    </w:p>
+    <w:p>
+      <w:pPr>
+        <w:spacing w:after="80"/>
+      </w:pPr>
+      <w:r>
+        <w:rPr>
+          <w:rFonts w:ascii="Calibri" w:cs="Calibri" w:eastAsia="Calibri" w:hAnsi="Calibri"/>
+          <w:color w:val="3D5038"/>
+          <w:sz w:val="21"/>
+          <w:szCs w:val="21"/>
+        </w:rPr>
+        <w:t xml:space="preserve">• </w:t>
+      </w:r>
+      <w:r>
+        <w:rPr>
+          <w:rFonts w:ascii="Calibri" w:cs="Calibri" w:eastAsia="Calibri" w:hAnsi="Calibri"/>
+          <w:color w:val="3D5038"/>
+          <w:sz w:val="21"/>
+          <w:szCs w:val="21"/>
+        </w:rPr>
+        <w:t xml:space="preserve">Shu embroidery (蜀绣) — living craft in Chengdu workshops; one of China's Four Great Embroideries</w:t>
+      </w:r>
+    </w:p>
+    <w:p>
+      <w:pPr>
+        <w:spacing w:after="60" w:before="100"/>
+      </w:pPr>
+      <w:r>
+        <w:rPr>
+          <w:rFonts w:ascii="Calibri" w:cs="Calibri" w:eastAsia="Calibri" w:hAnsi="Calibri"/>
+          <w:b/>
+          <w:bCs/>
+          <w:color w:val="4A7A38"/>
+          <w:sz w:val="22"/>
+          <w:szCs w:val="22"/>
+        </w:rPr>
+        <w:t xml:space="preserve">On your itinerary</w:t>
+      </w:r>
+    </w:p>
+    <w:p>
+      <w:pPr>
+        <w:spacing w:after="200"/>
+      </w:pPr>
+      <w:r>
+        <w:rPr>
+          <w:rFonts w:ascii="Calibri" w:cs="Calibri" w:eastAsia="Calibri" w:hAnsi="Calibri"/>
+          <w:color w:val="3D5038"/>
+          <w:sz w:val="21"/>
+          <w:szCs w:val="21"/>
+        </w:rPr>
+        <w:t xml:space="preserve">Your trip: </w:t>
+      </w:r>
+      <w:r>
+        <w:rPr>
+          <w:rFonts w:ascii="Calibri" w:cs="Calibri" w:eastAsia="Calibri" w:hAnsi="Calibri"/>
+          <w:b/>
+          <w:bCs/>
+          <w:color w:val="4A7A38"/>
+          <w:sz w:val="21"/>
+          <w:szCs w:val="21"/>
+        </w:rPr>
+        <w:t xml:space="preserve">Panda Base</w:t>
+      </w:r>
+      <w:r>
+        <w:rPr>
+          <w:rFonts w:ascii="Calibri" w:cs="Calibri" w:eastAsia="Calibri" w:hAnsi="Calibri"/>
+          <w:color w:val="7BAE5C"/>
+          <w:sz w:val="20"/>
+          <w:szCs w:val="20"/>
+        </w:rPr>
+        <w:t xml:space="preserve"> (Day 1)</w:t>
+      </w:r>
+      <w:r>
+        <w:rPr>
+          <w:rFonts w:ascii="Calibri" w:cs="Calibri" w:eastAsia="Calibri" w:hAnsi="Calibri"/>
+          <w:color w:val="3D5038"/>
+          <w:sz w:val="21"/>
+          <w:szCs w:val="21"/>
+        </w:rPr>
+        <w:t xml:space="preserve"> &amp; </w:t>
+      </w:r>
+      <w:r>
+        <w:rPr>
+          <w:rFonts w:ascii="Calibri" w:cs="Calibri" w:eastAsia="Calibri" w:hAnsi="Calibri"/>
+          <w:b/>
+          <w:bCs/>
+          <w:color w:val="4A7A38"/>
+          <w:sz w:val="21"/>
+          <w:szCs w:val="21"/>
+        </w:rPr>
+        <w:t xml:space="preserve">Jinli</w:t>
+      </w:r>
+      <w:r>
+        <w:rPr>
+          <w:rFonts w:ascii="Calibri" w:cs="Calibri" w:eastAsia="Calibri" w:hAnsi="Calibri"/>
+          <w:color w:val="7BAE5C"/>
+          <w:sz w:val="20"/>
+          <w:szCs w:val="20"/>
+        </w:rPr>
+        <w:t xml:space="preserve"> (Day 1)</w:t>
+      </w:r>
+      <w:r>
+        <w:rPr>
+          <w:rFonts w:ascii="Calibri" w:cs="Calibri" w:eastAsia="Calibri" w:hAnsi="Calibri"/>
+          <w:color w:val="3D5038"/>
+          <w:sz w:val="21"/>
+          <w:szCs w:val="21"/>
+        </w:rPr>
+        <w:t xml:space="preserve"> (Day 1), </w:t>
+      </w:r>
+      <w:r>
+        <w:rPr>
+          <w:rFonts w:ascii="Calibri" w:cs="Calibri" w:eastAsia="Calibri" w:hAnsi="Calibri"/>
+          <w:b/>
+          <w:bCs/>
+          <w:color w:val="4A7A38"/>
+          <w:sz w:val="21"/>
+          <w:szCs w:val="21"/>
+        </w:rPr>
+        <w:t xml:space="preserve">Kuanzhai Alley</w:t>
+      </w:r>
+      <w:r>
+        <w:rPr>
+          <w:rFonts w:ascii="Calibri" w:cs="Calibri" w:eastAsia="Calibri" w:hAnsi="Calibri"/>
+          <w:color w:val="7BAE5C"/>
+          <w:sz w:val="20"/>
+          <w:szCs w:val="20"/>
+        </w:rPr>
+        <w:t xml:space="preserve"> (Day 2)</w:t>
+      </w:r>
+      <w:r>
+        <w:rPr>
+          <w:rFonts w:ascii="Calibri" w:cs="Calibri" w:eastAsia="Calibri" w:hAnsi="Calibri"/>
+          <w:color w:val="3D5038"/>
+          <w:sz w:val="21"/>
+          <w:szCs w:val="21"/>
+        </w:rPr>
+        <w:t xml:space="preserve"> / </w:t>
+      </w:r>
+      <w:r>
+        <w:rPr>
+          <w:rFonts w:ascii="Calibri" w:cs="Calibri" w:eastAsia="Calibri" w:hAnsi="Calibri"/>
+          <w:b/>
+          <w:bCs/>
+          <w:color w:val="4A7A38"/>
+          <w:sz w:val="21"/>
+          <w:szCs w:val="21"/>
+        </w:rPr>
+        <w:t xml:space="preserve">Jinsha</w:t>
+      </w:r>
+      <w:r>
+        <w:rPr>
+          <w:rFonts w:ascii="Calibri" w:cs="Calibri" w:eastAsia="Calibri" w:hAnsi="Calibri"/>
+          <w:color w:val="7BAE5C"/>
+          <w:sz w:val="20"/>
+          <w:szCs w:val="20"/>
+        </w:rPr>
+        <w:t xml:space="preserve"> (Day 2)</w:t>
+      </w:r>
+      <w:r>
+        <w:rPr>
+          <w:rFonts w:ascii="Calibri" w:cs="Calibri" w:eastAsia="Calibri" w:hAnsi="Calibri"/>
+          <w:color w:val="3D5038"/>
+          <w:sz w:val="21"/>
+          <w:szCs w:val="21"/>
+        </w:rPr>
+        <w:t xml:space="preserve"> / </w:t>
+      </w:r>
+      <w:r>
+        <w:rPr>
+          <w:rFonts w:ascii="Calibri" w:cs="Calibri" w:eastAsia="Calibri" w:hAnsi="Calibri"/>
+          <w:b/>
+          <w:bCs/>
+          <w:color w:val="4A7A38"/>
+          <w:sz w:val="21"/>
+          <w:szCs w:val="21"/>
+        </w:rPr>
+        <w:t xml:space="preserve">Sichuan Opera</w:t>
+      </w:r>
+      <w:r>
+        <w:rPr>
+          <w:rFonts w:ascii="Calibri" w:cs="Calibri" w:eastAsia="Calibri" w:hAnsi="Calibri"/>
+          <w:color w:val="7BAE5C"/>
+          <w:sz w:val="20"/>
+          <w:szCs w:val="20"/>
+        </w:rPr>
+        <w:t xml:space="preserve"> (Day 2)</w:t>
+      </w:r>
+      <w:r>
+        <w:rPr>
+          <w:rFonts w:ascii="Calibri" w:cs="Calibri" w:eastAsia="Calibri" w:hAnsi="Calibri"/>
+          <w:color w:val="3D5038"/>
+          <w:sz w:val="21"/>
+          <w:szCs w:val="21"/>
+        </w:rPr>
+        <w:t xml:space="preserve"> (Day 2), </w:t>
+      </w:r>
+      <w:r>
+        <w:rPr>
+          <w:rFonts w:ascii="Calibri" w:cs="Calibri" w:eastAsia="Calibri" w:hAnsi="Calibri"/>
+          <w:b/>
+          <w:bCs/>
+          <w:color w:val="4A7A38"/>
+          <w:sz w:val="21"/>
+          <w:szCs w:val="21"/>
+        </w:rPr>
+        <w:t xml:space="preserve">Sanxingdui</w:t>
+      </w:r>
+      <w:r>
+        <w:rPr>
+          <w:rFonts w:ascii="Calibri" w:cs="Calibri" w:eastAsia="Calibri" w:hAnsi="Calibri"/>
+          <w:color w:val="7BAE5C"/>
+          <w:sz w:val="20"/>
+          <w:szCs w:val="20"/>
+        </w:rPr>
+        <w:t xml:space="preserve"> (Day 3)</w:t>
+      </w:r>
+      <w:r>
+        <w:rPr>
+          <w:rFonts w:ascii="Calibri" w:cs="Calibri" w:eastAsia="Calibri" w:hAnsi="Calibri"/>
+          <w:color w:val="3D5038"/>
+          <w:sz w:val="21"/>
+          <w:szCs w:val="21"/>
+        </w:rPr>
+        <w:t xml:space="preserve"> (Day 3), </w:t>
+      </w:r>
+      <w:r>
+        <w:rPr>
+          <w:rFonts w:ascii="Calibri" w:cs="Calibri" w:eastAsia="Calibri" w:hAnsi="Calibri"/>
+          <w:b/>
+          <w:bCs/>
+          <w:color w:val="4A7A38"/>
+          <w:sz w:val="21"/>
+          <w:szCs w:val="21"/>
+        </w:rPr>
+        <w:t xml:space="preserve">Sichuan Museum</w:t>
+      </w:r>
+      <w:r>
+        <w:rPr>
+          <w:rFonts w:ascii="Calibri" w:cs="Calibri" w:eastAsia="Calibri" w:hAnsi="Calibri"/>
+          <w:color w:val="7BAE5C"/>
+          <w:sz w:val="20"/>
+          <w:szCs w:val="20"/>
+        </w:rPr>
+        <w:t xml:space="preserve"> (Day 7)</w:t>
+      </w:r>
+      <w:r>
+        <w:rPr>
+          <w:rFonts w:ascii="Calibri" w:cs="Calibri" w:eastAsia="Calibri" w:hAnsi="Calibri"/>
+          <w:color w:val="3D5038"/>
+          <w:sz w:val="21"/>
+          <w:szCs w:val="21"/>
+        </w:rPr>
+        <w:t xml:space="preserve"> &amp; </w:t>
+      </w:r>
+      <w:r>
+        <w:rPr>
+          <w:rFonts w:ascii="Calibri" w:cs="Calibri" w:eastAsia="Calibri" w:hAnsi="Calibri"/>
+          <w:b/>
+          <w:bCs/>
+          <w:color w:val="4A7A38"/>
+          <w:sz w:val="21"/>
+          <w:szCs w:val="21"/>
+        </w:rPr>
+        <w:t xml:space="preserve">Chengdu Museum</w:t>
+      </w:r>
+      <w:r>
+        <w:rPr>
+          <w:rFonts w:ascii="Calibri" w:cs="Calibri" w:eastAsia="Calibri" w:hAnsi="Calibri"/>
+          <w:color w:val="7BAE5C"/>
+          <w:sz w:val="20"/>
+          <w:szCs w:val="20"/>
+        </w:rPr>
+        <w:t xml:space="preserve"> (Day 7)</w:t>
+      </w:r>
+      <w:r>
+        <w:rPr>
+          <w:rFonts w:ascii="Calibri" w:cs="Calibri" w:eastAsia="Calibri" w:hAnsi="Calibri"/>
+          <w:color w:val="3D5038"/>
+          <w:sz w:val="21"/>
+          <w:szCs w:val="21"/>
+        </w:rPr>
+        <w:t xml:space="preserve"> (Day 7), </w:t>
+      </w:r>
+      <w:r>
+        <w:rPr>
+          <w:rFonts w:ascii="Calibri" w:cs="Calibri" w:eastAsia="Calibri" w:hAnsi="Calibri"/>
+          <w:b/>
+          <w:bCs/>
+          <w:color w:val="4A7A38"/>
+          <w:sz w:val="21"/>
+          <w:szCs w:val="21"/>
+        </w:rPr>
+        <w:t xml:space="preserve">return to Chengdu</w:t>
+      </w:r>
+      <w:r>
+        <w:rPr>
+          <w:rFonts w:ascii="Calibri" w:cs="Calibri" w:eastAsia="Calibri" w:hAnsi="Calibri"/>
+          <w:color w:val="7BAE5C"/>
+          <w:sz w:val="20"/>
+          <w:szCs w:val="20"/>
+        </w:rPr>
+        <w:t xml:space="preserve"> (Day 6)</w:t>
+      </w:r>
+      <w:r>
+        <w:rPr>
+          <w:rFonts w:ascii="Calibri" w:cs="Calibri" w:eastAsia="Calibri" w:hAnsi="Calibri"/>
+          <w:color w:val="3D5038"/>
+          <w:sz w:val="21"/>
+          <w:szCs w:val="21"/>
+        </w:rPr>
+        <w:t xml:space="preserve">.</w:t>
+      </w:r>
+    </w:p>
+    <w:p>
+      <w:pPr>
+        <w:pStyle w:val="Heading3"/>
+        <w:spacing w:after="160" w:before="240"/>
+      </w:pPr>
+      <w:r>
+        <w:rPr>
+          <w:rFonts w:ascii="Calibri" w:cs="Calibri" w:eastAsia="Calibri" w:hAnsi="Calibri"/>
+          <w:b/>
+          <w:bCs/>
+          <w:color w:val="4A7A38"/>
+          <w:sz w:val="26"/>
+          <w:szCs w:val="26"/>
+        </w:rPr>
+        <w:t xml:space="preserve">Chongqing Municipality</w:t>
+      </w:r>
+    </w:p>
+    <w:p>
+      <w:pPr>
+        <w:spacing w:after="80"/>
+      </w:pPr>
+      <w:r>
+        <w:rPr>
+          <w:rFonts w:ascii="Calibri" w:cs="Calibri" w:eastAsia="Calibri" w:hAnsi="Calibri"/>
+          <w:b/>
+          <w:bCs/>
+          <w:color w:val="4A7A38"/>
+          <w:sz w:val="21"/>
+          <w:szCs w:val="21"/>
+        </w:rPr>
+        <w:t xml:space="preserve">Provincial-level municipality · ~32 million (whole region) · 3,000+ years of settlement</w:t>
+      </w:r>
+      <w:r>
+        <w:rPr>
+          <w:sz w:val="21"/>
+          <w:szCs w:val="21"/>
+        </w:rPr>
+        <w:t xml:space="preserve">  </w:t>
+      </w:r>
+      <w:r>
+        <w:rPr>
+          <w:rFonts w:ascii="Calibri" w:cs="Calibri" w:eastAsia="Calibri" w:hAnsi="Calibri"/>
+          <w:color w:val="7BAE5C"/>
+          <w:sz w:val="20"/>
+          <w:szCs w:val="20"/>
+        </w:rPr>
+        <w:t xml:space="preserve">Whole municipality vs. state: more people than any U.S. state except California</w:t>
+      </w:r>
+    </w:p>
+    <w:p>
+      <w:pPr>
+        <w:spacing w:after="80"/>
+      </w:pPr>
+      <w:r>
+        <w:rPr>
+          <w:rFonts w:ascii="Calibri" w:cs="Calibri" w:eastAsia="Calibri" w:hAnsi="Calibri"/>
+          <w:color w:val="3D5038"/>
+          <w:sz w:val="20"/>
+          <w:szCs w:val="20"/>
+        </w:rPr>
+        <w:t xml:space="preserve">Admin level: direct-controlled municipality (provincial-level — like Beijing or Shanghai). ~32 million covers the entire region (urban core plus rural counties), so comparisons to U.S. states are common — but this is not one city in the American sense.</w:t>
+      </w:r>
+    </w:p>
+    <w:p>
+      <w:pPr>
+        <w:spacing w:after="100"/>
+      </w:pPr>
+      <w:r>
+        <w:rPr>
+          <w:rFonts w:ascii="Calibri" w:cs="Calibri" w:eastAsia="Calibri" w:hAnsi="Calibri"/>
+          <w:color w:val="3D5038"/>
+          <w:sz w:val="21"/>
+          <w:szCs w:val="21"/>
+        </w:rPr>
+        <w:t xml:space="preserve">One of four direct-controlled municipalities (provincial-level, like Beijing and Shanghai). Major Yangtze port, bridge city, and industrial hub.</w:t>
+      </w:r>
+    </w:p>
+    <w:p>
+      <w:pPr>
+        <w:spacing w:after="60" w:before="100"/>
+      </w:pPr>
+      <w:r>
+        <w:rPr>
+          <w:rFonts w:ascii="Calibri" w:cs="Calibri" w:eastAsia="Calibri" w:hAnsi="Calibri"/>
+          <w:b/>
+          <w:bCs/>
+          <w:color w:val="4A7A38"/>
+          <w:sz w:val="22"/>
+          <w:szCs w:val="22"/>
+        </w:rPr>
+        <w:t xml:space="preserve">Notable titles</w:t>
+      </w:r>
+    </w:p>
+    <w:p>
+      <w:pPr>
+        <w:spacing w:after="80"/>
+      </w:pPr>
+      <w:r>
+        <w:rPr>
+          <w:rFonts w:ascii="Calibri" w:cs="Calibri" w:eastAsia="Calibri" w:hAnsi="Calibri"/>
+          <w:color w:val="3D5038"/>
+          <w:sz w:val="21"/>
+          <w:szCs w:val="21"/>
+        </w:rPr>
+        <w:t xml:space="preserve">• </w:t>
+      </w:r>
+      <w:r>
+        <w:rPr>
+          <w:rFonts w:ascii="Calibri" w:cs="Calibri" w:eastAsia="Calibri" w:hAnsi="Calibri"/>
+          <w:color w:val="3D5038"/>
+          <w:sz w:val="21"/>
+          <w:szCs w:val="21"/>
+        </w:rPr>
+        <w:t xml:space="preserve">China's wartime capital (1937–1945) — 战时陪都; seat of Allied China during WWII</w:t>
+      </w:r>
+    </w:p>
+    <w:p>
+      <w:pPr>
+        <w:spacing w:after="80"/>
+      </w:pPr>
+      <w:r>
+        <w:rPr>
+          <w:rFonts w:ascii="Calibri" w:cs="Calibri" w:eastAsia="Calibri" w:hAnsi="Calibri"/>
+          <w:color w:val="3D5038"/>
+          <w:sz w:val="21"/>
+          <w:szCs w:val="21"/>
+        </w:rPr>
+        <w:t xml:space="preserve">• </w:t>
+      </w:r>
+      <w:r>
+        <w:rPr>
+          <w:rFonts w:ascii="Calibri" w:cs="Calibri" w:eastAsia="Calibri" w:hAnsi="Calibri"/>
+          <w:color w:val="3D5038"/>
+          <w:sz w:val="21"/>
+          <w:szCs w:val="21"/>
+        </w:rPr>
+        <w:t xml:space="preserve">UNESCO World Heritage: Dazu Rock Carvings (1999) — pinnacle of Chinese cliff sculpture art</w:t>
+      </w:r>
+    </w:p>
+    <w:p>
+      <w:pPr>
+        <w:spacing w:after="80"/>
+      </w:pPr>
+      <w:r>
+        <w:rPr>
+          <w:rFonts w:ascii="Calibri" w:cs="Calibri" w:eastAsia="Calibri" w:hAnsi="Calibri"/>
+          <w:color w:val="3D5038"/>
+          <w:sz w:val="21"/>
+          <w:szCs w:val="21"/>
+        </w:rPr>
+        <w:t xml:space="preserve">• </w:t>
+      </w:r>
+      <w:r>
+        <w:rPr>
+          <w:rFonts w:ascii="Calibri" w:cs="Calibri" w:eastAsia="Calibri" w:hAnsi="Calibri"/>
+          <w:color w:val="3D5038"/>
+          <w:sz w:val="21"/>
+          <w:szCs w:val="21"/>
+        </w:rPr>
+        <w:t xml:space="preserve">UNESCO World Heritage: Wulong Karst (2007) — part of South China Karst; your trip visits </w:t>
+      </w:r>
+      <w:r>
+        <w:rPr>
+          <w:rFonts w:ascii="Calibri" w:cs="Calibri" w:eastAsia="Calibri" w:hAnsi="Calibri"/>
+          <w:b/>
+          <w:bCs/>
+          <w:color w:val="4A7A38"/>
+          <w:sz w:val="21"/>
+          <w:szCs w:val="21"/>
+        </w:rPr>
+        <w:t xml:space="preserve">Wulong</w:t>
+      </w:r>
+      <w:r>
+        <w:rPr>
+          <w:rFonts w:ascii="Calibri" w:cs="Calibri" w:eastAsia="Calibri" w:hAnsi="Calibri"/>
+          <w:color w:val="7BAE5C"/>
+          <w:sz w:val="20"/>
+          <w:szCs w:val="20"/>
+        </w:rPr>
+        <w:t xml:space="preserve"> (Day 8)</w:t>
+      </w:r>
+    </w:p>
+    <w:p>
+      <w:pPr>
+        <w:spacing w:after="80"/>
+      </w:pPr>
+      <w:r>
+        <w:rPr>
+          <w:rFonts w:ascii="Calibri" w:cs="Calibri" w:eastAsia="Calibri" w:hAnsi="Calibri"/>
+          <w:color w:val="3D5038"/>
+          <w:sz w:val="21"/>
+          <w:szCs w:val="21"/>
+        </w:rPr>
+        <w:t xml:space="preserve">• </w:t>
+      </w:r>
+      <w:r>
+        <w:rPr>
+          <w:rFonts w:ascii="Calibri" w:cs="Calibri" w:eastAsia="Calibri" w:hAnsi="Calibri"/>
+          <w:color w:val="3D5038"/>
+          <w:sz w:val="21"/>
+          <w:szCs w:val="21"/>
+        </w:rPr>
+        <w:t xml:space="preserve">Mountain City (山城), Fog City (雾都), Bridge City (桥都) — signature nicknames</w:t>
+      </w:r>
+    </w:p>
+    <w:p>
+      <w:pPr>
+        <w:spacing w:after="80"/>
+      </w:pPr>
+      <w:r>
+        <w:rPr>
+          <w:rFonts w:ascii="Calibri" w:cs="Calibri" w:eastAsia="Calibri" w:hAnsi="Calibri"/>
+          <w:color w:val="3D5038"/>
+          <w:sz w:val="21"/>
+          <w:szCs w:val="21"/>
+        </w:rPr>
+        <w:t xml:space="preserve">• </w:t>
+      </w:r>
+      <w:r>
+        <w:rPr>
+          <w:rFonts w:ascii="Calibri" w:cs="Calibri" w:eastAsia="Calibri" w:hAnsi="Calibri"/>
+          <w:color w:val="3D5038"/>
+          <w:sz w:val="21"/>
+          <w:szCs w:val="21"/>
+        </w:rPr>
+        <w:t xml:space="preserve">One of China's 5 national central cities (with Beijing, Shanghai, Guangzhou, and Tianjin)</w:t>
+      </w:r>
+    </w:p>
+    <w:p>
+      <w:pPr>
+        <w:spacing w:after="60" w:before="100"/>
+      </w:pPr>
+      <w:r>
+        <w:rPr>
+          <w:rFonts w:ascii="Calibri" w:cs="Calibri" w:eastAsia="Calibri" w:hAnsi="Calibri"/>
+          <w:b/>
+          <w:bCs/>
+          <w:color w:val="4A7A38"/>
+          <w:sz w:val="22"/>
+          <w:szCs w:val="22"/>
+        </w:rPr>
+        <w:t xml:space="preserve">U.S. mental map</w:t>
+      </w:r>
+    </w:p>
+    <w:p>
+      <w:pPr>
+        <w:shd w:fill="E8F3DC" w:val="clear"/>
+        <w:spacing w:after="100"/>
+      </w:pPr>
+      <w:r>
+        <w:rPr>
+          <w:rFonts w:ascii="Calibri" w:cs="Calibri" w:eastAsia="Calibri" w:hAnsi="Calibri"/>
+          <w:color w:val="3D5038"/>
+          <w:sz w:val="21"/>
+          <w:szCs w:val="21"/>
+        </w:rPr>
+        <w:t xml:space="preserve">Imagine a provincial-scale region built on steep hills where the Yangtze and Jialing Rivers meet — part San Francisco terrain, part Pittsburgh riverfront, at megacity scale.</w:t>
+      </w:r>
+    </w:p>
+    <w:p>
+      <w:pPr>
+        <w:spacing w:after="60" w:before="100"/>
+      </w:pPr>
+      <w:r>
+        <w:rPr>
+          <w:rFonts w:ascii="Calibri" w:cs="Calibri" w:eastAsia="Calibri" w:hAnsi="Calibri"/>
+          <w:b/>
+          <w:bCs/>
+          <w:color w:val="4A7A38"/>
+          <w:sz w:val="22"/>
+          <w:szCs w:val="22"/>
+        </w:rPr>
+        <w:t xml:space="preserve">History highlights</w:t>
+      </w:r>
+    </w:p>
+    <w:p>
+      <w:pPr>
+        <w:spacing w:after="100"/>
+      </w:pPr>
+      <w:r>
+        <w:rPr>
+          <w:rFonts w:ascii="Calibri" w:cs="Calibri" w:eastAsia="Calibri" w:hAnsi="Calibri"/>
+          <w:color w:val="3D5038"/>
+          <w:sz w:val="21"/>
+          <w:szCs w:val="21"/>
+        </w:rPr>
+        <w:t xml:space="preserve">China's wartime capital (1937–1945); endured heavy bombing; gateway to the Three Gorges. Known as the Mountain City (山城) and Fog City (雾都).</w:t>
+      </w:r>
+    </w:p>
+    <w:p>
+      <w:pPr>
+        <w:spacing w:after="60" w:before="100"/>
+      </w:pPr>
+      <w:r>
+        <w:rPr>
+          <w:rFonts w:ascii="Calibri" w:cs="Calibri" w:eastAsia="Calibri" w:hAnsi="Calibri"/>
+          <w:b/>
+          <w:bCs/>
+          <w:color w:val="4A7A38"/>
+          <w:sz w:val="22"/>
+          <w:szCs w:val="22"/>
+        </w:rPr>
+        <w:t xml:space="preserve">Known for &amp; firsts</w:t>
+      </w:r>
+    </w:p>
+    <w:p>
+      <w:pPr>
+        <w:spacing w:after="80"/>
+      </w:pPr>
+      <w:r>
+        <w:rPr>
+          <w:rFonts w:ascii="Calibri" w:cs="Calibri" w:eastAsia="Calibri" w:hAnsi="Calibri"/>
+          <w:color w:val="3D5038"/>
+          <w:sz w:val="21"/>
+          <w:szCs w:val="21"/>
+        </w:rPr>
+        <w:t xml:space="preserve">• </w:t>
+      </w:r>
+      <w:r>
+        <w:rPr>
+          <w:rFonts w:ascii="Calibri" w:cs="Calibri" w:eastAsia="Calibri" w:hAnsi="Calibri"/>
+          <w:color w:val="3D5038"/>
+          <w:sz w:val="21"/>
+          <w:szCs w:val="21"/>
+        </w:rPr>
+        <w:t xml:space="preserve">Chongqing-style hotpot (火锅) — mala broth culture that spread across China</w:t>
+      </w:r>
+    </w:p>
+    <w:p>
+      <w:pPr>
+        <w:spacing w:after="80"/>
+      </w:pPr>
+      <w:r>
+        <w:rPr>
+          <w:rFonts w:ascii="Calibri" w:cs="Calibri" w:eastAsia="Calibri" w:hAnsi="Calibri"/>
+          <w:color w:val="3D5038"/>
+          <w:sz w:val="21"/>
+          <w:szCs w:val="21"/>
+        </w:rPr>
+        <w:t xml:space="preserve">• </w:t>
+      </w:r>
+      <w:r>
+        <w:rPr>
+          <w:rFonts w:ascii="Calibri" w:cs="Calibri" w:eastAsia="Calibri" w:hAnsi="Calibri"/>
+          <w:b/>
+          <w:bCs/>
+          <w:color w:val="4A7A38"/>
+          <w:sz w:val="21"/>
+          <w:szCs w:val="21"/>
+        </w:rPr>
+        <w:t xml:space="preserve">Chongqing noodles (小面)</w:t>
+      </w:r>
+      <w:r>
+        <w:rPr>
+          <w:rFonts w:ascii="Calibri" w:cs="Calibri" w:eastAsia="Calibri" w:hAnsi="Calibri"/>
+          <w:color w:val="7BAE5C"/>
+          <w:sz w:val="20"/>
+          <w:szCs w:val="20"/>
+        </w:rPr>
+        <w:t xml:space="preserve"> (Day 7)</w:t>
+      </w:r>
+      <w:r>
+        <w:rPr>
+          <w:rFonts w:ascii="Calibri" w:cs="Calibri" w:eastAsia="Calibri" w:hAnsi="Calibri"/>
+          <w:color w:val="3D5038"/>
+          <w:sz w:val="21"/>
+          <w:szCs w:val="21"/>
+        </w:rPr>
+        <w:t xml:space="preserve"> — on your itinerary at Huashi Wanza Noodles</w:t>
+      </w:r>
+    </w:p>
+    <w:p>
+      <w:pPr>
+        <w:spacing w:after="80"/>
+      </w:pPr>
+      <w:r>
+        <w:rPr>
+          <w:rFonts w:ascii="Calibri" w:cs="Calibri" w:eastAsia="Calibri" w:hAnsi="Calibri"/>
+          <w:color w:val="3D5038"/>
+          <w:sz w:val="21"/>
+          <w:szCs w:val="21"/>
+        </w:rPr>
+        <w:t xml:space="preserve">• </w:t>
+      </w:r>
+      <w:r>
+        <w:rPr>
+          <w:rFonts w:ascii="Calibri" w:cs="Calibri" w:eastAsia="Calibri" w:hAnsi="Calibri"/>
+          <w:color w:val="3D5038"/>
+          <w:sz w:val="21"/>
+          <w:szCs w:val="21"/>
+        </w:rPr>
+        <w:t xml:space="preserve">Mountain-city transit — </w:t>
+      </w:r>
+      <w:r>
+        <w:rPr>
+          <w:rFonts w:ascii="Calibri" w:cs="Calibri" w:eastAsia="Calibri" w:hAnsi="Calibri"/>
+          <w:b/>
+          <w:bCs/>
+          <w:color w:val="4A7A38"/>
+          <w:sz w:val="21"/>
+          <w:szCs w:val="21"/>
+        </w:rPr>
+        <w:t xml:space="preserve">monorail through buildings (Liziba)</w:t>
+      </w:r>
+      <w:r>
+        <w:rPr>
+          <w:rFonts w:ascii="Calibri" w:cs="Calibri" w:eastAsia="Calibri" w:hAnsi="Calibri"/>
+          <w:color w:val="7BAE5C"/>
+          <w:sz w:val="20"/>
+          <w:szCs w:val="20"/>
+        </w:rPr>
+        <w:t xml:space="preserve"> (Day 9)</w:t>
+      </w:r>
+      <w:r>
+        <w:rPr>
+          <w:rFonts w:ascii="Calibri" w:cs="Calibri" w:eastAsia="Calibri" w:hAnsi="Calibri"/>
+          <w:color w:val="3D5038"/>
+          <w:sz w:val="21"/>
+          <w:szCs w:val="21"/>
+        </w:rPr>
+        <w:t xml:space="preserve">, cableways, and layered river bridges</w:t>
+      </w:r>
+    </w:p>
+    <w:p>
+      <w:pPr>
+        <w:spacing w:after="80"/>
+      </w:pPr>
+      <w:r>
+        <w:rPr>
+          <w:rFonts w:ascii="Calibri" w:cs="Calibri" w:eastAsia="Calibri" w:hAnsi="Calibri"/>
+          <w:color w:val="3D5038"/>
+          <w:sz w:val="21"/>
+          <w:szCs w:val="21"/>
+        </w:rPr>
+        <w:t xml:space="preserve">• </w:t>
+      </w:r>
+      <w:r>
+        <w:rPr>
+          <w:rFonts w:ascii="Calibri" w:cs="Calibri" w:eastAsia="Calibri" w:hAnsi="Calibri"/>
+          <w:color w:val="3D5038"/>
+          <w:sz w:val="21"/>
+          <w:szCs w:val="21"/>
+        </w:rPr>
+        <w:t xml:space="preserve">Wartime publishing &amp; resistance base — major WWII news and industrial relocation hub</w:t>
+      </w:r>
+    </w:p>
+    <w:p>
+      <w:pPr>
+        <w:spacing w:after="60" w:before="100"/>
+      </w:pPr>
+      <w:r>
+        <w:rPr>
+          <w:rFonts w:ascii="Calibri" w:cs="Calibri" w:eastAsia="Calibri" w:hAnsi="Calibri"/>
+          <w:b/>
+          <w:bCs/>
+          <w:color w:val="4A7A38"/>
+          <w:sz w:val="22"/>
+          <w:szCs w:val="22"/>
+        </w:rPr>
+        <w:t xml:space="preserve">On your itinerary</w:t>
+      </w:r>
+    </w:p>
+    <w:p>
+      <w:pPr>
+        <w:spacing w:after="200"/>
+      </w:pPr>
+      <w:r>
+        <w:rPr>
+          <w:rFonts w:ascii="Calibri" w:cs="Calibri" w:eastAsia="Calibri" w:hAnsi="Calibri"/>
+          <w:color w:val="3D5038"/>
+          <w:sz w:val="21"/>
+          <w:szCs w:val="21"/>
+        </w:rPr>
+        <w:t xml:space="preserve">Your trip: </w:t>
+      </w:r>
+      <w:r>
+        <w:rPr>
+          <w:rFonts w:ascii="Calibri" w:cs="Calibri" w:eastAsia="Calibri" w:hAnsi="Calibri"/>
+          <w:b/>
+          <w:bCs/>
+          <w:color w:val="4A7A38"/>
+          <w:sz w:val="21"/>
+          <w:szCs w:val="21"/>
+        </w:rPr>
+        <w:t xml:space="preserve">Panda HSR from Chengdu</w:t>
+      </w:r>
+      <w:r>
+        <w:rPr>
+          <w:rFonts w:ascii="Calibri" w:cs="Calibri" w:eastAsia="Calibri" w:hAnsi="Calibri"/>
+          <w:color w:val="7BAE5C"/>
+          <w:sz w:val="20"/>
+          <w:szCs w:val="20"/>
+        </w:rPr>
+        <w:t xml:space="preserve"> (Day 7)</w:t>
+      </w:r>
+      <w:r>
+        <w:rPr>
+          <w:rFonts w:ascii="Calibri" w:cs="Calibri" w:eastAsia="Calibri" w:hAnsi="Calibri"/>
+          <w:color w:val="3D5038"/>
+          <w:sz w:val="21"/>
+          <w:szCs w:val="21"/>
+        </w:rPr>
+        <w:t xml:space="preserve"> (Day 7), </w:t>
+      </w:r>
+      <w:r>
+        <w:rPr>
+          <w:rFonts w:ascii="Calibri" w:cs="Calibri" w:eastAsia="Calibri" w:hAnsi="Calibri"/>
+          <w:b/>
+          <w:bCs/>
+          <w:color w:val="4A7A38"/>
+          <w:sz w:val="21"/>
+          <w:szCs w:val="21"/>
+        </w:rPr>
+        <w:t xml:space="preserve">Hongyadong</w:t>
+      </w:r>
+      <w:r>
+        <w:rPr>
+          <w:rFonts w:ascii="Calibri" w:cs="Calibri" w:eastAsia="Calibri" w:hAnsi="Calibri"/>
+          <w:color w:val="7BAE5C"/>
+          <w:sz w:val="20"/>
+          <w:szCs w:val="20"/>
+        </w:rPr>
+        <w:t xml:space="preserve"> (Day 7)</w:t>
+      </w:r>
+      <w:r>
+        <w:rPr>
+          <w:rFonts w:ascii="Calibri" w:cs="Calibri" w:eastAsia="Calibri" w:hAnsi="Calibri"/>
+          <w:color w:val="3D5038"/>
+          <w:sz w:val="21"/>
+          <w:szCs w:val="21"/>
+        </w:rPr>
+        <w:t xml:space="preserve">, </w:t>
+      </w:r>
+      <w:r>
+        <w:rPr>
+          <w:rFonts w:ascii="Calibri" w:cs="Calibri" w:eastAsia="Calibri" w:hAnsi="Calibri"/>
+          <w:b/>
+          <w:bCs/>
+          <w:color w:val="4A7A38"/>
+          <w:sz w:val="21"/>
+          <w:szCs w:val="21"/>
+        </w:rPr>
+        <w:t xml:space="preserve">Liziba</w:t>
+      </w:r>
+      <w:r>
+        <w:rPr>
+          <w:rFonts w:ascii="Calibri" w:cs="Calibri" w:eastAsia="Calibri" w:hAnsi="Calibri"/>
+          <w:color w:val="7BAE5C"/>
+          <w:sz w:val="20"/>
+          <w:szCs w:val="20"/>
+        </w:rPr>
+        <w:t xml:space="preserve"> (Day 9)</w:t>
+      </w:r>
+      <w:r>
+        <w:rPr>
+          <w:rFonts w:ascii="Calibri" w:cs="Calibri" w:eastAsia="Calibri" w:hAnsi="Calibri"/>
+          <w:color w:val="3D5038"/>
+          <w:sz w:val="21"/>
+          <w:szCs w:val="21"/>
+        </w:rPr>
+        <w:t xml:space="preserve">, </w:t>
+      </w:r>
+      <w:r>
+        <w:rPr>
+          <w:rFonts w:ascii="Calibri" w:cs="Calibri" w:eastAsia="Calibri" w:hAnsi="Calibri"/>
+          <w:b/>
+          <w:bCs/>
+          <w:color w:val="4A7A38"/>
+          <w:sz w:val="21"/>
+          <w:szCs w:val="21"/>
+        </w:rPr>
+        <w:t xml:space="preserve">Huashi noodles</w:t>
+      </w:r>
+      <w:r>
+        <w:rPr>
+          <w:rFonts w:ascii="Calibri" w:cs="Calibri" w:eastAsia="Calibri" w:hAnsi="Calibri"/>
+          <w:color w:val="7BAE5C"/>
+          <w:sz w:val="20"/>
+          <w:szCs w:val="20"/>
+        </w:rPr>
+        <w:t xml:space="preserve"> (Day 7)</w:t>
+      </w:r>
+      <w:r>
+        <w:rPr>
+          <w:rFonts w:ascii="Calibri" w:cs="Calibri" w:eastAsia="Calibri" w:hAnsi="Calibri"/>
+          <w:color w:val="3D5038"/>
+          <w:sz w:val="21"/>
+          <w:szCs w:val="21"/>
+        </w:rPr>
+        <w:t xml:space="preserve"> (Day 7), </w:t>
+      </w:r>
+      <w:r>
+        <w:rPr>
+          <w:rFonts w:ascii="Calibri" w:cs="Calibri" w:eastAsia="Calibri" w:hAnsi="Calibri"/>
+          <w:b/>
+          <w:bCs/>
+          <w:color w:val="4A7A38"/>
+          <w:sz w:val="21"/>
+          <w:szCs w:val="21"/>
+        </w:rPr>
+        <w:t xml:space="preserve">Wulong Karst</w:t>
+      </w:r>
+      <w:r>
+        <w:rPr>
+          <w:rFonts w:ascii="Calibri" w:cs="Calibri" w:eastAsia="Calibri" w:hAnsi="Calibri"/>
+          <w:color w:val="7BAE5C"/>
+          <w:sz w:val="20"/>
+          <w:szCs w:val="20"/>
+        </w:rPr>
+        <w:t xml:space="preserve"> (Day 8)</w:t>
+      </w:r>
+      <w:r>
+        <w:rPr>
+          <w:rFonts w:ascii="Calibri" w:cs="Calibri" w:eastAsia="Calibri" w:hAnsi="Calibri"/>
+          <w:color w:val="3D5038"/>
+          <w:sz w:val="21"/>
+          <w:szCs w:val="21"/>
+        </w:rPr>
+        <w:t xml:space="preserve"> (Day 8).</w:t>
       </w:r>
     </w:p>
     <w:p>

</xml_diff>

<commit_message>
Revise Where You're Going Language
</commit_message>
<xml_diff>
--- a/downloads/itinerary-en.docx
+++ b/downloads/itinerary-en.docx
@@ -1160,7 +1160,7 @@
           <w:sz w:val="20"/>
           <w:szCs w:val="20"/>
         </w:rPr>
-        <w:t xml:space="preserve">City metro area ≈ NYC + Philadelphia combined (not a state comparison)</w:t>
+        <w:t xml:space="preserve">City metro area ≈ New York City + Philadelphia metro areas combined (two U.S. cities — not a state comparison)</w:t>
       </w:r>
     </w:p>
     <w:p>
@@ -1380,7 +1380,7 @@
           <w:sz w:val="21"/>
           <w:szCs w:val="21"/>
         </w:rPr>
-        <w:t xml:space="preserve">From Jinsha and Sanxingdui roots to Tang–Song "Brocade City." One of the few major world cities that never relocated its urban core.</w:t>
+        <w:t xml:space="preserve">From Jinsha and Sanxingdui roots to Tang–Song "Brocade City." In the Tang dynasty (618–907 CE), the saying "Yangzhou first, Yi second" (扬一益二) ranked Yi (益州 — ancient Chengdu) as the empire's second-most prosperous city after Yangzhou. One of the few major world cities that never relocated its urban core.</w:t>
       </w:r>
     </w:p>
     <w:p>

</xml_diff>

<commit_message>
Update Jiuzhaigou railway station name
</commit_message>
<xml_diff>
--- a/downloads/itinerary-en.docx
+++ b/downloads/itinerary-en.docx
@@ -5154,7 +5154,7 @@
           <w:sz w:val="20"/>
           <w:szCs w:val="20"/>
         </w:rPr>
-        <w:t xml:space="preserve">Recommended train C5782: departs Chengdu East at 06:45, arrives Huanglong Jiuzhai at 08:24. Alternative departures: 08:12/10:06/11:46/15:45/18:36, 1h 39m.</w:t>
+        <w:t xml:space="preserve">Recommended train C5782: departs Chengdu East at 06:45, arrives Huanglongjiuzhai (黄龙九寨) at 08:24—the Jiuzhaigou HSR station (not Jiuzhaigou town). Alternatives: 08:12/10:06/11:46/15:45/18:36, 1h 39m.</w:t>
       </w:r>
     </w:p>
     <w:p>
@@ -5212,7 +5212,7 @@
           <w:sz w:val="20"/>
           <w:szCs w:val="20"/>
         </w:rPr>
-        <w:t xml:space="preserve">Transfer to direct scenic shuttle bus to Jiuzhaigou entrance after exit, rolling departure, 2-hour ride.</w:t>
+        <w:t xml:space="preserve">After exiting Huanglongjiuzhai (黄龙九寨) station, transfer to the direct scenic shuttle to Jiuzhaigou entrance—rolling departure, 2-hour ride.</w:t>
       </w:r>
     </w:p>
     <w:p>
@@ -5548,7 +5548,7 @@
           <w:sz w:val="22"/>
           <w:szCs w:val="22"/>
         </w:rPr>
-        <w:t xml:space="preserve">Shuttle to Huanglong Jiuzhai Station</w:t>
+        <w:t xml:space="preserve">Shuttle to Huanglongjiuzhai Station</w:t>
       </w:r>
       <w:r>
         <w:rPr>
@@ -5572,7 +5572,7 @@
           <w:sz w:val="20"/>
           <w:szCs w:val="20"/>
         </w:rPr>
-        <w:t xml:space="preserve">Shuttle bus from Jiuzhaigou entrance back to Huanglong Jiuzhai Station.</w:t>
+        <w:t xml:space="preserve">Shuttle bus from Jiuzhaigou entrance back to Huanglongjiuzhai (黄龙九寨) HSR station.</w:t>
       </w:r>
     </w:p>
     <w:p>
@@ -5630,7 +5630,7 @@
           <w:sz w:val="20"/>
           <w:szCs w:val="20"/>
         </w:rPr>
-        <w:t xml:space="preserve">High-speed train to Chengdu East. Arrive near Chunxi Road in the evening and pack for Chongqing tomorrow.</w:t>
+        <w:t xml:space="preserve">High-speed train from Huanglongjiuzhai (黄龙九寨) to Chengdu East. Arrive near Chunxi Road in the evening and pack for Chongqing tomorrow.</w:t>
       </w:r>
     </w:p>
     <w:p>

</xml_diff>

<commit_message>
Add history year number
</commit_message>
<xml_diff>
--- a/downloads/itinerary-en.docx
+++ b/downloads/itinerary-en.docx
@@ -811,7 +811,7 @@
           <w:sz w:val="21"/>
           <w:szCs w:val="21"/>
         </w:rPr>
-        <w:t xml:space="preserve">Ancient Ba and Shu kingdoms; the Three Kingdoms-era state of Shu Han (蜀汉); a major WWII rear base. The Dujiangyan irrigation system, built in 256 BCE, still waters the Chengdu Plain.</w:t>
+        <w:t xml:space="preserve">Ancient Ba and Shu kingdoms (c. 11th century–316 BCE); the Three Kingdoms state of Shu Han (221–263 CE); a major WWII rear base (1937–1945). The Dujiangyan irrigation system, built in 256 BCE, still waters the Chengdu Plain.</w:t>
       </w:r>
     </w:p>
     <w:p>
@@ -850,7 +850,7 @@
           <w:sz w:val="21"/>
           <w:szCs w:val="21"/>
         </w:rPr>
-        <w:t xml:space="preserve">Jiaozi (交子)—often cited as the world's first paper money, issued by Chengdu merchants in the 11th century</w:t>
+        <w:t xml:space="preserve">Jiaozi (交子)—often cited as the world's first paper money, issued by Chengdu merchants in the Northern Song dynasty (960–1127 CE)</w:t>
       </w:r>
     </w:p>
     <w:p>
@@ -919,7 +919,7 @@
           <w:sz w:val="21"/>
           <w:szCs w:val="21"/>
         </w:rPr>
-        <w:t xml:space="preserve">Shu brocade (蜀锦)—prized silk weaving traded along the Silk Road since the Han dynasty</w:t>
+        <w:t xml:space="preserve">Shu brocade (蜀锦)—prized silk weaving traded along the Silk Road since the Han dynasty (206 BCE–220 CE)</w:t>
       </w:r>
     </w:p>
     <w:p>
@@ -1351,7 +1351,7 @@
           <w:sz w:val="21"/>
           <w:szCs w:val="21"/>
         </w:rPr>
-        <w:t xml:space="preserve">From the Jinsha and Sanxingdui cultures to the Tang–Song "Brocade City." In the Tang dynasty (618–907 CE), the saying "Yangzhou first, Yi second" (扬一益二) ranked Yi (益州—ancient Chengdu) as the empire's second-richest city after Yangzhou. One of the few major cities in the world that has never moved its urban core.</w:t>
+        <w:t xml:space="preserve">From the Jinsha (c. 1200–650 BCE) and Sanxingdui (c. 1200–1000 BCE) cultures to the Tang–Song "Brocade City" (Tang 618–907 CE; Song 960–1279 CE). In the Tang dynasty (618–907 CE), the saying "Yangzhou first, Yi second" (扬一益二) ranked Yi (益州—ancient Chengdu) as the empire's second-richest city after Yangzhou. One of the few major cities in the world that has never moved its urban core.</w:t>
       </w:r>
     </w:p>
     <w:p>
@@ -1390,7 +1390,7 @@
           <w:sz w:val="21"/>
           <w:szCs w:val="21"/>
         </w:rPr>
-        <w:t xml:space="preserve">Birthplace of jiaozi paper money and a Song-dynasty center of printing and commerce</w:t>
+        <w:t xml:space="preserve">Birthplace of jiaozi paper money and a Song-dynasty (960–1279 CE) center of printing and commerce</w:t>
       </w:r>
     </w:p>
     <w:p>
@@ -2774,7 +2774,7 @@
               </w:rPr>
               <w:t xml:space="preserve">Maison Lee Kaiyuan Mingting Hotel
 1 Minzu Road, Jiefangbei · 3-minute walk to Hongyadong
-Breakfast for two daily · Tang-inspired décor · Xiaoshizi Metro within 100 m · Laundry and fitness center</w:t>
+Breakfast for two daily · Tang-dynasty (618–907 CE) inspired décor · Xiaoshizi Metro within 100 m · Laundry and fitness center</w:t>
             </w:r>
           </w:p>
         </w:tc>
@@ -3560,7 +3560,7 @@
           <w:sz w:val="20"/>
           <w:szCs w:val="20"/>
         </w:rPr>
-        <w:t xml:space="preserve">About: Ming–Qing style pedestrian lane beside Wuhou Shrine — red lanterns, folk crafts, and Chengdu street snacks; most atmospheric after dark.</w:t>
+        <w:t xml:space="preserve">About: Ming–Qing style pedestrian lane (Ming 1368–1644; Qing 1644–1912) beside Wuhou Shrine — red lanterns, folk crafts, and Chengdu street snacks; most atmospheric after dark.</w:t>
       </w:r>
     </w:p>
     <w:p>
@@ -4149,7 +4149,7 @@
           <w:sz w:val="20"/>
           <w:szCs w:val="20"/>
         </w:rPr>
-        <w:t xml:space="preserve">About: Private dining in Wide &amp; Narrow Alleys with panda-shaped creative dishes — fully customizable non-spicy menu in a Qing-era courtyard setting.</w:t>
+        <w:t xml:space="preserve">About: Private dining in Wide &amp; Narrow Alleys with panda-shaped creative dishes — fully customizable non-spicy menu in a Qing-dynasty (1644–1912) courtyard setting.</w:t>
       </w:r>
     </w:p>
     <w:p>
@@ -4267,7 +4267,7 @@
           <w:sz w:val="20"/>
           <w:szCs w:val="20"/>
         </w:rPr>
-        <w:t xml:space="preserve">About: 3,000-year-old Shu Kingdom site — home of the golden Sun Bird (China's cultural heritage logo) and exquisite jade and gold artifacts.</w:t>
+        <w:t xml:space="preserve">About: Shu Kingdom site (c. 1200–650 BCE) — home of the golden Sun Bird (China's cultural heritage logo) and exquisite jade and gold artifacts.</w:t>
       </w:r>
     </w:p>
     <w:p>
@@ -4777,7 +4777,7 @@
           <w:sz w:val="20"/>
           <w:szCs w:val="20"/>
         </w:rPr>
-        <w:t xml:space="preserve">About: One of China's greatest archaeological discoveries — towering bronze masks, gold scepters, and a mysterious civilization unlike anything else in Chinese history.</w:t>
+        <w:t xml:space="preserve">About: One of China's greatest archaeological discoveries (Sanxingdui culture, c. 1200–1000 BCE) — towering bronze masks, gold scepters, and a mysterious civilization unlike anything else in Chinese history.</w:t>
       </w:r>
     </w:p>
     <w:p>
@@ -4897,7 +4897,7 @@
           <w:sz w:val="20"/>
           <w:szCs w:val="20"/>
         </w:rPr>
-        <w:t xml:space="preserve">Highlight: AR animations recreate ancient Shu scenes — ideal for immersive experience seekers</w:t>
+        <w:t xml:space="preserve">Highlight: AR animations recreate ancient Shu scenes (c. 1200–1000 BCE) — ideal for immersive experience seekers</w:t>
       </w:r>
     </w:p>
     <w:p>
@@ -7348,7 +7348,7 @@
           <w:sz w:val="20"/>
           <w:szCs w:val="20"/>
         </w:rPr>
-        <w:t xml:space="preserve">About: Cliff sculptures dating from the 9th–13th centuries — the Thousand-Hand Guanyin and themed grotto clusters at Baodingshan are among China's finest Buddhist rock art.</w:t>
+        <w:t xml:space="preserve">About: Cliff sculptures from the late Tang through Song dynasties (9th–13th centuries; Tang 618–907 CE, Song 960–1279 CE) — the Thousand-Hand Guanyin and themed grotto clusters at Baodingshan are among China's finest Buddhist rock art.</w:t>
       </w:r>
     </w:p>
     <w:p>

</xml_diff>

<commit_message>
Update welcome emoji and jiuzhaigou description
</commit_message>
<xml_diff>
--- a/downloads/itinerary-en.docx
+++ b/downloads/itinerary-en.docx
@@ -65,7 +65,7 @@
           <w:sz w:val="22"/>
           <w:szCs w:val="22"/>
         </w:rPr>
-        <w:t xml:space="preserve">Two travelers · Easy on spice · Relaxed pace · September</w:t>
+        <w:t xml:space="preserve">Two travelers · Easy on spice · Relaxed pace · Oct 15–30</w:t>
       </w:r>
     </w:p>
     <w:p>
@@ -97,7 +97,7 @@
           <w:sz w:val="21"/>
           <w:szCs w:val="21"/>
         </w:rPr>
-        <w:t xml:space="preserve">• Travel season: September — mild weather</w:t>
+        <w:t xml:space="preserve">• Travel season: Oct 15–30 — peak Jiuzhaigou foliage; cool mornings and evenings</w:t>
       </w:r>
     </w:p>
     <w:p>
@@ -5422,7 +5422,82 @@
           <w:sz w:val="20"/>
           <w:szCs w:val="20"/>
         </w:rPr>
-        <w:t xml:space="preserve">About: Turquoise lakes and waterfalls in a high-altitude valley — shuttle buses and boardwalks make it accessible without strenuous hiking.</w:t>
+        <w:t xml:space="preserve">About: Jiuzhaigou lies in the Ngawa (Aba) Tibetan and Qiang Autonomous Prefecture—named for nine Tibetan villages once along the gorges. Tibetan-style architecture around the gate town; Day 4 hotel includes complimentary Tibetan costume photos. UNESCO site since 1992; affected by the 2008 Wenchuan earthquake and later restored. Turquoise lakes and waterfalls at high altitude; mid-to-late October (Oct 15–30 on this trip) brings peak red-and-gold foliage. Shuttle buses and boardwalks cover the valley without strenuous hiking—layer up for cool mornings.</w:t>
+      </w:r>
+    </w:p>
+    <w:p>
+      <w:pPr>
+        <w:spacing w:after="60"/>
+      </w:pPr>
+      <w:r>
+        <w:rPr>
+          <w:rFonts w:ascii="Calibri" w:cs="Calibri" w:eastAsia="Calibri" w:hAnsi="Calibri"/>
+          <w:b/>
+          <w:bCs/>
+          <w:color w:val="7BAE5C"/>
+          <w:sz w:val="22"/>
+          <w:szCs w:val="22"/>
+        </w:rPr>
+        <w:t xml:space="preserve">Optional · Evening</w:t>
+      </w:r>
+      <w:r>
+        <w:rPr>
+          <w:sz w:val="22"/>
+          <w:szCs w:val="22"/>
+        </w:rPr>
+        <w:t xml:space="preserve">  </w:t>
+      </w:r>
+      <w:r>
+        <w:rPr>
+          <w:rFonts w:ascii="Calibri" w:cs="Calibri" w:eastAsia="Calibri" w:hAnsi="Calibri"/>
+          <w:b/>
+          <w:bCs/>
+          <w:color w:val="3D5038"/>
+          <w:sz w:val="22"/>
+          <w:szCs w:val="22"/>
+        </w:rPr>
+        <w:t xml:space="preserve">[Optional] Legend of Jiuzhai Show</w:t>
+      </w:r>
+      <w:r>
+        <w:rPr>
+          <w:rFonts w:ascii="Calibri" w:cs="Calibri" w:eastAsia="Calibri" w:hAnsi="Calibri"/>
+          <w:color w:val="6B8062"/>
+          <w:sz w:val="20"/>
+          <w:szCs w:val="20"/>
+        </w:rPr>
+        <w:t xml:space="preserve"> — 270 CNY / $39.88 (audience seat / person)</w:t>
+      </w:r>
+    </w:p>
+    <w:p>
+      <w:pPr>
+        <w:spacing w:after="80"/>
+        <w:ind w:left="360"/>
+      </w:pPr>
+      <w:r>
+        <w:rPr>
+          <w:rFonts w:ascii="Calibri" w:cs="Calibri" w:eastAsia="Calibri" w:hAnsi="Calibri"/>
+          <w:i/>
+          <w:iCs/>
+          <w:color w:val="3D5038"/>
+          <w:sz w:val="20"/>
+          <w:szCs w:val="20"/>
+        </w:rPr>
+        <w:t xml:space="preserve">About: Songcheng’s Legend of Jiuzhai (Jiuzhai Romance Park) is the best-reviewed evening show at Jiuzhaigou gate town—TripAdvisor 4.4★ from 1,300+ reviews. One-hour 5D Tibetan-Qiang spectacular with rotating seats and live effects; chapters cover local legends, Princess Wencheng, and the 2008 Wenchuan earthquake. Adjacent to the scenic area in Zhangzha; ticket includes the theme park before the show.</w:t>
+      </w:r>
+    </w:p>
+    <w:p>
+      <w:pPr>
+        <w:spacing w:after="120"/>
+        <w:ind w:left="360"/>
+      </w:pPr>
+      <w:r>
+        <w:rPr>
+          <w:rFonts w:ascii="Calibri" w:cs="Calibri" w:eastAsia="Calibri" w:hAnsi="Calibri"/>
+          <w:color w:val="6B8062"/>
+          <w:sz w:val="20"/>
+          <w:szCs w:val="20"/>
+        </w:rPr>
+        <w:t xml:space="preserve">Not included in the required budget. TripAdvisor 4.4★ (1,300+ reviews)—the top-rated evening show near Jiuzhaigou gate town. Songcheng Jiuzhai Romance Park: 5D Tibetan-Qiang song &amp; dance, ~1 hr. Typical showtimes 17:30 or 19:00 (confirm when booking). Ticket includes park entry; arrive ~30 min early. Short taxi or hotel shuttle from Xingyu; book ahead in peak season.</w:t>
       </w:r>
     </w:p>
     <w:p>
@@ -13453,6 +13528,20 @@
           <w:szCs w:val="21"/>
         </w:rPr>
         <w:t xml:space="preserve">• D3 Sichuan local specialty souvenirs (evening shopping)</w:t>
+      </w:r>
+    </w:p>
+    <w:p>
+      <w:pPr>
+        <w:spacing w:after="80"/>
+      </w:pPr>
+      <w:r>
+        <w:rPr>
+          <w:rFonts w:ascii="Calibri" w:cs="Calibri" w:eastAsia="Calibri" w:hAnsi="Calibri"/>
+          <w:color w:val="3D5038"/>
+          <w:sz w:val="21"/>
+          <w:szCs w:val="21"/>
+        </w:rPr>
+        <w:t xml:space="preserve">• D5 Legend of Jiuzhai (九寨千古情) evening show for two — audience seats ~540 CNY / $79.76 (TripAdvisor 4.4★; book ahead)</w:t>
       </w:r>
     </w:p>
     <w:p>

</xml_diff>

<commit_message>
Update Dazu transportation means
</commit_message>
<xml_diff>
--- a/downloads/itinerary-en.docx
+++ b/downloads/itinerary-en.docx
@@ -51,7 +51,7 @@
           <w:sz w:val="24"/>
           <w:szCs w:val="24"/>
         </w:rPr>
-        <w:t xml:space="preserve">Fixed total 7951 CNY / $1174.36</w:t>
+        <w:t xml:space="preserve">Fixed total 7825 CNY / $1155.65</w:t>
       </w:r>
     </w:p>
     <w:p>
@@ -7227,7 +7227,7 @@
           <w:sz w:val="21"/>
           <w:szCs w:val="21"/>
         </w:rPr>
-        <w:t xml:space="preserve">900 CNY / $132.94</w:t>
+        <w:t xml:space="preserve">774 CNY / $114.32</w:t>
       </w:r>
     </w:p>
     <w:p>
@@ -7243,7 +7243,7 @@
           <w:sz w:val="21"/>
           <w:szCs w:val="21"/>
         </w:rPr>
-        <w:t xml:space="preserve">Baodingshan carvings · back by evening</w:t>
+        <w:t xml:space="preserve">Direct shuttle · Baodingshan · back ~18:00</w:t>
       </w:r>
     </w:p>
     <w:p>
@@ -7325,7 +7325,7 @@
           <w:sz w:val="22"/>
           <w:szCs w:val="22"/>
         </w:rPr>
-        <w:t xml:space="preserve">08:30</w:t>
+        <w:t xml:space="preserve">08:00</w:t>
       </w:r>
       <w:r>
         <w:rPr>
@@ -7343,16 +7343,16 @@
           <w:sz w:val="22"/>
           <w:szCs w:val="22"/>
         </w:rPr>
-        <w:t xml:space="preserve">Taxi: Jiefangbei → Chongqing West</w:t>
-      </w:r>
-      <w:r>
-        <w:rPr>
-          <w:rFonts w:ascii="Calibri" w:cs="Calibri" w:eastAsia="Calibri" w:hAnsi="Calibri"/>
-          <w:color w:val="6B8062"/>
-          <w:sz w:val="20"/>
-          <w:szCs w:val="20"/>
-        </w:rPr>
-        <w:t xml:space="preserve"> — 15 CNY / $2.22 (one-way)</w:t>
+        <w:t xml:space="preserve">Direct Shuttle: Jiefangbei ↔ Dazu</w:t>
+      </w:r>
+      <w:r>
+        <w:rPr>
+          <w:rFonts w:ascii="Calibri" w:cs="Calibri" w:eastAsia="Calibri" w:hAnsi="Calibri"/>
+          <w:color w:val="6B8062"/>
+          <w:sz w:val="20"/>
+          <w:szCs w:val="20"/>
+        </w:rPr>
+        <w:t xml:space="preserve"> — 78 CNY / $11.52 (round-trip / person)</w:t>
       </w:r>
     </w:p>
     <w:p>
@@ -7367,7 +7367,7 @@
           <w:sz w:val="20"/>
           <w:szCs w:val="20"/>
         </w:rPr>
-        <w:t xml:space="preserve">Taxi from Jiefangbei to Chongqing West Railway Station.</w:t>
+        <w:t xml:space="preserve">Book round-trip seats at least 1 day ahead via WeChat 「重庆自由行」 or cqzyx.net (~¥78/person round-trip; ~¥48. Board 08:00 at the Chongqing Bombing Memorial (50 m west of Bayi Rd &amp; Ciqikou St, Jiefangbei; Metro Line 6 Xiaoshizi exit 5A)—5 min walk from Kaiyuan Mingting. Optional pick-up 08:30 Hongqihegu. Arrive Baodingshan visitor center ~10:00 (~2 hr). Return bus 16:00 from the same parking lot; back to Jiefangbei ~18:00. Door-to-door—easier and cheaper than HSR + station transfers from your hotel.</w:t>
       </w:r>
     </w:p>
     <w:p>
@@ -7383,7 +7383,7 @@
           <w:sz w:val="22"/>
           <w:szCs w:val="22"/>
         </w:rPr>
-        <w:t xml:space="preserve">09:30</w:t>
+        <w:t xml:space="preserve">10:00–14:30</w:t>
       </w:r>
       <w:r>
         <w:rPr>
@@ -7401,16 +7401,67 @@
           <w:sz w:val="22"/>
           <w:szCs w:val="22"/>
         </w:rPr>
-        <w:t xml:space="preserve">High-Speed Train to Dazu South</w:t>
-      </w:r>
-      <w:r>
-        <w:rPr>
-          <w:rFonts w:ascii="Calibri" w:cs="Calibri" w:eastAsia="Calibri" w:hAnsi="Calibri"/>
-          <w:color w:val="6B8062"/>
-          <w:sz w:val="20"/>
-          <w:szCs w:val="20"/>
-        </w:rPr>
-        <w:t xml:space="preserve"> — 48 CNY / $7.09 (2nd class, per person)</w:t>
+        <w:t xml:space="preserve">Dazu Rock Carvings (Baodingshan)</w:t>
+      </w:r>
+      <w:r>
+        <w:rPr>
+          <w:rFonts w:ascii="Calibri" w:cs="Calibri" w:eastAsia="Calibri" w:hAnsi="Calibri"/>
+          <w:color w:val="6B8062"/>
+          <w:sz w:val="20"/>
+          <w:szCs w:val="20"/>
+        </w:rPr>
+        <w:t xml:space="preserve"> — 115 CNY / $16.99 (Baodingshan / person)</w:t>
+      </w:r>
+    </w:p>
+    <w:p>
+      <w:pPr>
+        <w:spacing w:after="80"/>
+        <w:ind w:left="360"/>
+      </w:pPr>
+      <w:r>
+        <w:rPr>
+          <w:rFonts w:ascii="Calibri" w:cs="Calibri" w:eastAsia="Calibri" w:hAnsi="Calibri"/>
+          <w:i/>
+          <w:iCs/>
+          <w:color w:val="3D5038"/>
+          <w:sz w:val="20"/>
+          <w:szCs w:val="20"/>
+        </w:rPr>
+        <w:t xml:space="preserve">About: Cliff sculptures from the late Tang through Song dynasties (9th–13th centuries; Tang 618–907 CE, Song 960–1279 CE) — the Thousand-Hand Guanyin and themed grotto clusters at Baodingshan are among China's finest Buddhist rock art.</w:t>
+      </w:r>
+    </w:p>
+    <w:p>
+      <w:pPr>
+        <w:spacing w:after="60"/>
+      </w:pPr>
+      <w:r>
+        <w:rPr>
+          <w:rFonts w:ascii="Calibri" w:cs="Calibri" w:eastAsia="Calibri" w:hAnsi="Calibri"/>
+          <w:b/>
+          <w:bCs/>
+          <w:color w:val="7BAE5C"/>
+          <w:sz w:val="22"/>
+          <w:szCs w:val="22"/>
+        </w:rPr>
+        <w:t xml:space="preserve">16:00</w:t>
+      </w:r>
+      <w:r>
+        <w:rPr>
+          <w:sz w:val="22"/>
+          <w:szCs w:val="22"/>
+        </w:rPr>
+        <w:t xml:space="preserve">  </w:t>
+      </w:r>
+      <w:r>
+        <w:rPr>
+          <w:rFonts w:ascii="Calibri" w:cs="Calibri" w:eastAsia="Calibri" w:hAnsi="Calibri"/>
+          <w:b/>
+          <w:bCs/>
+          <w:color w:val="3D5038"/>
+          <w:sz w:val="22"/>
+          <w:szCs w:val="22"/>
+        </w:rPr>
+        <w:t xml:space="preserve">Return Shuttle to Jiefangbei</w:t>
       </w:r>
     </w:p>
     <w:p>
@@ -7425,299 +7476,7 @@
           <w:sz w:val="20"/>
           <w:szCs w:val="20"/>
         </w:rPr>
-        <w:t xml:space="preserve">Chongqing West → Dazu South on the Chengdu–Chongqing HSR (~50 min).</w:t>
-      </w:r>
-    </w:p>
-    <w:p>
-      <w:pPr>
-        <w:spacing w:after="60"/>
-      </w:pPr>
-      <w:r>
-        <w:rPr>
-          <w:rFonts w:ascii="Calibri" w:cs="Calibri" w:eastAsia="Calibri" w:hAnsi="Calibri"/>
-          <w:b/>
-          <w:bCs/>
-          <w:color w:val="7BAE5C"/>
-          <w:sz w:val="22"/>
-          <w:szCs w:val="22"/>
-        </w:rPr>
-        <w:t xml:space="preserve">10:30</w:t>
-      </w:r>
-      <w:r>
-        <w:rPr>
-          <w:sz w:val="22"/>
-          <w:szCs w:val="22"/>
-        </w:rPr>
-        <w:t xml:space="preserve">  </w:t>
-      </w:r>
-      <w:r>
-        <w:rPr>
-          <w:rFonts w:ascii="Calibri" w:cs="Calibri" w:eastAsia="Calibri" w:hAnsi="Calibri"/>
-          <w:b/>
-          <w:bCs/>
-          <w:color w:val="3D5038"/>
-          <w:sz w:val="22"/>
-          <w:szCs w:val="22"/>
-        </w:rPr>
-        <w:t xml:space="preserve">Taxi: Dazu South → Baodingshan</w:t>
-      </w:r>
-      <w:r>
-        <w:rPr>
-          <w:rFonts w:ascii="Calibri" w:cs="Calibri" w:eastAsia="Calibri" w:hAnsi="Calibri"/>
-          <w:color w:val="6B8062"/>
-          <w:sz w:val="20"/>
-          <w:szCs w:val="20"/>
-        </w:rPr>
-        <w:t xml:space="preserve"> — 30 CNY / $4.43 (one-way)</w:t>
-      </w:r>
-    </w:p>
-    <w:p>
-      <w:pPr>
-        <w:spacing w:after="120"/>
-        <w:ind w:left="360"/>
-      </w:pPr>
-      <w:r>
-        <w:rPr>
-          <w:rFonts w:ascii="Calibri" w:cs="Calibri" w:eastAsia="Calibri" w:hAnsi="Calibri"/>
-          <w:color w:val="6B8062"/>
-          <w:sz w:val="20"/>
-          <w:szCs w:val="20"/>
-        </w:rPr>
-        <w:t xml:space="preserve">Taxi from Dazu South Station to Baodingshan scenic area (~25 min).</w:t>
-      </w:r>
-    </w:p>
-    <w:p>
-      <w:pPr>
-        <w:spacing w:after="60"/>
-      </w:pPr>
-      <w:r>
-        <w:rPr>
-          <w:rFonts w:ascii="Calibri" w:cs="Calibri" w:eastAsia="Calibri" w:hAnsi="Calibri"/>
-          <w:b/>
-          <w:bCs/>
-          <w:color w:val="7BAE5C"/>
-          <w:sz w:val="22"/>
-          <w:szCs w:val="22"/>
-        </w:rPr>
-        <w:t xml:space="preserve">11:00–14:30</w:t>
-      </w:r>
-      <w:r>
-        <w:rPr>
-          <w:sz w:val="22"/>
-          <w:szCs w:val="22"/>
-        </w:rPr>
-        <w:t xml:space="preserve">  </w:t>
-      </w:r>
-      <w:r>
-        <w:rPr>
-          <w:rFonts w:ascii="Calibri" w:cs="Calibri" w:eastAsia="Calibri" w:hAnsi="Calibri"/>
-          <w:b/>
-          <w:bCs/>
-          <w:color w:val="3D5038"/>
-          <w:sz w:val="22"/>
-          <w:szCs w:val="22"/>
-        </w:rPr>
-        <w:t xml:space="preserve">Dazu Rock Carvings (Baodingshan)</w:t>
-      </w:r>
-      <w:r>
-        <w:rPr>
-          <w:rFonts w:ascii="Calibri" w:cs="Calibri" w:eastAsia="Calibri" w:hAnsi="Calibri"/>
-          <w:color w:val="6B8062"/>
-          <w:sz w:val="20"/>
-          <w:szCs w:val="20"/>
-        </w:rPr>
-        <w:t xml:space="preserve"> — 115 CNY / $16.99 (Baodingshan / person)</w:t>
-      </w:r>
-    </w:p>
-    <w:p>
-      <w:pPr>
-        <w:spacing w:after="80"/>
-        <w:ind w:left="360"/>
-      </w:pPr>
-      <w:r>
-        <w:rPr>
-          <w:rFonts w:ascii="Calibri" w:cs="Calibri" w:eastAsia="Calibri" w:hAnsi="Calibri"/>
-          <w:i/>
-          <w:iCs/>
-          <w:color w:val="3D5038"/>
-          <w:sz w:val="20"/>
-          <w:szCs w:val="20"/>
-        </w:rPr>
-        <w:t xml:space="preserve">About: Cliff sculptures from the late Tang through Song dynasties (9th–13th centuries; Tang 618–907 CE, Song 960–1279 CE) — the Thousand-Hand Guanyin and themed grotto clusters at Baodingshan are among China's finest Buddhist rock art.</w:t>
-      </w:r>
-    </w:p>
-    <w:p>
-      <w:pPr>
-        <w:spacing w:after="60"/>
-      </w:pPr>
-      <w:r>
-        <w:rPr>
-          <w:rFonts w:ascii="Calibri" w:cs="Calibri" w:eastAsia="Calibri" w:hAnsi="Calibri"/>
-          <w:b/>
-          <w:bCs/>
-          <w:color w:val="7BAE5C"/>
-          <w:sz w:val="22"/>
-          <w:szCs w:val="22"/>
-        </w:rPr>
-        <w:t xml:space="preserve">15:00</w:t>
-      </w:r>
-      <w:r>
-        <w:rPr>
-          <w:sz w:val="22"/>
-          <w:szCs w:val="22"/>
-        </w:rPr>
-        <w:t xml:space="preserve">  </w:t>
-      </w:r>
-      <w:r>
-        <w:rPr>
-          <w:rFonts w:ascii="Calibri" w:cs="Calibri" w:eastAsia="Calibri" w:hAnsi="Calibri"/>
-          <w:b/>
-          <w:bCs/>
-          <w:color w:val="3D5038"/>
-          <w:sz w:val="22"/>
-          <w:szCs w:val="22"/>
-        </w:rPr>
-        <w:t xml:space="preserve">Taxi: Baodingshan → Dazu South</w:t>
-      </w:r>
-      <w:r>
-        <w:rPr>
-          <w:rFonts w:ascii="Calibri" w:cs="Calibri" w:eastAsia="Calibri" w:hAnsi="Calibri"/>
-          <w:color w:val="6B8062"/>
-          <w:sz w:val="20"/>
-          <w:szCs w:val="20"/>
-        </w:rPr>
-        <w:t xml:space="preserve"> — 30 CNY / $4.43 (one-way)</w:t>
-      </w:r>
-    </w:p>
-    <w:p>
-      <w:pPr>
-        <w:spacing w:after="120"/>
-        <w:ind w:left="360"/>
-      </w:pPr>
-      <w:r>
-        <w:rPr>
-          <w:rFonts w:ascii="Calibri" w:cs="Calibri" w:eastAsia="Calibri" w:hAnsi="Calibri"/>
-          <w:color w:val="6B8062"/>
-          <w:sz w:val="20"/>
-          <w:szCs w:val="20"/>
-        </w:rPr>
-        <w:t xml:space="preserve">Return taxi to Dazu South Station for the afternoon train.</w:t>
-      </w:r>
-    </w:p>
-    <w:p>
-      <w:pPr>
-        <w:spacing w:after="60"/>
-      </w:pPr>
-      <w:r>
-        <w:rPr>
-          <w:rFonts w:ascii="Calibri" w:cs="Calibri" w:eastAsia="Calibri" w:hAnsi="Calibri"/>
-          <w:b/>
-          <w:bCs/>
-          <w:color w:val="7BAE5C"/>
-          <w:sz w:val="22"/>
-          <w:szCs w:val="22"/>
-        </w:rPr>
-        <w:t xml:space="preserve">16:30</w:t>
-      </w:r>
-      <w:r>
-        <w:rPr>
-          <w:sz w:val="22"/>
-          <w:szCs w:val="22"/>
-        </w:rPr>
-        <w:t xml:space="preserve">  </w:t>
-      </w:r>
-      <w:r>
-        <w:rPr>
-          <w:rFonts w:ascii="Calibri" w:cs="Calibri" w:eastAsia="Calibri" w:hAnsi="Calibri"/>
-          <w:b/>
-          <w:bCs/>
-          <w:color w:val="3D5038"/>
-          <w:sz w:val="22"/>
-          <w:szCs w:val="22"/>
-        </w:rPr>
-        <w:t xml:space="preserve">High-Speed Train to Chongqing West</w:t>
-      </w:r>
-      <w:r>
-        <w:rPr>
-          <w:rFonts w:ascii="Calibri" w:cs="Calibri" w:eastAsia="Calibri" w:hAnsi="Calibri"/>
-          <w:color w:val="6B8062"/>
-          <w:sz w:val="20"/>
-          <w:szCs w:val="20"/>
-        </w:rPr>
-        <w:t xml:space="preserve"> — 48 CNY / $7.09 (2nd class, per person)</w:t>
-      </w:r>
-    </w:p>
-    <w:p>
-      <w:pPr>
-        <w:spacing w:after="120"/>
-        <w:ind w:left="360"/>
-      </w:pPr>
-      <w:r>
-        <w:rPr>
-          <w:rFonts w:ascii="Calibri" w:cs="Calibri" w:eastAsia="Calibri" w:hAnsi="Calibri"/>
-          <w:color w:val="6B8062"/>
-          <w:sz w:val="20"/>
-          <w:szCs w:val="20"/>
-        </w:rPr>
-        <w:t xml:space="preserve">Dazu South → Chongqing West (~50 min).</w:t>
-      </w:r>
-    </w:p>
-    <w:p>
-      <w:pPr>
-        <w:spacing w:after="60"/>
-      </w:pPr>
-      <w:r>
-        <w:rPr>
-          <w:rFonts w:ascii="Calibri" w:cs="Calibri" w:eastAsia="Calibri" w:hAnsi="Calibri"/>
-          <w:b/>
-          <w:bCs/>
-          <w:color w:val="7BAE5C"/>
-          <w:sz w:val="22"/>
-          <w:szCs w:val="22"/>
-        </w:rPr>
-        <w:t xml:space="preserve">18:00</w:t>
-      </w:r>
-      <w:r>
-        <w:rPr>
-          <w:sz w:val="22"/>
-          <w:szCs w:val="22"/>
-        </w:rPr>
-        <w:t xml:space="preserve">  </w:t>
-      </w:r>
-      <w:r>
-        <w:rPr>
-          <w:rFonts w:ascii="Calibri" w:cs="Calibri" w:eastAsia="Calibri" w:hAnsi="Calibri"/>
-          <w:b/>
-          <w:bCs/>
-          <w:color w:val="3D5038"/>
-          <w:sz w:val="22"/>
-          <w:szCs w:val="22"/>
-        </w:rPr>
-        <w:t xml:space="preserve">Taxi: Chongqing West → Jiefangbei</w:t>
-      </w:r>
-      <w:r>
-        <w:rPr>
-          <w:rFonts w:ascii="Calibri" w:cs="Calibri" w:eastAsia="Calibri" w:hAnsi="Calibri"/>
-          <w:color w:val="6B8062"/>
-          <w:sz w:val="20"/>
-          <w:szCs w:val="20"/>
-        </w:rPr>
-        <w:t xml:space="preserve"> — 15 CNY / $2.22 (one-way)</w:t>
-      </w:r>
-    </w:p>
-    <w:p>
-      <w:pPr>
-        <w:spacing w:after="120"/>
-        <w:ind w:left="360"/>
-      </w:pPr>
-      <w:r>
-        <w:rPr>
-          <w:rFonts w:ascii="Calibri" w:cs="Calibri" w:eastAsia="Calibri" w:hAnsi="Calibri"/>
-          <w:color w:val="6B8062"/>
-          <w:sz w:val="20"/>
-          <w:szCs w:val="20"/>
-        </w:rPr>
-        <w:t xml:space="preserve">Taxi back to Kaiyuan Mingting Hotel — 10-day itinerary complete.</w:t>
+        <w:t xml:space="preserve">Included in your round-trip ticket—same parking lot as drop-off. Back near Kaiyuan Mingting ~18:00; 10-day itinerary complete.</w:t>
       </w:r>
     </w:p>
     <w:p>
@@ -7812,7 +7571,7 @@
           <w:sz w:val="21"/>
           <w:szCs w:val="21"/>
         </w:rPr>
-        <w:t xml:space="preserve">• Chengdu–Chongqing HSR to Chongqing; Dazu Rock Carvings day trip via Chongqing West ↔ Dazu South HSR</w:t>
+        <w:t xml:space="preserve">• Chengdu–Chongqing HSR to Chongqing; D10 Dazu day trip via direct shuttle from Jiefangbei Bombing Memorial (easier than HSR + transfers)</w:t>
       </w:r>
     </w:p>
     <w:p>
@@ -12874,7 +12633,7 @@
                 <w:sz w:val="20"/>
                 <w:szCs w:val="20"/>
               </w:rPr>
-              <w:t xml:space="preserve">Taxi Jiefangbei → Chongqing West</w:t>
+              <w:t xml:space="preserve">Direct shuttle Jiefangbei↔Dazu (×2, round-trip)</w:t>
             </w:r>
           </w:p>
         </w:tc>
@@ -12900,7 +12659,7 @@
                 <w:sz w:val="20"/>
                 <w:szCs w:val="20"/>
               </w:rPr>
-              <w:t xml:space="preserve">15</w:t>
+              <w:t xml:space="preserve">156</w:t>
             </w:r>
           </w:p>
         </w:tc>
@@ -12926,7 +12685,7 @@
                 <w:sz w:val="20"/>
                 <w:szCs w:val="20"/>
               </w:rPr>
-              <w:t xml:space="preserve">2.22</w:t>
+              <w:t xml:space="preserve">23.04</w:t>
             </w:r>
           </w:p>
         </w:tc>
@@ -12951,7 +12710,7 @@
                 <w:sz w:val="20"/>
                 <w:szCs w:val="20"/>
               </w:rPr>
-              <w:t xml:space="preserve">High-speed rail Chongqing West–Dazu South (×2)</w:t>
+              <w:t xml:space="preserve">Baodingshan admission (×2)</w:t>
             </w:r>
           </w:p>
         </w:tc>
@@ -12977,7 +12736,7 @@
                 <w:sz w:val="20"/>
                 <w:szCs w:val="20"/>
               </w:rPr>
-              <w:t xml:space="preserve">96</w:t>
+              <w:t xml:space="preserve">230</w:t>
             </w:r>
           </w:p>
         </w:tc>
@@ -13003,7 +12762,7 @@
                 <w:sz w:val="20"/>
                 <w:szCs w:val="20"/>
               </w:rPr>
-              <w:t xml:space="preserve">14.18</w:t>
+              <w:t xml:space="preserve">33.97</w:t>
             </w:r>
           </w:p>
         </w:tc>
@@ -13028,7 +12787,7 @@
                 <w:sz w:val="20"/>
                 <w:szCs w:val="20"/>
               </w:rPr>
-              <w:t xml:space="preserve">Taxi Dazu South ↔ Baodingshan (round trip)</w:t>
+              <w:t xml:space="preserve">Kaiyuan Mingting (nightly share)</w:t>
             </w:r>
           </w:p>
         </w:tc>
@@ -13054,7 +12813,7 @@
                 <w:sz w:val="20"/>
                 <w:szCs w:val="20"/>
               </w:rPr>
-              <w:t xml:space="preserve">60</w:t>
+              <w:t xml:space="preserve">388</w:t>
             </w:r>
           </w:p>
         </w:tc>
@@ -13080,7 +12839,7 @@
                 <w:sz w:val="20"/>
                 <w:szCs w:val="20"/>
               </w:rPr>
-              <w:t xml:space="preserve">8.86</w:t>
+              <w:t xml:space="preserve">57.31</w:t>
             </w:r>
           </w:p>
         </w:tc>
@@ -13089,29 +12848,33 @@
         <w:tc>
           <w:tcPr>
             <w:tcW w:type="pct" w:w="60%"/>
-            <w:tcMar>
-              <w:top w:type="dxa" w:w="80"/>
-              <w:left w:type="dxa" w:w="120"/>
-              <w:bottom w:type="dxa" w:w="80"/>
-              <w:right w:type="dxa" w:w="120"/>
-            </w:tcMar>
-            <w:vAlign w:val="center"/>
-          </w:tcPr>
-          <w:p>
-            <w:r>
-              <w:rPr>
-                <w:rFonts w:ascii="Calibri" w:cs="Calibri" w:eastAsia="Calibri" w:hAnsi="Calibri"/>
-                <w:color w:val="3D5038"/>
-                <w:sz w:val="20"/>
-                <w:szCs w:val="20"/>
-              </w:rPr>
-              <w:t xml:space="preserve">Baodingshan admission (×2)</w:t>
+            <w:shd w:fill="E4F0D4" w:val="clear"/>
+            <w:tcMar>
+              <w:top w:type="dxa" w:w="80"/>
+              <w:left w:type="dxa" w:w="120"/>
+              <w:bottom w:type="dxa" w:w="80"/>
+              <w:right w:type="dxa" w:w="120"/>
+            </w:tcMar>
+            <w:vAlign w:val="center"/>
+          </w:tcPr>
+          <w:p>
+            <w:r>
+              <w:rPr>
+                <w:rFonts w:ascii="Calibri" w:cs="Calibri" w:eastAsia="Calibri" w:hAnsi="Calibri"/>
+                <w:b/>
+                <w:bCs/>
+                <w:color w:val="3D5038"/>
+                <w:sz w:val="20"/>
+                <w:szCs w:val="20"/>
+              </w:rPr>
+              <w:t xml:space="preserve">Day subtotal</w:t>
             </w:r>
           </w:p>
         </w:tc>
         <w:tc>
           <w:tcPr>
             <w:tcW w:type="pct" w:w="20%"/>
+            <w:shd w:fill="E4F0D4" w:val="clear"/>
             <w:tcMar>
               <w:top w:type="dxa" w:w="80"/>
               <w:left w:type="dxa" w:w="120"/>
@@ -13127,17 +12890,20 @@
             <w:r>
               <w:rPr>
                 <w:rFonts w:ascii="Calibri" w:cs="Calibri" w:eastAsia="Calibri" w:hAnsi="Calibri"/>
-                <w:color w:val="3D5038"/>
-                <w:sz w:val="20"/>
-                <w:szCs w:val="20"/>
-              </w:rPr>
-              <w:t xml:space="preserve">230</w:t>
+                <w:b/>
+                <w:bCs/>
+                <w:color w:val="3D5038"/>
+                <w:sz w:val="20"/>
+                <w:szCs w:val="20"/>
+              </w:rPr>
+              <w:t xml:space="preserve">774</w:t>
             </w:r>
           </w:p>
         </w:tc>
         <w:tc>
           <w:tcPr>
             <w:tcW w:type="pct" w:w="20%"/>
+            <w:shd w:fill="E4F0D4" w:val="clear"/>
             <w:tcMar>
               <w:top w:type="dxa" w:w="80"/>
               <w:left w:type="dxa" w:w="120"/>
@@ -13153,328 +12919,13 @@
             <w:r>
               <w:rPr>
                 <w:rFonts w:ascii="Calibri" w:cs="Calibri" w:eastAsia="Calibri" w:hAnsi="Calibri"/>
-                <w:color w:val="3D5038"/>
-                <w:sz w:val="20"/>
-                <w:szCs w:val="20"/>
-              </w:rPr>
-              <w:t xml:space="preserve">33.97</w:t>
-            </w:r>
-          </w:p>
-        </w:tc>
-      </w:tr>
-      <w:tr>
-        <w:tc>
-          <w:tcPr>
-            <w:tcW w:type="pct" w:w="60%"/>
-            <w:tcMar>
-              <w:top w:type="dxa" w:w="80"/>
-              <w:left w:type="dxa" w:w="120"/>
-              <w:bottom w:type="dxa" w:w="80"/>
-              <w:right w:type="dxa" w:w="120"/>
-            </w:tcMar>
-            <w:vAlign w:val="center"/>
-          </w:tcPr>
-          <w:p>
-            <w:r>
-              <w:rPr>
-                <w:rFonts w:ascii="Calibri" w:cs="Calibri" w:eastAsia="Calibri" w:hAnsi="Calibri"/>
-                <w:color w:val="3D5038"/>
-                <w:sz w:val="20"/>
-                <w:szCs w:val="20"/>
-              </w:rPr>
-              <w:t xml:space="preserve">High-speed rail Dazu South–Chongqing West (×2)</w:t>
-            </w:r>
-          </w:p>
-        </w:tc>
-        <w:tc>
-          <w:tcPr>
-            <w:tcW w:type="pct" w:w="20%"/>
-            <w:tcMar>
-              <w:top w:type="dxa" w:w="80"/>
-              <w:left w:type="dxa" w:w="120"/>
-              <w:bottom w:type="dxa" w:w="80"/>
-              <w:right w:type="dxa" w:w="120"/>
-            </w:tcMar>
-            <w:vAlign w:val="center"/>
-          </w:tcPr>
-          <w:p>
-            <w:pPr>
-              <w:jc w:val="right"/>
-            </w:pPr>
-            <w:r>
-              <w:rPr>
-                <w:rFonts w:ascii="Calibri" w:cs="Calibri" w:eastAsia="Calibri" w:hAnsi="Calibri"/>
-                <w:color w:val="3D5038"/>
-                <w:sz w:val="20"/>
-                <w:szCs w:val="20"/>
-              </w:rPr>
-              <w:t xml:space="preserve">96</w:t>
-            </w:r>
-          </w:p>
-        </w:tc>
-        <w:tc>
-          <w:tcPr>
-            <w:tcW w:type="pct" w:w="20%"/>
-            <w:tcMar>
-              <w:top w:type="dxa" w:w="80"/>
-              <w:left w:type="dxa" w:w="120"/>
-              <w:bottom w:type="dxa" w:w="80"/>
-              <w:right w:type="dxa" w:w="120"/>
-            </w:tcMar>
-            <w:vAlign w:val="center"/>
-          </w:tcPr>
-          <w:p>
-            <w:pPr>
-              <w:jc w:val="right"/>
-            </w:pPr>
-            <w:r>
-              <w:rPr>
-                <w:rFonts w:ascii="Calibri" w:cs="Calibri" w:eastAsia="Calibri" w:hAnsi="Calibri"/>
-                <w:color w:val="3D5038"/>
-                <w:sz w:val="20"/>
-                <w:szCs w:val="20"/>
-              </w:rPr>
-              <w:t xml:space="preserve">14.18</w:t>
-            </w:r>
-          </w:p>
-        </w:tc>
-      </w:tr>
-      <w:tr>
-        <w:tc>
-          <w:tcPr>
-            <w:tcW w:type="pct" w:w="60%"/>
-            <w:tcMar>
-              <w:top w:type="dxa" w:w="80"/>
-              <w:left w:type="dxa" w:w="120"/>
-              <w:bottom w:type="dxa" w:w="80"/>
-              <w:right w:type="dxa" w:w="120"/>
-            </w:tcMar>
-            <w:vAlign w:val="center"/>
-          </w:tcPr>
-          <w:p>
-            <w:r>
-              <w:rPr>
-                <w:rFonts w:ascii="Calibri" w:cs="Calibri" w:eastAsia="Calibri" w:hAnsi="Calibri"/>
-                <w:color w:val="3D5038"/>
-                <w:sz w:val="20"/>
-                <w:szCs w:val="20"/>
-              </w:rPr>
-              <w:t xml:space="preserve">Taxi Chongqing West → Jiefangbei</w:t>
-            </w:r>
-          </w:p>
-        </w:tc>
-        <w:tc>
-          <w:tcPr>
-            <w:tcW w:type="pct" w:w="20%"/>
-            <w:tcMar>
-              <w:top w:type="dxa" w:w="80"/>
-              <w:left w:type="dxa" w:w="120"/>
-              <w:bottom w:type="dxa" w:w="80"/>
-              <w:right w:type="dxa" w:w="120"/>
-            </w:tcMar>
-            <w:vAlign w:val="center"/>
-          </w:tcPr>
-          <w:p>
-            <w:pPr>
-              <w:jc w:val="right"/>
-            </w:pPr>
-            <w:r>
-              <w:rPr>
-                <w:rFonts w:ascii="Calibri" w:cs="Calibri" w:eastAsia="Calibri" w:hAnsi="Calibri"/>
-                <w:color w:val="3D5038"/>
-                <w:sz w:val="20"/>
-                <w:szCs w:val="20"/>
-              </w:rPr>
-              <w:t xml:space="preserve">15</w:t>
-            </w:r>
-          </w:p>
-        </w:tc>
-        <w:tc>
-          <w:tcPr>
-            <w:tcW w:type="pct" w:w="20%"/>
-            <w:tcMar>
-              <w:top w:type="dxa" w:w="80"/>
-              <w:left w:type="dxa" w:w="120"/>
-              <w:bottom w:type="dxa" w:w="80"/>
-              <w:right w:type="dxa" w:w="120"/>
-            </w:tcMar>
-            <w:vAlign w:val="center"/>
-          </w:tcPr>
-          <w:p>
-            <w:pPr>
-              <w:jc w:val="right"/>
-            </w:pPr>
-            <w:r>
-              <w:rPr>
-                <w:rFonts w:ascii="Calibri" w:cs="Calibri" w:eastAsia="Calibri" w:hAnsi="Calibri"/>
-                <w:color w:val="3D5038"/>
-                <w:sz w:val="20"/>
-                <w:szCs w:val="20"/>
-              </w:rPr>
-              <w:t xml:space="preserve">2.22</w:t>
-            </w:r>
-          </w:p>
-        </w:tc>
-      </w:tr>
-      <w:tr>
-        <w:tc>
-          <w:tcPr>
-            <w:tcW w:type="pct" w:w="60%"/>
-            <w:tcMar>
-              <w:top w:type="dxa" w:w="80"/>
-              <w:left w:type="dxa" w:w="120"/>
-              <w:bottom w:type="dxa" w:w="80"/>
-              <w:right w:type="dxa" w:w="120"/>
-            </w:tcMar>
-            <w:vAlign w:val="center"/>
-          </w:tcPr>
-          <w:p>
-            <w:r>
-              <w:rPr>
-                <w:rFonts w:ascii="Calibri" w:cs="Calibri" w:eastAsia="Calibri" w:hAnsi="Calibri"/>
-                <w:color w:val="3D5038"/>
-                <w:sz w:val="20"/>
-                <w:szCs w:val="20"/>
-              </w:rPr>
-              <w:t xml:space="preserve">Kaiyuan Mingting (nightly share)</w:t>
-            </w:r>
-          </w:p>
-        </w:tc>
-        <w:tc>
-          <w:tcPr>
-            <w:tcW w:type="pct" w:w="20%"/>
-            <w:tcMar>
-              <w:top w:type="dxa" w:w="80"/>
-              <w:left w:type="dxa" w:w="120"/>
-              <w:bottom w:type="dxa" w:w="80"/>
-              <w:right w:type="dxa" w:w="120"/>
-            </w:tcMar>
-            <w:vAlign w:val="center"/>
-          </w:tcPr>
-          <w:p>
-            <w:pPr>
-              <w:jc w:val="right"/>
-            </w:pPr>
-            <w:r>
-              <w:rPr>
-                <w:rFonts w:ascii="Calibri" w:cs="Calibri" w:eastAsia="Calibri" w:hAnsi="Calibri"/>
-                <w:color w:val="3D5038"/>
-                <w:sz w:val="20"/>
-                <w:szCs w:val="20"/>
-              </w:rPr>
-              <w:t xml:space="preserve">388</w:t>
-            </w:r>
-          </w:p>
-        </w:tc>
-        <w:tc>
-          <w:tcPr>
-            <w:tcW w:type="pct" w:w="20%"/>
-            <w:tcMar>
-              <w:top w:type="dxa" w:w="80"/>
-              <w:left w:type="dxa" w:w="120"/>
-              <w:bottom w:type="dxa" w:w="80"/>
-              <w:right w:type="dxa" w:w="120"/>
-            </w:tcMar>
-            <w:vAlign w:val="center"/>
-          </w:tcPr>
-          <w:p>
-            <w:pPr>
-              <w:jc w:val="right"/>
-            </w:pPr>
-            <w:r>
-              <w:rPr>
-                <w:rFonts w:ascii="Calibri" w:cs="Calibri" w:eastAsia="Calibri" w:hAnsi="Calibri"/>
-                <w:color w:val="3D5038"/>
-                <w:sz w:val="20"/>
-                <w:szCs w:val="20"/>
-              </w:rPr>
-              <w:t xml:space="preserve">57.31</w:t>
-            </w:r>
-          </w:p>
-        </w:tc>
-      </w:tr>
-      <w:tr>
-        <w:tc>
-          <w:tcPr>
-            <w:tcW w:type="pct" w:w="60%"/>
-            <w:shd w:fill="E4F0D4" w:val="clear"/>
-            <w:tcMar>
-              <w:top w:type="dxa" w:w="80"/>
-              <w:left w:type="dxa" w:w="120"/>
-              <w:bottom w:type="dxa" w:w="80"/>
-              <w:right w:type="dxa" w:w="120"/>
-            </w:tcMar>
-            <w:vAlign w:val="center"/>
-          </w:tcPr>
-          <w:p>
-            <w:r>
-              <w:rPr>
-                <w:rFonts w:ascii="Calibri" w:cs="Calibri" w:eastAsia="Calibri" w:hAnsi="Calibri"/>
                 <w:b/>
                 <w:bCs/>
                 <w:color w:val="3D5038"/>
                 <w:sz w:val="20"/>
                 <w:szCs w:val="20"/>
               </w:rPr>
-              <w:t xml:space="preserve">Day subtotal</w:t>
-            </w:r>
-          </w:p>
-        </w:tc>
-        <w:tc>
-          <w:tcPr>
-            <w:tcW w:type="pct" w:w="20%"/>
-            <w:shd w:fill="E4F0D4" w:val="clear"/>
-            <w:tcMar>
-              <w:top w:type="dxa" w:w="80"/>
-              <w:left w:type="dxa" w:w="120"/>
-              <w:bottom w:type="dxa" w:w="80"/>
-              <w:right w:type="dxa" w:w="120"/>
-            </w:tcMar>
-            <w:vAlign w:val="center"/>
-          </w:tcPr>
-          <w:p>
-            <w:pPr>
-              <w:jc w:val="right"/>
-            </w:pPr>
-            <w:r>
-              <w:rPr>
-                <w:rFonts w:ascii="Calibri" w:cs="Calibri" w:eastAsia="Calibri" w:hAnsi="Calibri"/>
-                <w:b/>
-                <w:bCs/>
-                <w:color w:val="3D5038"/>
-                <w:sz w:val="20"/>
-                <w:szCs w:val="20"/>
-              </w:rPr>
-              <w:t xml:space="preserve">900</w:t>
-            </w:r>
-          </w:p>
-        </w:tc>
-        <w:tc>
-          <w:tcPr>
-            <w:tcW w:type="pct" w:w="20%"/>
-            <w:shd w:fill="E4F0D4" w:val="clear"/>
-            <w:tcMar>
-              <w:top w:type="dxa" w:w="80"/>
-              <w:left w:type="dxa" w:w="120"/>
-              <w:bottom w:type="dxa" w:w="80"/>
-              <w:right w:type="dxa" w:w="120"/>
-            </w:tcMar>
-            <w:vAlign w:val="center"/>
-          </w:tcPr>
-          <w:p>
-            <w:pPr>
-              <w:jc w:val="right"/>
-            </w:pPr>
-            <w:r>
-              <w:rPr>
-                <w:rFonts w:ascii="Calibri" w:cs="Calibri" w:eastAsia="Calibri" w:hAnsi="Calibri"/>
-                <w:b/>
-                <w:bCs/>
-                <w:color w:val="3D5038"/>
-                <w:sz w:val="20"/>
-                <w:szCs w:val="20"/>
-              </w:rPr>
-              <w:t xml:space="preserve">132.94</w:t>
+              <w:t xml:space="preserve">114.32</w:t>
             </w:r>
           </w:p>
         </w:tc>
@@ -13503,7 +12954,7 @@
           <w:sz w:val="28"/>
           <w:szCs w:val="28"/>
         </w:rPr>
-        <w:t xml:space="preserve">Grand total (two travelers): 7951 CNY / $1174.36</w:t>
+        <w:t xml:space="preserve">Grand total (two travelers): 7825 CNY / $1155.65</w:t>
       </w:r>
     </w:p>
     <w:p>
@@ -13517,7 +12968,7 @@
           <w:sz w:val="21"/>
           <w:szCs w:val="21"/>
         </w:rPr>
-        <w:t xml:space="preserve">Budget cap 9820 CNY — 1869 CNY / $275.05 remaining for optional spending</w:t>
+        <w:t xml:space="preserve">Budget cap 9820 CNY — 1995 CNY / $294.66 remaining for optional spending</w:t>
       </w:r>
     </w:p>
     <w:p>

</xml_diff>

<commit_message>
Add weather and clothing
</commit_message>
<xml_diff>
--- a/downloads/itinerary-en.docx
+++ b/downloads/itinerary-en.docx
@@ -154,6 +154,1215 @@
           <w:szCs w:val="21"/>
         </w:rPr>
         <w:t xml:space="preserve">• Day 10: Dazu Rock Carvings (Baodingshan) day trip — return to Chongqing by evening</w:t>
+      </w:r>
+    </w:p>
+    <w:p>
+      <w:pPr>
+        <w:spacing w:after="80"/>
+      </w:pPr>
+    </w:p>
+    <w:p>
+      <w:pPr>
+        <w:pStyle w:val="Heading2"/>
+        <w:shd w:fill="E8F3DC" w:color="6A9B4E" w:val="clear"/>
+        <w:spacing w:after="160" w:before="240"/>
+      </w:pPr>
+      <w:r>
+        <w:rPr>
+          <w:rFonts w:ascii="Calibri" w:cs="Calibri" w:eastAsia="Calibri" w:hAnsi="Calibri"/>
+          <w:b/>
+          <w:bCs/>
+          <w:color w:val="4A7A38"/>
+          <w:sz w:val="32"/>
+          <w:szCs w:val="32"/>
+        </w:rPr>
+        <w:t xml:space="preserve">Oct 15–30 Weather &amp; Clothing</w:t>
+      </w:r>
+    </w:p>
+    <w:p>
+      <w:pPr>
+        <w:spacing w:after="80"/>
+      </w:pPr>
+      <w:r>
+        <w:rPr>
+          <w:rFonts w:ascii="Calibri" w:cs="Calibri" w:eastAsia="Calibri" w:hAnsi="Calibri"/>
+          <w:color w:val="6B8062"/>
+          <w:sz w:val="21"/>
+          <w:szCs w:val="21"/>
+        </w:rPr>
+        <w:t xml:space="preserve">Five-year averages (2021–2025) · Actual vs feels-like temps · Chicago included for reference</w:t>
+      </w:r>
+    </w:p>
+    <w:p>
+      <w:pPr>
+        <w:spacing w:after="80"/>
+      </w:pPr>
+      <w:r>
+        <w:rPr>
+          <w:rFonts w:ascii="Calibri" w:cs="Calibri" w:eastAsia="Calibri" w:hAnsi="Calibri"/>
+          <w:color w:val="6B8062"/>
+          <w:sz w:val="20"/>
+          <w:szCs w:val="20"/>
+        </w:rPr>
+        <w:t xml:space="preserve">Source: Open-Meteo historical archive, Oct 15–30 averaged across 2021–2025 (80 sample days per city). “Meteorological feels-like” = apparent temperature (wind + humidity formula)—not the same as damp-clothes chill.</w:t>
+      </w:r>
+    </w:p>
+    <w:p>
+      <w:pPr>
+        <w:spacing w:after="80"/>
+      </w:pPr>
+      <w:r>
+        <w:rPr>
+          <w:rFonts w:ascii="Calibri" w:cs="Calibri" w:eastAsia="Calibri" w:hAnsi="Calibri"/>
+          <w:b/>
+          <w:bCs/>
+          <w:color w:val="3D5038"/>
+          <w:sz w:val="21"/>
+          <w:szCs w:val="21"/>
+        </w:rPr>
+        <w:t xml:space="preserve">Chengdu/Chongqing: at 14–22°C, formulas barely penalize humidity—feels-like ≈ the reading. Jiuzhaigou: formulas do subtract for wind (see table gap), but ~84% humidity and ~89% drizzly days add damp chill the number still misses—wettest stop on the trip, not comparable to drier Chicago.</w:t>
+      </w:r>
+    </w:p>
+    <w:p>
+      <w:pPr>
+        <w:spacing w:after="60"/>
+      </w:pPr>
+      <w:r>
+        <w:rPr>
+          <w:rFonts w:ascii="Calibri" w:cs="Calibri" w:eastAsia="Calibri" w:hAnsi="Calibri"/>
+          <w:b/>
+          <w:bCs/>
+          <w:color w:val="4A7A38"/>
+          <w:sz w:val="24"/>
+          <w:szCs w:val="24"/>
+        </w:rPr>
+        <w:t xml:space="preserve">Damp-air clothing guide</w:t>
+      </w:r>
+    </w:p>
+    <w:p>
+      <w:pPr>
+        <w:spacing w:after="60"/>
+      </w:pPr>
+      <w:r>
+        <w:rPr>
+          <w:rFonts w:ascii="Calibri" w:cs="Calibri" w:eastAsia="Calibri" w:hAnsi="Calibri"/>
+          <w:color w:val="3D5038"/>
+          <w:sz w:val="21"/>
+          <w:szCs w:val="21"/>
+        </w:rPr>
+        <w:t xml:space="preserve">• Chengdu &amp; Chongqing: Dress as if ~3–5°C (5–9°F) lower than the table on overcast or drizzly days—especially evenings. The table’s met feels-like undercounts damp air here.</w:t>
+      </w:r>
+    </w:p>
+    <w:p>
+      <w:pPr>
+        <w:spacing w:after="60"/>
+      </w:pPr>
+      <w:r>
+        <w:rPr>
+          <w:rFonts w:ascii="Calibri" w:cs="Calibri" w:eastAsia="Calibri" w:hAnsi="Calibri"/>
+          <w:color w:val="3D5038"/>
+          <w:sz w:val="21"/>
+          <w:szCs w:val="21"/>
+        </w:rPr>
+        <w:t xml:space="preserve">• Jiuzhaigou: Start from the met feels-like column (wind already counted: ~11°C / 52°F day highs, ~3°C / 37°F mornings)—then add one extra layer for mist/drizzle and wet shoes. On gloomy days, treat it as another ~2–4°C (4–7°F) colder than that met feels-like. Most humid stop on the trip (~89% days with precipitation).</w:t>
+      </w:r>
+    </w:p>
+    <w:p>
+      <w:pPr>
+        <w:spacing w:after="60"/>
+      </w:pPr>
+      <w:r>
+        <w:rPr>
+          <w:rFonts w:ascii="Calibri" w:cs="Calibri" w:eastAsia="Calibri" w:hAnsi="Calibri"/>
+          <w:color w:val="3D5038"/>
+          <w:sz w:val="21"/>
+          <w:szCs w:val="21"/>
+        </w:rPr>
+        <w:t xml:space="preserve">• Chicago (reference): Met feels-like is enough—wind is the main factor; fewer drizzly days (~43%) and lower humidity (~71%). You will not be there on this trip.</w:t>
+      </w:r>
+    </w:p>
+    <w:p>
+      <w:pPr>
+        <w:spacing w:after="40"/>
+      </w:pPr>
+    </w:p>
+    <w:p>
+      <w:pPr>
+        <w:spacing w:after="80"/>
+      </w:pPr>
+      <w:r>
+        <w:rPr>
+          <w:rFonts w:ascii="Calibri" w:cs="Calibri" w:eastAsia="Calibri" w:hAnsi="Calibri"/>
+          <w:color w:val="3D5038"/>
+          <w:sz w:val="21"/>
+          <w:szCs w:val="21"/>
+        </w:rPr>
+        <w:t xml:space="preserve">Most trip rain is drizzle or light rain (1–5 mm/day)—an umbrella usually suffices. See the emoji guide below for quick reading.</w:t>
+      </w:r>
+    </w:p>
+    <w:p>
+      <w:pPr>
+        <w:spacing w:after="140"/>
+      </w:pPr>
+      <w:r>
+        <w:rPr>
+          <w:rFonts w:ascii="Calibri" w:cs="Calibri" w:eastAsia="Calibri" w:hAnsi="Calibri"/>
+          <w:color w:val="3D5038"/>
+          <w:sz w:val="21"/>
+          <w:szCs w:val="21"/>
+        </w:rPr>
+        <w:t xml:space="preserve">Grouped by daily sunshine: bright (≥6 h), mixed (2–6 h), or overcast/gloomy (&lt;2 h). True all-day blue sky is rare in Chengdu and Chongqing; Jiuzhaigou sees more sun breaks despite frequent drizzle.</w:t>
+      </w:r>
+    </w:p>
+    <w:tbl>
+      <w:tblPr>
+        <w:tblW w:type="pct" w:w="100%"/>
+        <w:tblBorders>
+          <w:top w:val="single" w:color="auto" w:sz="4"/>
+          <w:left w:val="single" w:color="auto" w:sz="4"/>
+          <w:bottom w:val="single" w:color="auto" w:sz="4"/>
+          <w:right w:val="single" w:color="auto" w:sz="4"/>
+          <w:insideH w:val="single" w:color="auto" w:sz="4"/>
+          <w:insideV w:val="single" w:color="auto" w:sz="4"/>
+        </w:tblBorders>
+      </w:tblPr>
+      <w:tblGrid>
+        <w:gridCol w:w="100"/>
+        <w:gridCol w:w="100"/>
+        <w:gridCol w:w="100"/>
+        <w:gridCol w:w="100"/>
+      </w:tblGrid>
+      <w:tr>
+        <w:tc>
+          <w:tcPr>
+            <w:shd w:fill="E8F3DC" w:val="clear"/>
+            <w:tcMar>
+              <w:top w:type="dxa" w:w="80"/>
+              <w:left w:type="dxa" w:w="120"/>
+              <w:bottom w:type="dxa" w:w="80"/>
+              <w:right w:type="dxa" w:w="120"/>
+            </w:tcMar>
+            <w:vAlign w:val="center"/>
+          </w:tcPr>
+          <w:p>
+            <w:r>
+              <w:rPr>
+                <w:rFonts w:ascii="Calibri" w:cs="Calibri" w:eastAsia="Calibri" w:hAnsi="Calibri"/>
+                <w:b/>
+                <w:bCs/>
+                <w:color w:val="3D5038"/>
+                <w:sz w:val="20"/>
+                <w:szCs w:val="20"/>
+              </w:rPr>
+              <w:t xml:space="preserve">City</w:t>
+            </w:r>
+          </w:p>
+        </w:tc>
+        <w:tc>
+          <w:tcPr>
+            <w:shd w:fill="E8F3DC" w:val="clear"/>
+            <w:tcMar>
+              <w:top w:type="dxa" w:w="80"/>
+              <w:left w:type="dxa" w:w="120"/>
+              <w:bottom w:type="dxa" w:w="80"/>
+              <w:right w:type="dxa" w:w="120"/>
+            </w:tcMar>
+            <w:vAlign w:val="center"/>
+          </w:tcPr>
+          <w:p>
+            <w:r>
+              <w:rPr>
+                <w:rFonts w:ascii="Calibri" w:cs="Calibri" w:eastAsia="Calibri" w:hAnsi="Calibri"/>
+                <w:b/>
+                <w:bCs/>
+                <w:color w:val="3D5038"/>
+                <w:sz w:val="20"/>
+                <w:szCs w:val="20"/>
+              </w:rPr>
+              <w:t xml:space="preserve">Avg high (actual/met. feels)</w:t>
+            </w:r>
+          </w:p>
+        </w:tc>
+        <w:tc>
+          <w:tcPr>
+            <w:shd w:fill="E8F3DC" w:val="clear"/>
+            <w:tcMar>
+              <w:top w:type="dxa" w:w="80"/>
+              <w:left w:type="dxa" w:w="120"/>
+              <w:bottom w:type="dxa" w:w="80"/>
+              <w:right w:type="dxa" w:w="120"/>
+            </w:tcMar>
+            <w:vAlign w:val="center"/>
+          </w:tcPr>
+          <w:p>
+            <w:r>
+              <w:rPr>
+                <w:rFonts w:ascii="Calibri" w:cs="Calibri" w:eastAsia="Calibri" w:hAnsi="Calibri"/>
+                <w:b/>
+                <w:bCs/>
+                <w:color w:val="3D5038"/>
+                <w:sz w:val="20"/>
+                <w:szCs w:val="20"/>
+              </w:rPr>
+              <w:t xml:space="preserve">Avg low (actual/met. feels)</w:t>
+            </w:r>
+          </w:p>
+        </w:tc>
+        <w:tc>
+          <w:tcPr>
+            <w:shd w:fill="E8F3DC" w:val="clear"/>
+            <w:tcMar>
+              <w:top w:type="dxa" w:w="80"/>
+              <w:left w:type="dxa" w:w="120"/>
+              <w:bottom w:type="dxa" w:w="80"/>
+              <w:right w:type="dxa" w:w="120"/>
+            </w:tcMar>
+            <w:vAlign w:val="center"/>
+          </w:tcPr>
+          <w:p>
+            <w:r>
+              <w:rPr>
+                <w:rFonts w:ascii="Calibri" w:cs="Calibri" w:eastAsia="Calibri" w:hAnsi="Calibri"/>
+                <w:b/>
+                <w:bCs/>
+                <w:color w:val="3D5038"/>
+                <w:sz w:val="20"/>
+                <w:szCs w:val="20"/>
+              </w:rPr>
+              <w:t xml:space="preserve">Daily mean (actual/met. feels)</w:t>
+            </w:r>
+          </w:p>
+        </w:tc>
+      </w:tr>
+      <w:tr>
+        <w:tc>
+          <w:tcPr>
+            <w:tcMar>
+              <w:top w:type="dxa" w:w="80"/>
+              <w:left w:type="dxa" w:w="120"/>
+              <w:bottom w:type="dxa" w:w="80"/>
+              <w:right w:type="dxa" w:w="120"/>
+            </w:tcMar>
+            <w:vAlign w:val="center"/>
+          </w:tcPr>
+          <w:p>
+            <w:r>
+              <w:rPr>
+                <w:rFonts w:ascii="Calibri" w:cs="Calibri" w:eastAsia="Calibri" w:hAnsi="Calibri"/>
+                <w:b/>
+                <w:bCs/>
+                <w:color w:val="3D5038"/>
+                <w:sz w:val="20"/>
+                <w:szCs w:val="20"/>
+              </w:rPr>
+              <w:t xml:space="preserve">Chengdu</w:t>
+            </w:r>
+          </w:p>
+        </w:tc>
+        <w:tc>
+          <w:tcPr>
+            <w:tcMar>
+              <w:top w:type="dxa" w:w="80"/>
+              <w:left w:type="dxa" w:w="120"/>
+              <w:bottom w:type="dxa" w:w="80"/>
+              <w:right w:type="dxa" w:w="120"/>
+            </w:tcMar>
+            <w:vAlign w:val="center"/>
+          </w:tcPr>
+          <w:p>
+            <w:r>
+              <w:rPr>
+                <w:rFonts w:ascii="Calibri" w:cs="Calibri" w:eastAsia="Calibri" w:hAnsi="Calibri"/>
+                <w:color w:val="3D5038"/>
+                <w:sz w:val="20"/>
+                <w:szCs w:val="20"/>
+              </w:rPr>
+              <w:t xml:space="preserve">68 / 68°F</w:t>
+            </w:r>
+          </w:p>
+        </w:tc>
+        <w:tc>
+          <w:tcPr>
+            <w:tcMar>
+              <w:top w:type="dxa" w:w="80"/>
+              <w:left w:type="dxa" w:w="120"/>
+              <w:bottom w:type="dxa" w:w="80"/>
+              <w:right w:type="dxa" w:w="120"/>
+            </w:tcMar>
+            <w:vAlign w:val="center"/>
+          </w:tcPr>
+          <w:p>
+            <w:r>
+              <w:rPr>
+                <w:rFonts w:ascii="Calibri" w:cs="Calibri" w:eastAsia="Calibri" w:hAnsi="Calibri"/>
+                <w:color w:val="3D5038"/>
+                <w:sz w:val="20"/>
+                <w:szCs w:val="20"/>
+              </w:rPr>
+              <w:t xml:space="preserve">57 / 57°F</w:t>
+            </w:r>
+          </w:p>
+        </w:tc>
+        <w:tc>
+          <w:tcPr>
+            <w:tcMar>
+              <w:top w:type="dxa" w:w="80"/>
+              <w:left w:type="dxa" w:w="120"/>
+              <w:bottom w:type="dxa" w:w="80"/>
+              <w:right w:type="dxa" w:w="120"/>
+            </w:tcMar>
+            <w:vAlign w:val="center"/>
+          </w:tcPr>
+          <w:p>
+            <w:r>
+              <w:rPr>
+                <w:rFonts w:ascii="Calibri" w:cs="Calibri" w:eastAsia="Calibri" w:hAnsi="Calibri"/>
+                <w:color w:val="3D5038"/>
+                <w:sz w:val="20"/>
+                <w:szCs w:val="20"/>
+              </w:rPr>
+              <w:t xml:space="preserve">63 / 63°F</w:t>
+            </w:r>
+          </w:p>
+        </w:tc>
+      </w:tr>
+      <w:tr>
+        <w:tc>
+          <w:tcPr>
+            <w:tcMar>
+              <w:top w:type="dxa" w:w="80"/>
+              <w:left w:type="dxa" w:w="120"/>
+              <w:bottom w:type="dxa" w:w="80"/>
+              <w:right w:type="dxa" w:w="120"/>
+            </w:tcMar>
+            <w:vAlign w:val="center"/>
+          </w:tcPr>
+          <w:p>
+            <w:r>
+              <w:rPr>
+                <w:rFonts w:ascii="Calibri" w:cs="Calibri" w:eastAsia="Calibri" w:hAnsi="Calibri"/>
+                <w:b/>
+                <w:bCs/>
+                <w:color w:val="3D5038"/>
+                <w:sz w:val="20"/>
+                <w:szCs w:val="20"/>
+              </w:rPr>
+              <w:t xml:space="preserve">Chongqing</w:t>
+            </w:r>
+          </w:p>
+        </w:tc>
+        <w:tc>
+          <w:tcPr>
+            <w:tcMar>
+              <w:top w:type="dxa" w:w="80"/>
+              <w:left w:type="dxa" w:w="120"/>
+              <w:bottom w:type="dxa" w:w="80"/>
+              <w:right w:type="dxa" w:w="120"/>
+            </w:tcMar>
+            <w:vAlign w:val="center"/>
+          </w:tcPr>
+          <w:p>
+            <w:r>
+              <w:rPr>
+                <w:rFonts w:ascii="Calibri" w:cs="Calibri" w:eastAsia="Calibri" w:hAnsi="Calibri"/>
+                <w:color w:val="3D5038"/>
+                <w:sz w:val="20"/>
+                <w:szCs w:val="20"/>
+              </w:rPr>
+              <w:t xml:space="preserve">71 / 73°F</w:t>
+            </w:r>
+          </w:p>
+        </w:tc>
+        <w:tc>
+          <w:tcPr>
+            <w:tcMar>
+              <w:top w:type="dxa" w:w="80"/>
+              <w:left w:type="dxa" w:w="120"/>
+              <w:bottom w:type="dxa" w:w="80"/>
+              <w:right w:type="dxa" w:w="120"/>
+            </w:tcMar>
+            <w:vAlign w:val="center"/>
+          </w:tcPr>
+          <w:p>
+            <w:r>
+              <w:rPr>
+                <w:rFonts w:ascii="Calibri" w:cs="Calibri" w:eastAsia="Calibri" w:hAnsi="Calibri"/>
+                <w:color w:val="3D5038"/>
+                <w:sz w:val="20"/>
+                <w:szCs w:val="20"/>
+              </w:rPr>
+              <w:t xml:space="preserve">60 / 61°F</w:t>
+            </w:r>
+          </w:p>
+        </w:tc>
+        <w:tc>
+          <w:tcPr>
+            <w:tcMar>
+              <w:top w:type="dxa" w:w="80"/>
+              <w:left w:type="dxa" w:w="120"/>
+              <w:bottom w:type="dxa" w:w="80"/>
+              <w:right w:type="dxa" w:w="120"/>
+            </w:tcMar>
+            <w:vAlign w:val="center"/>
+          </w:tcPr>
+          <w:p>
+            <w:r>
+              <w:rPr>
+                <w:rFonts w:ascii="Calibri" w:cs="Calibri" w:eastAsia="Calibri" w:hAnsi="Calibri"/>
+                <w:color w:val="3D5038"/>
+                <w:sz w:val="20"/>
+                <w:szCs w:val="20"/>
+              </w:rPr>
+              <w:t xml:space="preserve">65 / 67°F</w:t>
+            </w:r>
+          </w:p>
+        </w:tc>
+      </w:tr>
+      <w:tr>
+        <w:tc>
+          <w:tcPr>
+            <w:tcMar>
+              <w:top w:type="dxa" w:w="80"/>
+              <w:left w:type="dxa" w:w="120"/>
+              <w:bottom w:type="dxa" w:w="80"/>
+              <w:right w:type="dxa" w:w="120"/>
+            </w:tcMar>
+            <w:vAlign w:val="center"/>
+          </w:tcPr>
+          <w:p>
+            <w:r>
+              <w:rPr>
+                <w:rFonts w:ascii="Calibri" w:cs="Calibri" w:eastAsia="Calibri" w:hAnsi="Calibri"/>
+                <w:b/>
+                <w:bCs/>
+                <w:color w:val="3D5038"/>
+                <w:sz w:val="20"/>
+                <w:szCs w:val="20"/>
+              </w:rPr>
+              <w:t xml:space="preserve">Jiuzhaigou</w:t>
+            </w:r>
+          </w:p>
+        </w:tc>
+        <w:tc>
+          <w:tcPr>
+            <w:tcMar>
+              <w:top w:type="dxa" w:w="80"/>
+              <w:left w:type="dxa" w:w="120"/>
+              <w:bottom w:type="dxa" w:w="80"/>
+              <w:right w:type="dxa" w:w="120"/>
+            </w:tcMar>
+            <w:vAlign w:val="center"/>
+          </w:tcPr>
+          <w:p>
+            <w:r>
+              <w:rPr>
+                <w:rFonts w:ascii="Calibri" w:cs="Calibri" w:eastAsia="Calibri" w:hAnsi="Calibri"/>
+                <w:color w:val="3D5038"/>
+                <w:sz w:val="20"/>
+                <w:szCs w:val="20"/>
+              </w:rPr>
+              <w:t xml:space="preserve">54 / 52°F</w:t>
+            </w:r>
+          </w:p>
+        </w:tc>
+        <w:tc>
+          <w:tcPr>
+            <w:tcMar>
+              <w:top w:type="dxa" w:w="80"/>
+              <w:left w:type="dxa" w:w="120"/>
+              <w:bottom w:type="dxa" w:w="80"/>
+              <w:right w:type="dxa" w:w="120"/>
+            </w:tcMar>
+            <w:vAlign w:val="center"/>
+          </w:tcPr>
+          <w:p>
+            <w:r>
+              <w:rPr>
+                <w:rFonts w:ascii="Calibri" w:cs="Calibri" w:eastAsia="Calibri" w:hAnsi="Calibri"/>
+                <w:color w:val="3D5038"/>
+                <w:sz w:val="20"/>
+                <w:szCs w:val="20"/>
+              </w:rPr>
+              <w:t xml:space="preserve">41 / 37°F</w:t>
+            </w:r>
+          </w:p>
+        </w:tc>
+        <w:tc>
+          <w:tcPr>
+            <w:tcMar>
+              <w:top w:type="dxa" w:w="80"/>
+              <w:left w:type="dxa" w:w="120"/>
+              <w:bottom w:type="dxa" w:w="80"/>
+              <w:right w:type="dxa" w:w="120"/>
+            </w:tcMar>
+            <w:vAlign w:val="center"/>
+          </w:tcPr>
+          <w:p>
+            <w:r>
+              <w:rPr>
+                <w:rFonts w:ascii="Calibri" w:cs="Calibri" w:eastAsia="Calibri" w:hAnsi="Calibri"/>
+                <w:color w:val="3D5038"/>
+                <w:sz w:val="20"/>
+                <w:szCs w:val="20"/>
+              </w:rPr>
+              <w:t xml:space="preserve">47 / 44°F</w:t>
+            </w:r>
+          </w:p>
+        </w:tc>
+      </w:tr>
+      <w:tr>
+        <w:tc>
+          <w:tcPr>
+            <w:tcMar>
+              <w:top w:type="dxa" w:w="80"/>
+              <w:left w:type="dxa" w:w="120"/>
+              <w:bottom w:type="dxa" w:w="80"/>
+              <w:right w:type="dxa" w:w="120"/>
+            </w:tcMar>
+            <w:vAlign w:val="center"/>
+          </w:tcPr>
+          <w:p>
+            <w:r>
+              <w:rPr>
+                <w:rFonts w:ascii="Calibri" w:cs="Calibri" w:eastAsia="Calibri" w:hAnsi="Calibri"/>
+                <w:b/>
+                <w:bCs/>
+                <w:color w:val="3D5038"/>
+                <w:sz w:val="20"/>
+                <w:szCs w:val="20"/>
+              </w:rPr>
+              <w:t xml:space="preserve">Chicago (reference)</w:t>
+            </w:r>
+          </w:p>
+        </w:tc>
+        <w:tc>
+          <w:tcPr>
+            <w:tcMar>
+              <w:top w:type="dxa" w:w="80"/>
+              <w:left w:type="dxa" w:w="120"/>
+              <w:bottom w:type="dxa" w:w="80"/>
+              <w:right w:type="dxa" w:w="120"/>
+            </w:tcMar>
+            <w:vAlign w:val="center"/>
+          </w:tcPr>
+          <w:p>
+            <w:r>
+              <w:rPr>
+                <w:rFonts w:ascii="Calibri" w:cs="Calibri" w:eastAsia="Calibri" w:hAnsi="Calibri"/>
+                <w:color w:val="3D5038"/>
+                <w:sz w:val="20"/>
+                <w:szCs w:val="20"/>
+              </w:rPr>
+              <w:t xml:space="preserve">60 / 54°F</w:t>
+            </w:r>
+          </w:p>
+        </w:tc>
+        <w:tc>
+          <w:tcPr>
+            <w:tcMar>
+              <w:top w:type="dxa" w:w="80"/>
+              <w:left w:type="dxa" w:w="120"/>
+              <w:bottom w:type="dxa" w:w="80"/>
+              <w:right w:type="dxa" w:w="120"/>
+            </w:tcMar>
+            <w:vAlign w:val="center"/>
+          </w:tcPr>
+          <w:p>
+            <w:r>
+              <w:rPr>
+                <w:rFonts w:ascii="Calibri" w:cs="Calibri" w:eastAsia="Calibri" w:hAnsi="Calibri"/>
+                <w:color w:val="3D5038"/>
+                <w:sz w:val="20"/>
+                <w:szCs w:val="20"/>
+              </w:rPr>
+              <w:t xml:space="preserve">46 / 40°F</w:t>
+            </w:r>
+          </w:p>
+        </w:tc>
+        <w:tc>
+          <w:tcPr>
+            <w:tcMar>
+              <w:top w:type="dxa" w:w="80"/>
+              <w:left w:type="dxa" w:w="120"/>
+              <w:bottom w:type="dxa" w:w="80"/>
+              <w:right w:type="dxa" w:w="120"/>
+            </w:tcMar>
+            <w:vAlign w:val="center"/>
+          </w:tcPr>
+          <w:p>
+            <w:r>
+              <w:rPr>
+                <w:rFonts w:ascii="Calibri" w:cs="Calibri" w:eastAsia="Calibri" w:hAnsi="Calibri"/>
+                <w:color w:val="3D5038"/>
+                <w:sz w:val="20"/>
+                <w:szCs w:val="20"/>
+              </w:rPr>
+              <w:t xml:space="preserve">54 / 46°F</w:t>
+            </w:r>
+          </w:p>
+        </w:tc>
+      </w:tr>
+    </w:tbl>
+    <w:p>
+      <w:pPr>
+        <w:spacing w:after="120"/>
+      </w:pPr>
+    </w:p>
+    <w:p>
+      <w:pPr>
+        <w:spacing w:after="80" w:before="120"/>
+      </w:pPr>
+      <w:r>
+        <w:rPr>
+          <w:rFonts w:ascii="Calibri" w:cs="Calibri" w:eastAsia="Calibri" w:hAnsi="Calibri"/>
+          <w:b/>
+          <w:bCs/>
+          <w:color w:val="4A7A38"/>
+          <w:sz w:val="24"/>
+          <w:szCs w:val="24"/>
+        </w:rPr>
+        <w:t xml:space="preserve">Sun, cloud &amp; rain (Oct 15–30, 2021–2025)</w:t>
+      </w:r>
+    </w:p>
+    <w:p>
+      <w:pPr>
+        <w:spacing w:after="60"/>
+      </w:pPr>
+      <w:r>
+        <w:rPr>
+          <w:rFonts w:ascii="Calibri" w:cs="Calibri" w:eastAsia="Calibri" w:hAnsi="Calibri"/>
+          <w:b/>
+          <w:bCs/>
+          <w:color w:val="4A7A38"/>
+          <w:sz w:val="22"/>
+          <w:szCs w:val="22"/>
+        </w:rPr>
+        <w:t xml:space="preserve">Rain amount guide</w:t>
+      </w:r>
+    </w:p>
+    <w:p>
+      <w:pPr>
+        <w:spacing w:after="40"/>
+      </w:pPr>
+      <w:r>
+        <w:rPr>
+          <w:rFonts w:ascii="Calibri" w:cs="Calibri" w:eastAsia="Calibri" w:hAnsi="Calibri"/>
+          <w:color w:val="3D5038"/>
+          <w:sz w:val="20"/>
+          <w:szCs w:val="20"/>
+        </w:rPr>
+        <w:t xml:space="preserve">🌫️ Mist / trace (&lt;1 mm/day) — Usually no gear</w:t>
+      </w:r>
+    </w:p>
+    <w:p>
+      <w:pPr>
+        <w:spacing w:after="40"/>
+      </w:pPr>
+      <w:r>
+        <w:rPr>
+          <w:rFonts w:ascii="Calibri" w:cs="Calibri" w:eastAsia="Calibri" w:hAnsi="Calibri"/>
+          <w:color w:val="3D5038"/>
+          <w:sz w:val="20"/>
+          <w:szCs w:val="20"/>
+        </w:rPr>
+        <w:t xml:space="preserve">🌦️ Drizzle (1–5 mm/day) — ☂️ Umbrella</w:t>
+      </w:r>
+    </w:p>
+    <w:p>
+      <w:pPr>
+        <w:spacing w:after="40"/>
+      </w:pPr>
+      <w:r>
+        <w:rPr>
+          <w:rFonts w:ascii="Calibri" w:cs="Calibri" w:eastAsia="Calibri" w:hAnsi="Calibri"/>
+          <w:color w:val="3D5038"/>
+          <w:sz w:val="20"/>
+          <w:szCs w:val="20"/>
+        </w:rPr>
+        <w:t xml:space="preserve">🌧️ Light rain (5–15 mm/day) — ☂️ Umbrella</w:t>
+      </w:r>
+    </w:p>
+    <w:p>
+      <w:pPr>
+        <w:spacing w:after="40"/>
+      </w:pPr>
+      <w:r>
+        <w:rPr>
+          <w:rFonts w:ascii="Calibri" w:cs="Calibri" w:eastAsia="Calibri" w:hAnsi="Calibri"/>
+          <w:color w:val="3D5038"/>
+          <w:sz w:val="20"/>
+          <w:szCs w:val="20"/>
+        </w:rPr>
+        <w:t xml:space="preserve">☔ Moderate rain (15–30 mm/day) — 🧥 Rain jacket</w:t>
+      </w:r>
+    </w:p>
+    <w:p>
+      <w:pPr>
+        <w:spacing w:after="40"/>
+      </w:pPr>
+      <w:r>
+        <w:rPr>
+          <w:rFonts w:ascii="Calibri" w:cs="Calibri" w:eastAsia="Calibri" w:hAnsi="Calibri"/>
+          <w:color w:val="3D5038"/>
+          <w:sz w:val="20"/>
+          <w:szCs w:val="20"/>
+        </w:rPr>
+        <w:t xml:space="preserve">⛈️ Heavy rain (30+ mm/day) — 🧥 Rain jacket + grips</w:t>
+      </w:r>
+    </w:p>
+    <w:p>
+      <w:pPr>
+        <w:spacing w:after="40"/>
+      </w:pPr>
+    </w:p>
+    <w:p>
+      <w:pPr>
+        <w:spacing w:after="40" w:before="80"/>
+      </w:pPr>
+      <w:r>
+        <w:rPr>
+          <w:rFonts w:ascii="Calibri" w:cs="Calibri" w:eastAsia="Calibri" w:hAnsi="Calibri"/>
+          <w:b/>
+          <w:bCs/>
+          <w:color w:val="3D5038"/>
+          <w:sz w:val="22"/>
+          <w:szCs w:val="22"/>
+        </w:rPr>
+        <w:t xml:space="preserve">Chengdu</w:t>
+      </w:r>
+    </w:p>
+    <w:p>
+      <w:pPr>
+        <w:spacing w:after="60"/>
+      </w:pPr>
+      <w:r>
+        <w:rPr>
+          <w:rFonts w:ascii="Calibri" w:cs="Calibri" w:eastAsia="Calibri" w:hAnsi="Calibri"/>
+          <w:color w:val="3D5038"/>
+          <w:sz w:val="21"/>
+          <w:szCs w:val="21"/>
+        </w:rPr>
+        <w:t xml:space="preserve">Sunshine / cloud: Rare all-day blue sky. ~30% bright (≥6 h sun), ~26% mixed clouds, ~44% overcast/gloomy (&lt;2 h sun)—often gray even when rain is only drizzle; ~15% are dry but overcast. Soft, flat light for photos. (Sunny 30% · Partly sunny 26% · Cloudy 44%)</w:t>
+      </w:r>
+    </w:p>
+    <w:p>
+      <w:pPr>
+        <w:spacing w:after="60"/>
+      </w:pPr>
+      <w:r>
+        <w:rPr>
+          <w:rFonts w:ascii="Calibri" w:cs="Calibri" w:eastAsia="Calibri" w:hAnsi="Calibri"/>
+          <w:color w:val="3D5038"/>
+          <w:sz w:val="21"/>
+          <w:szCs w:val="21"/>
+        </w:rPr>
+        <w:t xml:space="preserve">When: Classic basin pattern: ~59% of rain falls 7 pm–7 am. Still, ~60% of rainy days also have rain 9 am–5 pm—mornings are often overcast and damp; keep an umbrella for sightseeing.</w:t>
+      </w:r>
+    </w:p>
+    <w:p>
+      <w:pPr>
+        <w:spacing w:after="100"/>
+      </w:pPr>
+      <w:r>
+        <w:rPr>
+          <w:rFonts w:ascii="Calibri" w:cs="Calibri" w:eastAsia="Calibri" w:hAnsi="Calibri"/>
+          <w:color w:val="3D5038"/>
+          <w:sz w:val="21"/>
+          <w:szCs w:val="21"/>
+        </w:rPr>
+        <w:t xml:space="preserve">Rainfall: 🌦️Drizzle·usual · 🌧️Light rain·occasional — ~32 mm over 16 days (~2 mm/day avg). Rain on ~73% of days.</w:t>
+      </w:r>
+    </w:p>
+    <w:p>
+      <w:pPr>
+        <w:spacing w:after="40" w:before="80"/>
+      </w:pPr>
+      <w:r>
+        <w:rPr>
+          <w:rFonts w:ascii="Calibri" w:cs="Calibri" w:eastAsia="Calibri" w:hAnsi="Calibri"/>
+          <w:b/>
+          <w:bCs/>
+          <w:color w:val="3D5038"/>
+          <w:sz w:val="22"/>
+          <w:szCs w:val="22"/>
+        </w:rPr>
+        <w:t xml:space="preserve">Chongqing</w:t>
+      </w:r>
+    </w:p>
+    <w:p>
+      <w:pPr>
+        <w:spacing w:after="60"/>
+      </w:pPr>
+      <w:r>
+        <w:rPr>
+          <w:rFonts w:ascii="Calibri" w:cs="Calibri" w:eastAsia="Calibri" w:hAnsi="Calibri"/>
+          <w:color w:val="3D5038"/>
+          <w:sz w:val="21"/>
+          <w:szCs w:val="21"/>
+        </w:rPr>
+        <w:t xml:space="preserve">Sunshine / cloud: Slightly sunnier than Chengdu. ~41% bright, ~21% mixed, ~38% overcast/gloomy—the “Fog City” nickname fits, but ~4 in 10 days still see good sunshine. (Sunny 41% · Partly sunny 21% · Cloudy 38%)</w:t>
+      </w:r>
+    </w:p>
+    <w:p>
+      <w:pPr>
+        <w:spacing w:after="60"/>
+      </w:pPr>
+      <w:r>
+        <w:rPr>
+          <w:rFonts w:ascii="Calibri" w:cs="Calibri" w:eastAsia="Calibri" w:hAnsi="Calibri"/>
+          <w:color w:val="3D5038"/>
+          <w:sz w:val="21"/>
+          <w:szCs w:val="21"/>
+        </w:rPr>
+        <w:t xml:space="preserve">When: Rain falls fairly evenly day and night. ~75% of rainy days have rain 9 am–5 pm—daytime drizzle is more common than in Chengdu; keep rain gear handy while sightseeing.</w:t>
+      </w:r>
+    </w:p>
+    <w:p>
+      <w:pPr>
+        <w:spacing w:after="100"/>
+      </w:pPr>
+      <w:r>
+        <w:rPr>
+          <w:rFonts w:ascii="Calibri" w:cs="Calibri" w:eastAsia="Calibri" w:hAnsi="Calibri"/>
+          <w:color w:val="3D5038"/>
+          <w:sz w:val="21"/>
+          <w:szCs w:val="21"/>
+        </w:rPr>
+        <w:t xml:space="preserve">Rainfall: 🌦️Drizzle·usual · 🌧️Light rain·common · ☔Moderate rain·occasional · ⛈️Heavy rain·rare — ~66 mm over 16 days (~4 mm/day avg). Rain on ~59% of days (~7 mm on rainy days).</w:t>
+      </w:r>
+    </w:p>
+    <w:p>
+      <w:pPr>
+        <w:spacing w:after="40" w:before="80"/>
+      </w:pPr>
+      <w:r>
+        <w:rPr>
+          <w:rFonts w:ascii="Calibri" w:cs="Calibri" w:eastAsia="Calibri" w:hAnsi="Calibri"/>
+          <w:b/>
+          <w:bCs/>
+          <w:color w:val="3D5038"/>
+          <w:sz w:val="22"/>
+          <w:szCs w:val="22"/>
+        </w:rPr>
+        <w:t xml:space="preserve">Jiuzhaigou</w:t>
+      </w:r>
+    </w:p>
+    <w:p>
+      <w:pPr>
+        <w:spacing w:after="60"/>
+      </w:pPr>
+      <w:r>
+        <w:rPr>
+          <w:rFonts w:ascii="Calibri" w:cs="Calibri" w:eastAsia="Calibri" w:hAnsi="Calibri"/>
+          <w:color w:val="3D5038"/>
+          <w:sz w:val="21"/>
+          <w:szCs w:val="21"/>
+        </w:rPr>
+        <w:t xml:space="preserve">Sunshine / cloud: Sunniest stop on the trip. ~53% bright, ~19% mixed, ~29% overcast/misty—sun and drizzle often coexist; lake colors pop when breaks appear. (Sunny 53% · Partly sunny 19% · Cloudy 29%)</w:t>
+      </w:r>
+    </w:p>
+    <w:p>
+      <w:pPr>
+        <w:spacing w:after="60"/>
+      </w:pPr>
+      <w:r>
+        <w:rPr>
+          <w:rFonts w:ascii="Calibri" w:cs="Calibri" w:eastAsia="Calibri" w:hAnsi="Calibri"/>
+          <w:color w:val="3D5038"/>
+          <w:sz w:val="21"/>
+          <w:szCs w:val="21"/>
+        </w:rPr>
+        <w:t xml:space="preserve">When: One of the wettest windows (~89% of days with precipitation). Expect all-day mist and intermittent drizzle; ~61% of rainy days also see rain 9 am–5 pm—plan for rain on nearly every valley day.</w:t>
+      </w:r>
+    </w:p>
+    <w:p>
+      <w:pPr>
+        <w:spacing w:after="100"/>
+      </w:pPr>
+      <w:r>
+        <w:rPr>
+          <w:rFonts w:ascii="Calibri" w:cs="Calibri" w:eastAsia="Calibri" w:hAnsi="Calibri"/>
+          <w:color w:val="3D5038"/>
+          <w:sz w:val="21"/>
+          <w:szCs w:val="21"/>
+        </w:rPr>
+        <w:t xml:space="preserve">Rainfall: 🌫️Mist / trace·usual · 🌦️Drizzle·common · 🌧️Light rain·occasional — ~34 mm over 16 days (~2 mm/day avg). Rain on ~89% of days—almost daily.</w:t>
+      </w:r>
+    </w:p>
+    <w:p>
+      <w:pPr>
+        <w:spacing w:after="40" w:before="80"/>
+      </w:pPr>
+      <w:r>
+        <w:rPr>
+          <w:rFonts w:ascii="Calibri" w:cs="Calibri" w:eastAsia="Calibri" w:hAnsi="Calibri"/>
+          <w:b/>
+          <w:bCs/>
+          <w:color w:val="3D5038"/>
+          <w:sz w:val="22"/>
+          <w:szCs w:val="22"/>
+        </w:rPr>
+        <w:t xml:space="preserve">Chicago (reference)</w:t>
+      </w:r>
+    </w:p>
+    <w:p>
+      <w:pPr>
+        <w:spacing w:after="60"/>
+      </w:pPr>
+      <w:r>
+        <w:rPr>
+          <w:rFonts w:ascii="Calibri" w:cs="Calibri" w:eastAsia="Calibri" w:hAnsi="Calibri"/>
+          <w:color w:val="3D5038"/>
+          <w:sz w:val="21"/>
+          <w:szCs w:val="21"/>
+        </w:rPr>
+        <w:t xml:space="preserve">Sunshine / cloud: (Reference) ~73% bright, ~15% mixed, only ~13% gloomy—much sunnier than Sichuan/Chongqing in the same window. (Sunny 73% · Partly sunny 15% · Cloudy 13%)</w:t>
+      </w:r>
+    </w:p>
+    <w:p>
+      <w:pPr>
+        <w:spacing w:after="60"/>
+      </w:pPr>
+      <w:r>
+        <w:rPr>
+          <w:rFonts w:ascii="Calibri" w:cs="Calibri" w:eastAsia="Calibri" w:hAnsi="Calibri"/>
+          <w:color w:val="3D5038"/>
+          <w:sz w:val="21"/>
+          <w:szCs w:val="21"/>
+        </w:rPr>
+        <w:t xml:space="preserve">When: For comparison only—you will not be in Chicago during this trip. Wind lowers feels-like more than Sichuan humidity in this season.</w:t>
+      </w:r>
+    </w:p>
+    <w:p>
+      <w:pPr>
+        <w:spacing w:after="100"/>
+      </w:pPr>
+      <w:r>
+        <w:rPr>
+          <w:rFonts w:ascii="Calibri" w:cs="Calibri" w:eastAsia="Calibri" w:hAnsi="Calibri"/>
+          <w:color w:val="3D5038"/>
+          <w:sz w:val="21"/>
+          <w:szCs w:val="21"/>
+        </w:rPr>
+        <w:t xml:space="preserve">Rainfall: 🌧️Light rain·common · ☔Moderate rain·occasional · ⛈️Heavy rain·rare — ~55 mm over 16 days (~3.4 mm/day avg). Rain on ~43% of days (~8 mm when it rains).</w:t>
+      </w:r>
+    </w:p>
+    <w:p>
+      <w:pPr>
+        <w:spacing w:after="80" w:before="120"/>
+      </w:pPr>
+      <w:r>
+        <w:rPr>
+          <w:rFonts w:ascii="Calibri" w:cs="Calibri" w:eastAsia="Calibri" w:hAnsi="Calibri"/>
+          <w:b/>
+          <w:bCs/>
+          <w:color w:val="4A7A38"/>
+          <w:sz w:val="24"/>
+          <w:szCs w:val="24"/>
+        </w:rPr>
+        <w:t xml:space="preserve">What to pack</w:t>
+      </w:r>
+    </w:p>
+    <w:p>
+      <w:pPr>
+        <w:spacing w:after="60" w:before="80"/>
+      </w:pPr>
+      <w:r>
+        <w:rPr>
+          <w:rFonts w:ascii="Calibri" w:cs="Calibri" w:eastAsia="Calibri" w:hAnsi="Calibri"/>
+          <w:b/>
+          <w:bCs/>
+          <w:color w:val="3D5038"/>
+          <w:sz w:val="22"/>
+          <w:szCs w:val="22"/>
+        </w:rPr>
+        <w:t xml:space="preserve">Chengdu &amp; Chongqing (D1–D3, D6–D10)</w:t>
+      </w:r>
+    </w:p>
+    <w:p>
+      <w:pPr>
+        <w:spacing w:after="80"/>
+      </w:pPr>
+      <w:r>
+        <w:rPr>
+          <w:rFonts w:ascii="Calibri" w:cs="Calibri" w:eastAsia="Calibri" w:hAnsi="Calibri"/>
+          <w:color w:val="3D5038"/>
+          <w:sz w:val="21"/>
+          <w:szCs w:val="21"/>
+        </w:rPr>
+        <w:t xml:space="preserve">• Daytime: breathable long-sleeve tee or light knit; pack a layer you can add/remove</w:t>
+      </w:r>
+    </w:p>
+    <w:p>
+      <w:pPr>
+        <w:spacing w:after="80"/>
+      </w:pPr>
+      <w:r>
+        <w:rPr>
+          <w:rFonts w:ascii="Calibri" w:cs="Calibri" w:eastAsia="Calibri" w:hAnsi="Calibri"/>
+          <w:color w:val="3D5038"/>
+          <w:sz w:val="21"/>
+          <w:szCs w:val="21"/>
+        </w:rPr>
+        <w:t xml:space="preserve">• Evenings &amp; AC indoors: light windbreaker or fleece—on overcast/drizzle days, dress ~3–5°C (5–9°F) lower than the table (damp-air guide above)</w:t>
+      </w:r>
+    </w:p>
+    <w:p>
+      <w:pPr>
+        <w:spacing w:after="80"/>
+      </w:pPr>
+      <w:r>
+        <w:rPr>
+          <w:rFonts w:ascii="Calibri" w:cs="Calibri" w:eastAsia="Calibri" w:hAnsi="Calibri"/>
+          <w:color w:val="3D5038"/>
+          <w:sz w:val="21"/>
+          <w:szCs w:val="21"/>
+        </w:rPr>
+        <w:t xml:space="preserve">• Rain gear: compact umbrella for drizzle (1–5 mm); light rain jacket if Chongqing shows moderate rain in the forecast</w:t>
+      </w:r>
+    </w:p>
+    <w:p>
+      <w:pPr>
+        <w:spacing w:after="80"/>
+      </w:pPr>
+      <w:r>
+        <w:rPr>
+          <w:rFonts w:ascii="Calibri" w:cs="Calibri" w:eastAsia="Calibri" w:hAnsi="Calibri"/>
+          <w:color w:val="3D5038"/>
+          <w:sz w:val="21"/>
+          <w:szCs w:val="21"/>
+        </w:rPr>
+        <w:t xml:space="preserve">• Footwear: grippy walking shoes; Chongqing has many stairs—avoid stiff new soles</w:t>
+      </w:r>
+    </w:p>
+    <w:p>
+      <w:pPr>
+        <w:spacing w:after="60" w:before="80"/>
+      </w:pPr>
+      <w:r>
+        <w:rPr>
+          <w:rFonts w:ascii="Calibri" w:cs="Calibri" w:eastAsia="Calibri" w:hAnsi="Calibri"/>
+          <w:b/>
+          <w:bCs/>
+          <w:color w:val="3D5038"/>
+          <w:sz w:val="22"/>
+          <w:szCs w:val="22"/>
+        </w:rPr>
+        <w:t xml:space="preserve">Jiuzhaigou (D4–D6)</w:t>
+      </w:r>
+    </w:p>
+    <w:p>
+      <w:pPr>
+        <w:spacing w:after="80"/>
+      </w:pPr>
+      <w:r>
+        <w:rPr>
+          <w:rFonts w:ascii="Calibri" w:cs="Calibri" w:eastAsia="Calibri" w:hAnsi="Calibri"/>
+          <w:color w:val="3D5038"/>
+          <w:sz w:val="21"/>
+          <w:szCs w:val="21"/>
+        </w:rPr>
+        <w:t xml:space="preserve">• Daytime in the valley: base layer + fleece/sweater + windproof shell from the met feels-like row (~11°C / 52°F)—add another layer when mist/drizzle wets your shell (~2–4°C colder in practice)</w:t>
+      </w:r>
+    </w:p>
+    <w:p>
+      <w:pPr>
+        <w:spacing w:after="80"/>
+      </w:pPr>
+      <w:r>
+        <w:rPr>
+          <w:rFonts w:ascii="Calibri" w:cs="Calibri" w:eastAsia="Calibri" w:hAnsi="Calibri"/>
+          <w:color w:val="3D5038"/>
+          <w:sz w:val="21"/>
+          <w:szCs w:val="21"/>
+        </w:rPr>
+        <w:t xml:space="preserve">• Early mornings &amp; evenings (06:45 train): light down or heavy fleece from met feels-like (~3°C / 37°F)—scarf, thin gloves; altitude + damp air bites harder than the number</w:t>
+      </w:r>
+    </w:p>
+    <w:p>
+      <w:pPr>
+        <w:spacing w:after="80"/>
+      </w:pPr>
+      <w:r>
+        <w:rPr>
+          <w:rFonts w:ascii="Calibri" w:cs="Calibri" w:eastAsia="Calibri" w:hAnsi="Calibri"/>
+          <w:color w:val="3D5038"/>
+          <w:sz w:val="21"/>
+          <w:szCs w:val="21"/>
+        </w:rPr>
+        <w:t xml:space="preserve">• Waterproof hiking shoes—persistent drizzle and mist; boardwalks get slick</w:t>
+      </w:r>
+    </w:p>
+    <w:p>
+      <w:pPr>
+        <w:spacing w:after="80"/>
+      </w:pPr>
+      <w:r>
+        <w:rPr>
+          <w:rFonts w:ascii="Calibri" w:cs="Calibri" w:eastAsia="Calibri" w:hAnsi="Calibri"/>
+          <w:color w:val="3D5038"/>
+          <w:sz w:val="21"/>
+          <w:szCs w:val="21"/>
+        </w:rPr>
+        <w:t xml:space="preserve">• Sunglasses &amp; sunscreen—strong UV at altitude even when it feels cold</w:t>
+      </w:r>
+    </w:p>
+    <w:p>
+      <w:pPr>
+        <w:spacing w:after="60" w:before="80"/>
+      </w:pPr>
+      <w:r>
+        <w:rPr>
+          <w:rFonts w:ascii="Calibri" w:cs="Calibri" w:eastAsia="Calibri" w:hAnsi="Calibri"/>
+          <w:b/>
+          <w:bCs/>
+          <w:color w:val="3D5038"/>
+          <w:sz w:val="22"/>
+          <w:szCs w:val="22"/>
+        </w:rPr>
+        <w:t xml:space="preserve">General</w:t>
+      </w:r>
+    </w:p>
+    <w:p>
+      <w:pPr>
+        <w:spacing w:after="80"/>
+      </w:pPr>
+      <w:r>
+        <w:rPr>
+          <w:rFonts w:ascii="Calibri" w:cs="Calibri" w:eastAsia="Calibri" w:hAnsi="Calibri"/>
+          <w:color w:val="3D5038"/>
+          <w:sz w:val="21"/>
+          <w:szCs w:val="21"/>
+        </w:rPr>
+        <w:t xml:space="preserve">• Quick-dry base layers beat cotton when you sweat or get caught in drizzle</w:t>
+      </w:r>
+    </w:p>
+    <w:p>
+      <w:pPr>
+        <w:spacing w:after="80"/>
+      </w:pPr>
+      <w:r>
+        <w:rPr>
+          <w:rFonts w:ascii="Calibri" w:cs="Calibri" w:eastAsia="Calibri" w:hAnsi="Calibri"/>
+          <w:color w:val="3D5038"/>
+          <w:sz w:val="21"/>
+          <w:szCs w:val="21"/>
+        </w:rPr>
+        <w:t xml:space="preserve">• 1–2 sets of wash-and-dry-fast clothes; small zip bags for damp items</w:t>
+      </w:r>
+    </w:p>
+    <w:p>
+      <w:pPr>
+        <w:spacing w:after="80"/>
+      </w:pPr>
+      <w:r>
+        <w:rPr>
+          <w:rFonts w:ascii="Calibri" w:cs="Calibri" w:eastAsia="Calibri" w:hAnsi="Calibri"/>
+          <w:color w:val="3D5038"/>
+          <w:sz w:val="21"/>
+          <w:szCs w:val="21"/>
+        </w:rPr>
+        <w:t xml:space="preserve">• No heavy winter coat needed for Chengdu/Chongqing cities; save bulk for Jiuzhaigou layers</w:t>
       </w:r>
     </w:p>
     <w:p>
@@ -4919,7 +6128,7 @@
           <w:sz w:val="20"/>
           <w:szCs w:val="20"/>
         </w:rPr>
-        <w:t xml:space="preserve">shuttle bus return to Chunxi Road. Free evening to buy souvenirs; hotel free luggage storage, pack for Jiuzhaigou trip.</w:t>
+        <w:t xml:space="preserve">shuttle bus return to Chunxi Road. Free evening to buy souvenirs; hotel free luggage storage, pack for Jiuzhaigou (see Weather &amp; Clothing—layers + waterproof shoes).</w:t>
       </w:r>
     </w:p>
     <w:p>
@@ -4977,7 +6186,7 @@
           <w:sz w:val="20"/>
           <w:szCs w:val="20"/>
         </w:rPr>
-        <w:t xml:space="preserve">Evening at Panda Hotel — free luggage storage, pack for Jiuzhaigou.</w:t>
+        <w:t xml:space="preserve">Evening at Panda Hotel — free luggage storage, pack for Jiuzhaigou (see Weather &amp; Clothing guide).</w:t>
       </w:r>
     </w:p>
     <w:p>

</xml_diff>

<commit_message>
Update weather translation - overcast to cloudy
</commit_message>
<xml_diff>
--- a/downloads/itinerary-en.docx
+++ b/downloads/itinerary-en.docx
@@ -250,7 +250,7 @@
           <w:sz w:val="21"/>
           <w:szCs w:val="21"/>
         </w:rPr>
-        <w:t xml:space="preserve">• Chengdu &amp; Chongqing: Dress as if ~3–5°C (5–9°F) lower than the table on overcast or drizzly days—especially evenings. The feels-like column understates damp air here.</w:t>
+        <w:t xml:space="preserve">• Chengdu &amp; Chongqing: Dress as if ~3–5°C (5–9°F) lower than the table on cloudy or drizzly days—especially evenings. The feels-like column understates damp air here.</w:t>
       </w:r>
     </w:p>
     <w:p>
@@ -264,7 +264,7 @@
           <w:sz w:val="21"/>
           <w:szCs w:val="21"/>
         </w:rPr>
-        <w:t xml:space="preserve">• Jiuzhaigou: Start from the feels-like column (wind already counted: ~11°C / 52°F day highs, ~3°C / 37°F mornings)—then add one extra layer for mist/drizzle and wet shoes. On gloomy days, treat it as another ~2–4°C (4–7°F) colder than that feels-like number. Most humid stop on the trip (~89% days with precipitation).</w:t>
+        <w:t xml:space="preserve">• Jiuzhaigou: Start from the feels-like column (wind already counted: ~11°C / 52°F day highs, ~3°C / 37°F mornings)—then add one extra layer for mist/drizzle and wet shoes. On cloudy days, treat it as another ~2–4°C (4–7°F) colder than that feels-like number. Most humid stop on the trip (~89% days with precipitation).</w:t>
       </w:r>
     </w:p>
     <w:p>
@@ -311,7 +311,7 @@
           <w:sz w:val="21"/>
           <w:szCs w:val="21"/>
         </w:rPr>
-        <w:t xml:space="preserve">Grouped by daily sunshine: bright (≥6 h), mixed (2–6 h), or overcast/gloomy (&lt;2 h). True all-day blue sky is rare in Chengdu and Chongqing; Jiuzhaigou sees more sun breaks despite frequent drizzle.</w:t>
+        <w:t xml:space="preserve">Grouped by daily sunshine: bright (≥6 h), mixed (2–6 h), or cloudy (&lt;2 h). True all-day blue sky is rare in Chengdu and Chongqing; Jiuzhaigou sees more sun breaks despite frequent drizzle.</w:t>
       </w:r>
     </w:p>
     <w:tbl>
@@ -942,7 +942,7 @@
           <w:sz w:val="21"/>
           <w:szCs w:val="21"/>
         </w:rPr>
-        <w:t xml:space="preserve">Sunshine / cloud: Rare all-day blue sky. ~30% bright (≥6 h sun), ~26% mixed clouds, ~44% overcast/gloomy (&lt;2 h sun)—often gray even when rain is only drizzle; ~15% are dry but overcast. Soft, flat light for photos. (Sunny 30% · Partly sunny 26% · Cloudy 44%)</w:t>
+        <w:t xml:space="preserve">Sunshine / cloud: Rare all-day blue sky. ~30% bright (≥6 h sun), ~26% mixed clouds, ~44% cloudy (&lt;2 h sun)—often gray even when rain is only drizzle; ~15% are dry but cloudy. Soft, flat light for photos. (Sunny 30% · Partly sunny 26% · Cloudy 44%)</w:t>
       </w:r>
     </w:p>
     <w:p>
@@ -956,7 +956,7 @@
           <w:sz w:val="21"/>
           <w:szCs w:val="21"/>
         </w:rPr>
-        <w:t xml:space="preserve">When: Classic basin pattern: ~59% of rain falls 7 pm–7 am. Still, ~60% of rainy days also have rain 9 am–5 pm—mornings are often overcast and damp; keep an umbrella for sightseeing.</w:t>
+        <w:t xml:space="preserve">When: Classic basin pattern: ~59% of rain falls 7 pm–7 am. Still, ~60% of rainy days also have rain 9 am–5 pm—mornings are often cloudy and damp; keep an umbrella for sightseeing.</w:t>
       </w:r>
     </w:p>
     <w:p>
@@ -1000,7 +1000,7 @@
           <w:sz w:val="21"/>
           <w:szCs w:val="21"/>
         </w:rPr>
-        <w:t xml:space="preserve">Sunshine / cloud: Slightly sunnier than Chengdu. ~41% bright, ~21% mixed, ~38% overcast/gloomy—the “Fog City” nickname fits, but ~4 in 10 days still see good sunshine. (Sunny 41% · Partly sunny 21% · Cloudy 38%)</w:t>
+        <w:t xml:space="preserve">Sunshine / cloud: Slightly sunnier than Chengdu. ~41% bright, ~21% mixed, ~38% cloudy—the “Fog City” nickname fits, but ~4 in 10 days still see good sunshine. (Sunny 41% · Partly sunny 21% · Cloudy 38%)</w:t>
       </w:r>
     </w:p>
     <w:p>
@@ -1058,7 +1058,7 @@
           <w:sz w:val="21"/>
           <w:szCs w:val="21"/>
         </w:rPr>
-        <w:t xml:space="preserve">Sunshine / cloud: Sunniest stop on the trip. ~53% bright, ~19% mixed, ~29% overcast/misty—sun and drizzle often coexist; lake colors pop when breaks appear. (Sunny 53% · Partly sunny 19% · Cloudy 29%)</w:t>
+        <w:t xml:space="preserve">Sunshine / cloud: Sunniest stop on the trip. ~53% bright, ~19% mixed, ~29% cloudy and misty—sun and drizzle often coexist; lake colors pop when breaks appear. (Sunny 53% · Partly sunny 19% · Cloudy 29%)</w:t>
       </w:r>
     </w:p>
     <w:p>
@@ -1116,7 +1116,7 @@
           <w:sz w:val="21"/>
           <w:szCs w:val="21"/>
         </w:rPr>
-        <w:t xml:space="preserve">Sunshine / cloud: (Reference) ~73% bright, ~15% mixed, only ~13% gloomy—much sunnier than Sichuan/Chongqing in the same window. (Sunny 73% · Partly sunny 15% · Cloudy 13%)</w:t>
+        <w:t xml:space="preserve">Sunshine / cloud: (Reference) ~73% bright, ~15% mixed, only ~13% cloudy—much sunnier than Sichuan/Chongqing in the same window. (Sunny 73% · Partly sunny 15% · Cloudy 13%)</w:t>
       </w:r>
     </w:p>
     <w:p>
@@ -1204,7 +1204,7 @@
           <w:sz w:val="21"/>
           <w:szCs w:val="21"/>
         </w:rPr>
-        <w:t xml:space="preserve">• Evenings &amp; AC indoors: light windbreaker or fleece—on overcast/drizzle days, dress ~3–5°C (5–9°F) lower than the table (damp-air guide above)</w:t>
+        <w:t xml:space="preserve">• Evenings &amp; AC indoors: light windbreaker or fleece—on cloudy/drizzle days, dress ~3–5°C (5–9°F) lower than the table (damp-air guide above)</w:t>
       </w:r>
     </w:p>
     <w:p>

</xml_diff>